<commit_message>
Simplified Ecospace map rendering Depth layers can be made to render actual depth data without having to select the layer Fixed minor transect issues while writing documentation
git-svn-id: https://sources.ecopath.org/svn/Ecopath/trunk/Ecopath6@14639 a725721c-0ed6-864e-a6a8-02c2a1988c9d
</commit_message>
<xml_diff>
--- a/Sources Internal/Plugins/EwETransectExtractionPlugin/Documentation/Transects.docx
+++ b/Sources Internal/Plugins/EwETransectExtractionPlugin/Documentation/Transects.docx
@@ -4,6 +4,968 @@
   <w:body>
     <w:p>
       <w:pPr>
+        <w:pStyle w:val="Heading1"/>
+        <w:rPr>
+          <w:noProof/>
+          <w:lang w:eastAsia="en-GB"/>
+        </w:rPr>
+      </w:pPr>
+      <w:r>
+        <w:rPr>
+          <w:noProof/>
+          <w:lang w:eastAsia="en-GB"/>
+        </w:rPr>
+        <w:t xml:space="preserve">Transects in EwE </w:t>
+      </w:r>
+    </w:p>
+    <w:p>
+      <w:pPr>
+        <w:rPr>
+          <w:lang w:eastAsia="en-GB"/>
+        </w:rPr>
+      </w:pPr>
+      <w:r>
+        <w:rPr>
+          <w:lang w:eastAsia="en-GB"/>
+        </w:rPr>
+        <w:t>Author: Jeroen Steenbeek (EII)</w:t>
+      </w:r>
+      <w:r>
+        <w:rPr>
+          <w:lang w:eastAsia="en-GB"/>
+        </w:rPr>
+        <w:br/>
+        <w:t xml:space="preserve">Version 1.0, </w:t>
+      </w:r>
+      <w:r>
+        <w:rPr>
+          <w:lang w:eastAsia="en-GB"/>
+        </w:rPr>
+        <w:t>, 26 April 2017</w:t>
+      </w:r>
+    </w:p>
+    <w:p>
+      <w:pPr>
+        <w:pStyle w:val="Heading2"/>
+        <w:rPr>
+          <w:lang w:eastAsia="en-GB"/>
+        </w:rPr>
+      </w:pPr>
+      <w:r>
+        <w:rPr>
+          <w:lang w:eastAsia="en-GB"/>
+        </w:rPr>
+        <w:t>Scope</w:t>
+      </w:r>
+    </w:p>
+    <w:p>
+      <w:pPr>
+        <w:rPr>
+          <w:lang w:eastAsia="en-GB"/>
+        </w:rPr>
+      </w:pPr>
+      <w:r>
+        <w:rPr>
+          <w:lang w:eastAsia="en-GB"/>
+        </w:rPr>
+        <w:t xml:space="preserve">Transects, like regions, are a mechanism to extract results for selected map cells from Ecospace. Where regions provide area averages for a cluster of cells, transects retain the actual cell values which can be </w:t>
+      </w:r>
+      <w:r>
+        <w:rPr>
+          <w:lang w:eastAsia="en-GB"/>
+        </w:rPr>
+        <w:t xml:space="preserve">plotted </w:t>
+      </w:r>
+      <w:bookmarkStart w:id="0" w:name="_GoBack"/>
+      <w:bookmarkEnd w:id="0"/>
+      <w:r>
+        <w:rPr>
+          <w:lang w:eastAsia="en-GB"/>
+        </w:rPr>
+        <w:t>on screen, and can be written to file.</w:t>
+      </w:r>
+    </w:p>
+    <w:p>
+      <w:pPr>
+        <w:pStyle w:val="Heading2"/>
+        <w:rPr>
+          <w:lang w:eastAsia="en-GB"/>
+        </w:rPr>
+      </w:pPr>
+      <w:r>
+        <w:rPr>
+          <w:lang w:eastAsia="en-GB"/>
+        </w:rPr>
+        <w:t>Requirements</w:t>
+      </w:r>
+    </w:p>
+    <w:p>
+      <w:pPr>
+        <w:rPr>
+          <w:lang w:eastAsia="en-GB"/>
+        </w:rPr>
+      </w:pPr>
+      <w:r>
+        <w:rPr>
+          <w:lang w:eastAsia="en-GB"/>
+        </w:rPr>
+        <w:t xml:space="preserve">The </w:t>
+      </w:r>
+      <w:r>
+        <w:rPr>
+          <w:lang w:eastAsia="en-GB"/>
+        </w:rPr>
+        <w:t>EwETransectExtractionPlugin</w:t>
+      </w:r>
+      <w:r>
+        <w:rPr>
+          <w:lang w:eastAsia="en-GB"/>
+        </w:rPr>
+        <w:t xml:space="preserve"> is needed to use the transect logic.</w:t>
+      </w:r>
+    </w:p>
+    <w:p>
+      <w:pPr>
+        <w:pStyle w:val="Heading2"/>
+        <w:rPr>
+          <w:lang w:eastAsia="en-GB"/>
+        </w:rPr>
+      </w:pPr>
+      <w:r>
+        <w:rPr>
+          <w:lang w:eastAsia="en-GB"/>
+        </w:rPr>
+        <w:t>Usage</w:t>
+      </w:r>
+    </w:p>
+    <w:p>
+      <w:pPr>
+        <w:pStyle w:val="Heading4"/>
+        <w:rPr>
+          <w:lang w:eastAsia="en-GB"/>
+        </w:rPr>
+      </w:pPr>
+      <w:r>
+        <w:rPr>
+          <w:lang w:eastAsia="en-GB"/>
+        </w:rPr>
+        <w:t>Define transects</w:t>
+      </w:r>
+    </w:p>
+    <w:p>
+      <w:pPr>
+        <w:rPr>
+          <w:lang w:eastAsia="en-GB"/>
+        </w:rPr>
+      </w:pPr>
+      <w:r>
+        <w:rPr>
+          <w:lang w:eastAsia="en-GB"/>
+        </w:rPr>
+        <w:t xml:space="preserve">Transects are defined in the </w:t>
+      </w:r>
+      <w:r>
+        <w:rPr>
+          <w:lang w:eastAsia="en-GB"/>
+        </w:rPr>
+        <w:t>Ecospace input form (Navigator &gt; Ecospace &gt; Input &gt; Transects)</w:t>
+      </w:r>
+      <w:r>
+        <w:rPr>
+          <w:lang w:eastAsia="en-GB"/>
+        </w:rPr>
+        <w:t xml:space="preserve">, see </w:t>
+      </w:r>
+      <w:r>
+        <w:rPr>
+          <w:lang w:eastAsia="en-GB"/>
+        </w:rPr>
+        <w:fldChar w:fldCharType="begin"/>
+      </w:r>
+      <w:r>
+        <w:rPr>
+          <w:lang w:eastAsia="en-GB"/>
+        </w:rPr>
+        <w:instrText xml:space="preserve"> REF _Ref480965781 \h </w:instrText>
+      </w:r>
+      <w:r>
+        <w:rPr>
+          <w:lang w:eastAsia="en-GB"/>
+        </w:rPr>
+      </w:r>
+      <w:r>
+        <w:rPr>
+          <w:lang w:eastAsia="en-GB"/>
+        </w:rPr>
+        <w:fldChar w:fldCharType="separate"/>
+      </w:r>
+      <w:r>
+        <w:t xml:space="preserve">Figure </w:t>
+      </w:r>
+      <w:r>
+        <w:rPr>
+          <w:noProof/>
+        </w:rPr>
+        <w:t>1</w:t>
+      </w:r>
+      <w:r>
+        <w:rPr>
+          <w:lang w:eastAsia="en-GB"/>
+        </w:rPr>
+        <w:fldChar w:fldCharType="end"/>
+      </w:r>
+      <w:r>
+        <w:rPr>
+          <w:lang w:eastAsia="en-GB"/>
+        </w:rPr>
+        <w:t>. A transect is created by clicking on the map</w:t>
+      </w:r>
+      <w:r>
+        <w:rPr>
+          <w:lang w:eastAsia="en-GB"/>
+        </w:rPr>
+        <w:t xml:space="preserve"> which sets the start location of a new transect</w:t>
+      </w:r>
+      <w:r>
+        <w:rPr>
+          <w:lang w:eastAsia="en-GB"/>
+        </w:rPr>
+        <w:t xml:space="preserve">, and </w:t>
+      </w:r>
+      <w:r>
+        <w:rPr>
+          <w:lang w:eastAsia="en-GB"/>
+        </w:rPr>
+        <w:t>moving the mouse while keeping the left mouse button down to the end location of the transect. The start and end location of a transect can be clicked and dragged, and the entire transect line can be clicked and dragged as well.</w:t>
+      </w:r>
+    </w:p>
+    <w:p>
+      <w:pPr>
+        <w:rPr>
+          <w:lang w:eastAsia="en-GB"/>
+        </w:rPr>
+      </w:pPr>
+      <w:r>
+        <w:rPr>
+          <w:lang w:eastAsia="en-GB"/>
+        </w:rPr>
+        <w:t>The selected transect will be rendered in Orange, other transects are rendered in Blue. The actual raster cells of the selected transect are rendered as well.</w:t>
+      </w:r>
+    </w:p>
+    <w:p>
+      <w:pPr>
+        <w:rPr>
+          <w:lang w:eastAsia="en-GB"/>
+        </w:rPr>
+      </w:pPr>
+      <w:r>
+        <w:rPr>
+          <w:lang w:eastAsia="en-GB"/>
+        </w:rPr>
+        <w:t>The selected transect can be deleted by pressing the [Delete transect] button, which is only enabled when a transect is selected.</w:t>
+      </w:r>
+    </w:p>
+    <w:p>
+      <w:pPr>
+        <w:pStyle w:val="Heading4"/>
+        <w:rPr>
+          <w:lang w:eastAsia="en-GB"/>
+        </w:rPr>
+      </w:pPr>
+      <w:r>
+        <w:rPr>
+          <w:lang w:eastAsia="en-GB"/>
+        </w:rPr>
+        <w:t>Running Ecospace</w:t>
+      </w:r>
+    </w:p>
+    <w:p>
+      <w:pPr>
+        <w:rPr>
+          <w:lang w:eastAsia="en-GB"/>
+        </w:rPr>
+      </w:pPr>
+      <w:r>
+        <w:rPr>
+          <w:lang w:eastAsia="en-GB"/>
+        </w:rPr>
+        <w:t>When Ecospace is executed, a summary for all defined transects will be recorded automatically. These summary results can be viewed in the EwE desktop software, and can be written to disk.</w:t>
+      </w:r>
+    </w:p>
+    <w:p>
+      <w:pPr>
+        <w:pStyle w:val="Heading4"/>
+        <w:rPr>
+          <w:lang w:eastAsia="en-GB"/>
+        </w:rPr>
+      </w:pPr>
+      <w:r>
+        <w:rPr>
+          <w:lang w:eastAsia="en-GB"/>
+        </w:rPr>
+        <w:t>Viewing transect summaries</w:t>
+      </w:r>
+    </w:p>
+    <w:p>
+      <w:pPr>
+        <w:rPr>
+          <w:lang w:eastAsia="en-GB"/>
+        </w:rPr>
+      </w:pPr>
+      <w:r>
+        <w:rPr>
+          <w:lang w:eastAsia="en-GB"/>
+        </w:rPr>
+        <w:t xml:space="preserve">Transect summaries are viewed in the transect summary form (Navigator &gt; Ecospace &gt; Output &gt; Transect summary), see </w:t>
+      </w:r>
+      <w:r>
+        <w:rPr>
+          <w:lang w:eastAsia="en-GB"/>
+        </w:rPr>
+        <w:fldChar w:fldCharType="begin"/>
+      </w:r>
+      <w:r>
+        <w:rPr>
+          <w:lang w:eastAsia="en-GB"/>
+        </w:rPr>
+        <w:instrText xml:space="preserve"> REF _Ref480966426 \h </w:instrText>
+      </w:r>
+      <w:r>
+        <w:rPr>
+          <w:lang w:eastAsia="en-GB"/>
+        </w:rPr>
+      </w:r>
+      <w:r>
+        <w:rPr>
+          <w:lang w:eastAsia="en-GB"/>
+        </w:rPr>
+        <w:fldChar w:fldCharType="separate"/>
+      </w:r>
+      <w:r>
+        <w:t xml:space="preserve">Figure </w:t>
+      </w:r>
+      <w:r>
+        <w:rPr>
+          <w:noProof/>
+        </w:rPr>
+        <w:t>2</w:t>
+      </w:r>
+      <w:r>
+        <w:rPr>
+          <w:lang w:eastAsia="en-GB"/>
+        </w:rPr>
+        <w:fldChar w:fldCharType="end"/>
+      </w:r>
+      <w:r>
+        <w:rPr>
+          <w:lang w:eastAsia="en-GB"/>
+        </w:rPr>
+        <w:t>. For now, a limited number of plots is shown for a selected transect:</w:t>
+      </w:r>
+    </w:p>
+    <w:p>
+      <w:pPr>
+        <w:pStyle w:val="ListParagraph"/>
+        <w:numPr>
+          <w:ilvl w:val="0"/>
+          <w:numId w:val="1"/>
+        </w:numPr>
+        <w:rPr>
+          <w:lang w:eastAsia="en-GB"/>
+        </w:rPr>
+      </w:pPr>
+      <w:r>
+        <w:rPr>
+          <w:lang w:eastAsia="en-GB"/>
+        </w:rPr>
+        <w:t>Depth profile of the transect (in meters);</w:t>
+      </w:r>
+    </w:p>
+    <w:p>
+      <w:pPr>
+        <w:pStyle w:val="ListParagraph"/>
+        <w:numPr>
+          <w:ilvl w:val="0"/>
+          <w:numId w:val="1"/>
+        </w:numPr>
+        <w:rPr>
+          <w:lang w:eastAsia="en-GB"/>
+        </w:rPr>
+      </w:pPr>
+      <w:r>
+        <w:rPr>
+          <w:lang w:eastAsia="en-GB"/>
+        </w:rPr>
+        <w:t>MPA overlap;</w:t>
+      </w:r>
+    </w:p>
+    <w:p>
+      <w:pPr>
+        <w:pStyle w:val="ListParagraph"/>
+        <w:numPr>
+          <w:ilvl w:val="0"/>
+          <w:numId w:val="1"/>
+        </w:numPr>
+        <w:rPr>
+          <w:lang w:eastAsia="en-GB"/>
+        </w:rPr>
+      </w:pPr>
+      <w:r>
+        <w:rPr>
+          <w:lang w:eastAsia="en-GB"/>
+        </w:rPr>
+        <w:t>Computed Ecospace biomass (t/km</w:t>
+      </w:r>
+      <w:r>
+        <w:rPr>
+          <w:vertAlign w:val="superscript"/>
+          <w:lang w:eastAsia="en-GB"/>
+        </w:rPr>
+        <w:t>2</w:t>
+      </w:r>
+      <w:r>
+        <w:rPr>
+          <w:lang w:eastAsia="en-GB"/>
+        </w:rPr>
+        <w:t>), per group, at a given time step;</w:t>
+      </w:r>
+    </w:p>
+    <w:p>
+      <w:pPr>
+        <w:pStyle w:val="ListParagraph"/>
+        <w:numPr>
+          <w:ilvl w:val="0"/>
+          <w:numId w:val="1"/>
+        </w:numPr>
+        <w:rPr>
+          <w:lang w:eastAsia="en-GB"/>
+        </w:rPr>
+      </w:pPr>
+      <w:r>
+        <w:rPr>
+          <w:lang w:eastAsia="en-GB"/>
+        </w:rPr>
+        <w:t xml:space="preserve">Computed Ecospace catch </w:t>
+      </w:r>
+      <w:r>
+        <w:rPr>
+          <w:lang w:eastAsia="en-GB"/>
+        </w:rPr>
+        <w:t>(t/km</w:t>
+      </w:r>
+      <w:r>
+        <w:rPr>
+          <w:vertAlign w:val="superscript"/>
+          <w:lang w:eastAsia="en-GB"/>
+        </w:rPr>
+        <w:t>2</w:t>
+      </w:r>
+      <w:r>
+        <w:rPr>
+          <w:lang w:eastAsia="en-GB"/>
+        </w:rPr>
+        <w:t>)</w:t>
+      </w:r>
+      <w:r>
+        <w:rPr>
+          <w:lang w:eastAsia="en-GB"/>
+        </w:rPr>
+        <w:t>, per group, at a given time step.</w:t>
+      </w:r>
+    </w:p>
+    <w:p>
+      <w:pPr>
+        <w:rPr>
+          <w:lang w:eastAsia="en-GB"/>
+        </w:rPr>
+      </w:pPr>
+      <w:r>
+        <w:rPr>
+          <w:lang w:eastAsia="en-GB"/>
+        </w:rPr>
+        <w:t>The depth and MPA plots will always show data, as these plots are based on Ecospace input data. The Ecospace result plots require Ecospace, well, to have ran.</w:t>
+      </w:r>
+    </w:p>
+    <w:p>
+      <w:pPr>
+        <w:rPr>
+          <w:lang w:eastAsia="en-GB"/>
+        </w:rPr>
+      </w:pPr>
+      <w:r>
+        <w:rPr>
+          <w:lang w:eastAsia="en-GB"/>
+        </w:rPr>
+        <w:t>Note that the summary data is discarded when a transect is modified. Ecospace will need to re-run to build the summary for a new transect cell configuration.</w:t>
+      </w:r>
+    </w:p>
+    <w:p>
+      <w:pPr>
+        <w:rPr>
+          <w:lang w:eastAsia="en-GB"/>
+        </w:rPr>
+      </w:pPr>
+      <w:r>
+        <w:rPr>
+          <w:lang w:eastAsia="en-GB"/>
+        </w:rPr>
+        <w:t xml:space="preserve">Once Ecospace has ran, the summary enables two additional options, see </w:t>
+      </w:r>
+      <w:r>
+        <w:rPr>
+          <w:lang w:eastAsia="en-GB"/>
+        </w:rPr>
+        <w:fldChar w:fldCharType="begin"/>
+      </w:r>
+      <w:r>
+        <w:rPr>
+          <w:lang w:eastAsia="en-GB"/>
+        </w:rPr>
+        <w:instrText xml:space="preserve"> REF _Ref480968577 \h </w:instrText>
+      </w:r>
+      <w:r>
+        <w:rPr>
+          <w:lang w:eastAsia="en-GB"/>
+        </w:rPr>
+      </w:r>
+      <w:r>
+        <w:rPr>
+          <w:lang w:eastAsia="en-GB"/>
+        </w:rPr>
+        <w:fldChar w:fldCharType="separate"/>
+      </w:r>
+      <w:r>
+        <w:t xml:space="preserve">Figure </w:t>
+      </w:r>
+      <w:r>
+        <w:rPr>
+          <w:noProof/>
+        </w:rPr>
+        <w:t>3</w:t>
+      </w:r>
+      <w:r>
+        <w:rPr>
+          <w:lang w:eastAsia="en-GB"/>
+        </w:rPr>
+        <w:fldChar w:fldCharType="end"/>
+      </w:r>
+      <w:r>
+        <w:rPr>
+          <w:lang w:eastAsia="en-GB"/>
+        </w:rPr>
+        <w:t>:</w:t>
+      </w:r>
+    </w:p>
+    <w:p>
+      <w:pPr>
+        <w:pStyle w:val="ListParagraph"/>
+        <w:numPr>
+          <w:ilvl w:val="0"/>
+          <w:numId w:val="3"/>
+        </w:numPr>
+        <w:rPr>
+          <w:lang w:eastAsia="en-GB"/>
+        </w:rPr>
+      </w:pPr>
+      <w:r>
+        <w:rPr>
+          <w:lang w:eastAsia="en-GB"/>
+        </w:rPr>
+        <w:t>A</w:t>
+      </w:r>
+      <w:r>
+        <w:rPr>
+          <w:lang w:eastAsia="en-GB"/>
+        </w:rPr>
+        <w:t xml:space="preserve">nimation </w:t>
+      </w:r>
+      <w:r>
+        <w:rPr>
+          <w:lang w:eastAsia="en-GB"/>
+        </w:rPr>
+        <w:t xml:space="preserve">of </w:t>
+      </w:r>
+      <w:r>
+        <w:rPr>
+          <w:lang w:eastAsia="en-GB"/>
+        </w:rPr>
+        <w:t>Ecospace transect summaries over time. The animation speed is set, and users cannot manually select the time step to view.</w:t>
+      </w:r>
+    </w:p>
+    <w:p>
+      <w:pPr>
+        <w:pStyle w:val="ListParagraph"/>
+        <w:numPr>
+          <w:ilvl w:val="0"/>
+          <w:numId w:val="3"/>
+        </w:numPr>
+        <w:rPr>
+          <w:lang w:eastAsia="en-GB"/>
+        </w:rPr>
+      </w:pPr>
+      <w:r>
+        <w:rPr>
+          <w:lang w:eastAsia="en-GB"/>
+        </w:rPr>
+        <w:t>Export of transect summaries to CSV file.</w:t>
+      </w:r>
+    </w:p>
+    <w:p>
+      <w:pPr>
+        <w:pStyle w:val="Heading3"/>
+        <w:rPr>
+          <w:lang w:eastAsia="en-GB"/>
+        </w:rPr>
+      </w:pPr>
+      <w:r>
+        <w:rPr>
+          <w:lang w:eastAsia="en-GB"/>
+        </w:rPr>
+        <w:lastRenderedPageBreak/>
+        <w:t>Auto-saving transect summaries</w:t>
+      </w:r>
+    </w:p>
+    <w:p>
+      <w:pPr>
+        <w:rPr>
+          <w:lang w:eastAsia="en-GB"/>
+        </w:rPr>
+      </w:pPr>
+      <w:r>
+        <w:rPr>
+          <w:lang w:eastAsia="en-GB"/>
+        </w:rPr>
+        <w:t xml:space="preserve">Transect summary data can be automatically saved when Ecospace runs. This option can be configured via the Ecospace parameters form (Navigator &gt; Ecospace &gt; Input &gt; Ecospace parameters), see </w:t>
+      </w:r>
+      <w:r>
+        <w:rPr>
+          <w:lang w:eastAsia="en-GB"/>
+        </w:rPr>
+        <w:fldChar w:fldCharType="begin"/>
+      </w:r>
+      <w:r>
+        <w:rPr>
+          <w:lang w:eastAsia="en-GB"/>
+        </w:rPr>
+        <w:instrText xml:space="preserve"> REF _Ref480968557 \h </w:instrText>
+      </w:r>
+      <w:r>
+        <w:rPr>
+          <w:lang w:eastAsia="en-GB"/>
+        </w:rPr>
+      </w:r>
+      <w:r>
+        <w:rPr>
+          <w:lang w:eastAsia="en-GB"/>
+        </w:rPr>
+        <w:fldChar w:fldCharType="separate"/>
+      </w:r>
+      <w:r>
+        <w:t xml:space="preserve">Figure </w:t>
+      </w:r>
+      <w:r>
+        <w:rPr>
+          <w:noProof/>
+        </w:rPr>
+        <w:t>4</w:t>
+      </w:r>
+      <w:r>
+        <w:rPr>
+          <w:lang w:eastAsia="en-GB"/>
+        </w:rPr>
+        <w:fldChar w:fldCharType="end"/>
+      </w:r>
+      <w:r>
+        <w:rPr>
+          <w:lang w:eastAsia="en-GB"/>
+        </w:rPr>
+        <w:t>). A message in the EwE status panel will tell you that transect information has been saved to file, and clicking that message will open the folder of the file location.</w:t>
+      </w:r>
+    </w:p>
+    <w:p>
+      <w:pPr>
+        <w:pStyle w:val="Heading2"/>
+        <w:rPr>
+          <w:lang w:eastAsia="en-GB"/>
+        </w:rPr>
+      </w:pPr>
+      <w:r>
+        <w:rPr>
+          <w:lang w:eastAsia="en-GB"/>
+        </w:rPr>
+        <w:t>Known issues and future improvements</w:t>
+      </w:r>
+    </w:p>
+    <w:p>
+      <w:pPr>
+        <w:pStyle w:val="Heading3"/>
+        <w:rPr>
+          <w:lang w:eastAsia="en-GB"/>
+        </w:rPr>
+      </w:pPr>
+      <w:r>
+        <w:rPr>
+          <w:lang w:eastAsia="en-GB"/>
+        </w:rPr>
+        <w:t>Persistence</w:t>
+      </w:r>
+      <w:r>
+        <w:rPr>
+          <w:lang w:eastAsia="en-GB"/>
+        </w:rPr>
+        <w:t xml:space="preserve"> issues</w:t>
+      </w:r>
+    </w:p>
+    <w:p>
+      <w:pPr>
+        <w:rPr>
+          <w:lang w:eastAsia="en-GB"/>
+        </w:rPr>
+      </w:pPr>
+      <w:r>
+        <w:rPr>
+          <w:lang w:eastAsia="en-GB"/>
+        </w:rPr>
+        <w:t>The current implementation is based on the EwE plug-in system. Transects integrate with the Ecospace software as expected, but transects are not saved with the Ecospace scenario. When a scenario is closed, sketched transects are lost. It is foreseen that the transect logic will become an integral part of the EwE source code, and that transects will be stored within the EwE model file.</w:t>
+      </w:r>
+    </w:p>
+    <w:p>
+      <w:pPr>
+        <w:pStyle w:val="Heading2"/>
+        <w:rPr>
+          <w:lang w:eastAsia="en-GB"/>
+        </w:rPr>
+      </w:pPr>
+      <w:r>
+        <w:rPr>
+          <w:lang w:eastAsia="en-GB"/>
+        </w:rPr>
+        <w:t xml:space="preserve">User </w:t>
+      </w:r>
+      <w:r>
+        <w:rPr>
+          <w:lang w:eastAsia="en-GB"/>
+        </w:rPr>
+        <w:t>interface issues</w:t>
+      </w:r>
+    </w:p>
+    <w:p>
+      <w:pPr>
+        <w:rPr>
+          <w:lang w:eastAsia="en-GB"/>
+        </w:rPr>
+      </w:pPr>
+      <w:r>
+        <w:rPr>
+          <w:lang w:eastAsia="en-GB"/>
+        </w:rPr>
+        <w:t>There are a few issues in the user interface that will be addressed shortly:</w:t>
+      </w:r>
+    </w:p>
+    <w:p>
+      <w:pPr>
+        <w:pStyle w:val="ListParagraph"/>
+        <w:numPr>
+          <w:ilvl w:val="0"/>
+          <w:numId w:val="1"/>
+        </w:numPr>
+        <w:rPr>
+          <w:lang w:eastAsia="en-GB"/>
+        </w:rPr>
+      </w:pPr>
+      <w:r>
+        <w:rPr>
+          <w:lang w:eastAsia="en-GB"/>
+        </w:rPr>
+        <w:t>Although the start location is always shown on the x-axis labels in the transect summary graphs, sometimes the end location (x, y) of a transect is not shown. This should not happen; the end location should be displayed at any time.</w:t>
+      </w:r>
+    </w:p>
+    <w:p>
+      <w:pPr>
+        <w:pStyle w:val="ListParagraph"/>
+        <w:numPr>
+          <w:ilvl w:val="0"/>
+          <w:numId w:val="1"/>
+        </w:numPr>
+        <w:rPr>
+          <w:lang w:eastAsia="en-GB"/>
+        </w:rPr>
+      </w:pPr>
+      <w:r>
+        <w:rPr>
+          <w:lang w:eastAsia="en-GB"/>
+        </w:rPr>
+        <w:t>The transect summary graphs do not show units yet.</w:t>
+      </w:r>
+    </w:p>
+    <w:p>
+      <w:pPr>
+        <w:pStyle w:val="Heading3"/>
+        <w:rPr>
+          <w:lang w:eastAsia="en-GB"/>
+        </w:rPr>
+      </w:pPr>
+      <w:r>
+        <w:rPr>
+          <w:lang w:eastAsia="en-GB"/>
+        </w:rPr>
+        <w:t>New features</w:t>
+      </w:r>
+    </w:p>
+    <w:p>
+      <w:pPr>
+        <w:rPr>
+          <w:lang w:eastAsia="en-GB"/>
+        </w:rPr>
+      </w:pPr>
+      <w:r>
+        <w:rPr>
+          <w:lang w:eastAsia="en-GB"/>
+        </w:rPr>
+        <w:t xml:space="preserve">The </w:t>
+      </w:r>
+      <w:r>
+        <w:rPr>
+          <w:lang w:eastAsia="en-GB"/>
+        </w:rPr>
+        <w:t xml:space="preserve">transect functionality </w:t>
+      </w:r>
+      <w:r>
+        <w:rPr>
+          <w:lang w:eastAsia="en-GB"/>
+        </w:rPr>
+        <w:t xml:space="preserve">logic is </w:t>
+      </w:r>
+      <w:r>
+        <w:rPr>
+          <w:lang w:eastAsia="en-GB"/>
+        </w:rPr>
+        <w:t xml:space="preserve">still in prototype stage and is rather </w:t>
+      </w:r>
+      <w:r>
+        <w:rPr>
+          <w:lang w:eastAsia="en-GB"/>
+        </w:rPr>
+        <w:t xml:space="preserve">unpolished. </w:t>
+      </w:r>
+      <w:r>
+        <w:rPr>
+          <w:lang w:eastAsia="en-GB"/>
+        </w:rPr>
+        <w:t>A range pf new features can be foreseen:</w:t>
+      </w:r>
+    </w:p>
+    <w:p>
+      <w:pPr>
+        <w:pStyle w:val="ListParagraph"/>
+        <w:numPr>
+          <w:ilvl w:val="0"/>
+          <w:numId w:val="2"/>
+        </w:numPr>
+        <w:rPr>
+          <w:lang w:eastAsia="en-GB"/>
+        </w:rPr>
+      </w:pPr>
+      <w:r>
+        <w:rPr>
+          <w:lang w:eastAsia="en-GB"/>
+        </w:rPr>
+        <w:t xml:space="preserve">The transect input form could use improvements: transects cannot be renamed, and transect points cannot be edited by entering the start and end coordinates. </w:t>
+      </w:r>
+    </w:p>
+    <w:p>
+      <w:pPr>
+        <w:pStyle w:val="ListParagraph"/>
+        <w:numPr>
+          <w:ilvl w:val="0"/>
+          <w:numId w:val="2"/>
+        </w:numPr>
+        <w:rPr>
+          <w:lang w:eastAsia="en-GB"/>
+        </w:rPr>
+      </w:pPr>
+      <w:r>
+        <w:rPr>
+          <w:lang w:eastAsia="en-GB"/>
+        </w:rPr>
+        <w:t>The transect summary pages could do with some changes too. The animation speed in the transect summary form cannot be altered. Perhaps information is not grouped well; it might be more useful if one variable is across all transects, instead of displaying all variables for a single transect. Last, perhaps the Ecospace result graphs could benefit from showing and hiding data for selected functional groups.</w:t>
+      </w:r>
+    </w:p>
+    <w:p>
+      <w:pPr>
+        <w:pStyle w:val="ListParagraph"/>
+        <w:numPr>
+          <w:ilvl w:val="0"/>
+          <w:numId w:val="2"/>
+        </w:numPr>
+        <w:rPr>
+          <w:lang w:eastAsia="en-GB"/>
+        </w:rPr>
+      </w:pPr>
+      <w:r>
+        <w:rPr>
+          <w:lang w:eastAsia="en-GB"/>
+        </w:rPr>
+        <w:t>The transect CSV file provides transect summaries for every group and every Ecospace time step. It might be practical if also annual averages CSV files would be produced, as well as transect averages per time step.</w:t>
+      </w:r>
+    </w:p>
+    <w:p>
+      <w:pPr>
+        <w:rPr>
+          <w:lang w:eastAsia="en-GB"/>
+        </w:rPr>
+      </w:pPr>
+      <w:r>
+        <w:rPr>
+          <w:lang w:eastAsia="en-GB"/>
+        </w:rPr>
+        <w:t>Before implementing additional features, it is suggested that the transects logic should be used by a range of EwE modellers to gather feedback on current functionality. This feedback will help identifying shortcomings in the current user interface, and will be used to prioritize future development efforts.</w:t>
+      </w:r>
+    </w:p>
+    <w:p>
+      <w:pPr>
+        <w:pStyle w:val="Heading2"/>
+        <w:rPr>
+          <w:lang w:eastAsia="en-GB"/>
+        </w:rPr>
+      </w:pPr>
+      <w:r>
+        <w:rPr>
+          <w:lang w:eastAsia="en-GB"/>
+        </w:rPr>
+        <w:t>Acknoweldgements</w:t>
+      </w:r>
+    </w:p>
+    <w:p>
+      <w:pPr>
+        <w:rPr>
+          <w:lang w:eastAsia="en-GB"/>
+        </w:rPr>
+      </w:pPr>
+      <w:commentRangeStart w:id="1"/>
+      <w:r>
+        <w:rPr>
+          <w:lang w:eastAsia="en-GB"/>
+        </w:rPr>
+        <w:t>Transects logic for EwE is funded through COSM / INSITE funding from CEFAS.</w:t>
+      </w:r>
+      <w:commentRangeEnd w:id="1"/>
+      <w:r>
+        <w:rPr>
+          <w:rStyle w:val="CommentReference"/>
+        </w:rPr>
+        <w:commentReference w:id="1"/>
+      </w:r>
+    </w:p>
+    <w:p>
+      <w:pPr>
+        <w:rPr>
+          <w:lang w:eastAsia="en-GB"/>
+        </w:rPr>
+      </w:pPr>
+    </w:p>
+    <w:p>
+      <w:pPr>
         <w:keepNext/>
       </w:pPr>
       <w:r>
@@ -11,11 +973,12 @@
           <w:noProof/>
           <w:lang w:eastAsia="en-GB"/>
         </w:rPr>
+        <w:lastRenderedPageBreak/>
         <w:drawing>
-          <wp:inline distT="0" distB="0" distL="0" distR="0">
-            <wp:extent cx="5731510" cy="4011295"/>
-            <wp:effectExtent l="0" t="0" r="2540" b="8255"/>
-            <wp:docPr id="4" name="Picture 4"/>
+          <wp:inline distT="0" distB="0" distL="0" distR="0" wp14:anchorId="33DA6A4C" wp14:editId="5D2CC66A">
+            <wp:extent cx="4942800" cy="3675600"/>
+            <wp:effectExtent l="0" t="0" r="0" b="1270"/>
+            <wp:docPr id="3" name="Picture 3"/>
             <wp:cNvGraphicFramePr>
               <a:graphicFrameLocks xmlns:a="http://schemas.openxmlformats.org/drawingml/2006/main" noChangeAspect="1"/>
             </wp:cNvGraphicFramePr>
@@ -23,11 +986,11 @@
               <a:graphicData uri="http://schemas.openxmlformats.org/drawingml/2006/picture">
                 <pic:pic xmlns:pic="http://schemas.openxmlformats.org/drawingml/2006/picture">
                   <pic:nvPicPr>
-                    <pic:cNvPr id="4" name="998D078.tmp"/>
+                    <pic:cNvPr id="3" name="070DD30.tmp"/>
                     <pic:cNvPicPr/>
                   </pic:nvPicPr>
                   <pic:blipFill>
-                    <a:blip r:embed="rId4">
+                    <a:blip r:embed="rId8">
                       <a:extLst>
                         <a:ext uri="{28A0092B-C50C-407E-A947-70E740481C1C}">
                           <a14:useLocalDpi xmlns:a14="http://schemas.microsoft.com/office/drawing/2010/main" val="0"/>
@@ -41,7 +1004,7 @@
                   <pic:spPr>
                     <a:xfrm>
                       <a:off x="0" y="0"/>
-                      <a:ext cx="5731510" cy="4011295"/>
+                      <a:ext cx="4942800" cy="3675600"/>
                     </a:xfrm>
                     <a:prstGeom prst="rect">
                       <a:avLst/>
@@ -58,6 +1021,7 @@
       <w:pPr>
         <w:pStyle w:val="Caption"/>
       </w:pPr>
+      <w:bookmarkStart w:id="2" w:name="_Ref480965781"/>
       <w:r>
         <w:t xml:space="preserve">Figure </w:t>
       </w:r>
@@ -79,6 +1043,7 @@
       <w:r>
         <w:fldChar w:fldCharType="end"/>
       </w:r>
+      <w:bookmarkEnd w:id="2"/>
       <w:r>
         <w:t xml:space="preserve"> – Transects input screen, where transects</w:t>
       </w:r>
@@ -92,10 +1057,20 @@
         <w:rPr>
           <w:noProof/>
         </w:rPr>
-        <w:t>. The map shows transect lines superimposed on the depth and MPA map layers. The grid cells for the selected transect (orange line) are rendered in orange too.</w:t>
-      </w:r>
-      <w:bookmarkStart w:id="0" w:name="_GoBack"/>
-      <w:bookmarkEnd w:id="0"/>
+        <w:t xml:space="preserve">. The map shows transect lines superimposed on the depth and MPA map layers. The grid cells for the selected transect (orange line) are </w:t>
+      </w:r>
+      <w:r>
+        <w:rPr>
+          <w:noProof/>
+        </w:rPr>
+        <w:t>rendered</w:t>
+      </w:r>
+      <w:r>
+        <w:rPr>
+          <w:noProof/>
+        </w:rPr>
+        <w:t>.</w:t>
+      </w:r>
     </w:p>
     <w:p/>
     <w:p>
@@ -109,10 +1084,10 @@
         </w:rPr>
         <w:lastRenderedPageBreak/>
         <w:drawing>
-          <wp:inline distT="0" distB="0" distL="0" distR="0">
-            <wp:extent cx="5731510" cy="4011295"/>
-            <wp:effectExtent l="0" t="0" r="2540" b="8255"/>
-            <wp:docPr id="5" name="Picture 5"/>
+          <wp:inline distT="0" distB="0" distL="0" distR="0" wp14:anchorId="19C4C46D" wp14:editId="2CB03D00">
+            <wp:extent cx="5731510" cy="4262120"/>
+            <wp:effectExtent l="0" t="0" r="2540" b="5080"/>
+            <wp:docPr id="10" name="Picture 10"/>
             <wp:cNvGraphicFramePr>
               <a:graphicFrameLocks xmlns:a="http://schemas.openxmlformats.org/drawingml/2006/main" noChangeAspect="1"/>
             </wp:cNvGraphicFramePr>
@@ -120,11 +1095,11 @@
               <a:graphicData uri="http://schemas.openxmlformats.org/drawingml/2006/picture">
                 <pic:pic xmlns:pic="http://schemas.openxmlformats.org/drawingml/2006/picture">
                   <pic:nvPicPr>
-                    <pic:cNvPr id="5" name="9983ABC.tmp"/>
+                    <pic:cNvPr id="10" name="07026.tmp"/>
                     <pic:cNvPicPr/>
                   </pic:nvPicPr>
                   <pic:blipFill>
-                    <a:blip r:embed="rId5">
+                    <a:blip r:embed="rId9">
                       <a:extLst>
                         <a:ext uri="{28A0092B-C50C-407E-A947-70E740481C1C}">
                           <a14:useLocalDpi xmlns:a14="http://schemas.microsoft.com/office/drawing/2010/main" val="0"/>
@@ -138,7 +1113,7 @@
                   <pic:spPr>
                     <a:xfrm>
                       <a:off x="0" y="0"/>
-                      <a:ext cx="5731510" cy="4011295"/>
+                      <a:ext cx="5731510" cy="4262120"/>
                     </a:xfrm>
                     <a:prstGeom prst="rect">
                       <a:avLst/>
@@ -155,6 +1130,7 @@
       <w:pPr>
         <w:pStyle w:val="Caption"/>
       </w:pPr>
+      <w:bookmarkStart w:id="3" w:name="_Ref480966426"/>
       <w:r>
         <w:t xml:space="preserve">Figure </w:t>
       </w:r>
@@ -176,8 +1152,21 @@
       <w:r>
         <w:fldChar w:fldCharType="end"/>
       </w:r>
-      <w:r>
-        <w:t xml:space="preserve"> - The transect summary screen that displays data across the transect: depth profile, overlap with MPAs, and computed biomass and catch per group. In this particular screenshot Ecospace has not ran yet</w:t>
+      <w:bookmarkEnd w:id="3"/>
+      <w:r>
+        <w:t xml:space="preserve"> - The transect </w:t>
+      </w:r>
+      <w:r>
+        <w:t xml:space="preserve">output </w:t>
+      </w:r>
+      <w:r>
+        <w:t>screen that displays transect</w:t>
+      </w:r>
+      <w:r>
+        <w:t xml:space="preserve"> summaries</w:t>
+      </w:r>
+      <w:r>
+        <w:t>: depth profile, overlap with MPAs, and computed biomass and catch per group. In this particular screenshot Ecospace has not ran yet</w:t>
       </w:r>
       <w:r>
         <w:t>. The animation controls and save to CSV options are therefore disabled.</w:t>
@@ -195,10 +1184,10 @@
         </w:rPr>
         <w:lastRenderedPageBreak/>
         <w:drawing>
-          <wp:inline distT="0" distB="0" distL="0" distR="0" wp14:anchorId="6033A0D4" wp14:editId="49A91545">
-            <wp:extent cx="5581650" cy="3927475"/>
-            <wp:effectExtent l="0" t="0" r="0" b="0"/>
-            <wp:docPr id="1" name="Picture 1"/>
+          <wp:inline distT="0" distB="0" distL="0" distR="0" wp14:anchorId="0020F3B5" wp14:editId="0B321DE8">
+            <wp:extent cx="5731510" cy="4262120"/>
+            <wp:effectExtent l="0" t="0" r="2540" b="5080"/>
+            <wp:docPr id="8" name="Picture 8"/>
             <wp:cNvGraphicFramePr>
               <a:graphicFrameLocks xmlns:a="http://schemas.openxmlformats.org/drawingml/2006/main" noChangeAspect="1"/>
             </wp:cNvGraphicFramePr>
@@ -206,94 +1195,11 @@
               <a:graphicData uri="http://schemas.openxmlformats.org/drawingml/2006/picture">
                 <pic:pic xmlns:pic="http://schemas.openxmlformats.org/drawingml/2006/picture">
                   <pic:nvPicPr>
-                    <pic:cNvPr id="1" name=""/>
-                    <pic:cNvPicPr/>
-                  </pic:nvPicPr>
-                  <pic:blipFill rotWithShape="1">
-                    <a:blip r:embed="rId6"/>
-                    <a:srcRect l="13468" t="23159" r="39078" b="17465"/>
-                    <a:stretch/>
-                  </pic:blipFill>
-                  <pic:spPr bwMode="auto">
-                    <a:xfrm>
-                      <a:off x="0" y="0"/>
-                      <a:ext cx="5582398" cy="3928002"/>
-                    </a:xfrm>
-                    <a:prstGeom prst="rect">
-                      <a:avLst/>
-                    </a:prstGeom>
-                    <a:ln>
-                      <a:noFill/>
-                    </a:ln>
-                    <a:extLst>
-                      <a:ext uri="{53640926-AAD7-44D8-BBD7-CCE9431645EC}">
-                        <a14:shadowObscured xmlns:a14="http://schemas.microsoft.com/office/drawing/2010/main"/>
-                      </a:ext>
-                    </a:extLst>
-                  </pic:spPr>
-                </pic:pic>
-              </a:graphicData>
-            </a:graphic>
-          </wp:inline>
-        </w:drawing>
-      </w:r>
-    </w:p>
-    <w:p>
-      <w:pPr>
-        <w:pStyle w:val="Caption"/>
-      </w:pPr>
-      <w:r>
-        <w:t xml:space="preserve">Figure </w:t>
-      </w:r>
-      <w:r>
-        <w:fldChar w:fldCharType="begin"/>
-      </w:r>
-      <w:r>
-        <w:instrText xml:space="preserve"> SEQ Figure \* ARABIC </w:instrText>
-      </w:r>
-      <w:r>
-        <w:fldChar w:fldCharType="separate"/>
-      </w:r>
-      <w:r>
-        <w:rPr>
-          <w:noProof/>
-        </w:rPr>
-        <w:t>3</w:t>
-      </w:r>
-      <w:r>
-        <w:fldChar w:fldCharType="end"/>
-      </w:r>
-      <w:r>
-        <w:t xml:space="preserve"> - Transect summary screen after running Ecospace. Note that transect 2 crosses the one and only MPA and a few land cells. Biomass and Catch are unavailable for land cells. Catch is 0 within the MPA. Also note that the animation controls and the Save to CSV options are available once Ecospace has executed.</w:t>
-      </w:r>
-    </w:p>
-    <w:p>
-      <w:pPr>
-        <w:keepNext/>
-      </w:pPr>
-      <w:r>
-        <w:rPr>
-          <w:noProof/>
-          <w:lang w:eastAsia="en-GB"/>
-        </w:rPr>
-        <w:lastRenderedPageBreak/>
-        <w:drawing>
-          <wp:inline distT="0" distB="0" distL="0" distR="0">
-            <wp:extent cx="5731510" cy="4011295"/>
-            <wp:effectExtent l="0" t="0" r="2540" b="8255"/>
-            <wp:docPr id="9" name="Picture 9"/>
-            <wp:cNvGraphicFramePr>
-              <a:graphicFrameLocks xmlns:a="http://schemas.openxmlformats.org/drawingml/2006/main" noChangeAspect="1"/>
-            </wp:cNvGraphicFramePr>
-            <a:graphic xmlns:a="http://schemas.openxmlformats.org/drawingml/2006/main">
-              <a:graphicData uri="http://schemas.openxmlformats.org/drawingml/2006/picture">
-                <pic:pic xmlns:pic="http://schemas.openxmlformats.org/drawingml/2006/picture">
-                  <pic:nvPicPr>
-                    <pic:cNvPr id="9" name="998B81B.tmp"/>
+                    <pic:cNvPr id="8" name="070D9CB.tmp"/>
                     <pic:cNvPicPr/>
                   </pic:nvPicPr>
                   <pic:blipFill>
-                    <a:blip r:embed="rId7">
+                    <a:blip r:embed="rId10">
                       <a:extLst>
                         <a:ext uri="{28A0092B-C50C-407E-A947-70E740481C1C}">
                           <a14:useLocalDpi xmlns:a14="http://schemas.microsoft.com/office/drawing/2010/main" val="0"/>
@@ -307,7 +1213,7 @@
                   <pic:spPr>
                     <a:xfrm>
                       <a:off x="0" y="0"/>
-                      <a:ext cx="5731510" cy="4011295"/>
+                      <a:ext cx="5731510" cy="4262120"/>
                     </a:xfrm>
                     <a:prstGeom prst="rect">
                       <a:avLst/>
@@ -324,6 +1230,7 @@
       <w:pPr>
         <w:pStyle w:val="Caption"/>
       </w:pPr>
+      <w:bookmarkStart w:id="4" w:name="_Ref480968577"/>
       <w:r>
         <w:t xml:space="preserve">Figure </w:t>
       </w:r>
@@ -340,15 +1247,113 @@
         <w:rPr>
           <w:noProof/>
         </w:rPr>
+        <w:t>3</w:t>
+      </w:r>
+      <w:r>
+        <w:fldChar w:fldCharType="end"/>
+      </w:r>
+      <w:bookmarkEnd w:id="4"/>
+      <w:r>
+        <w:t xml:space="preserve"> - Transect summary screen after running Ecospace. Note that transect 2 crosses the one and only MPA and a few land cells. Biomass and Catch are unavailable for land cells. Catch is 0 within the MPA. Also note that the animation controls and the Save to CSV options are available once Ecospace has executed.</w:t>
+      </w:r>
+    </w:p>
+    <w:p>
+      <w:pPr>
+        <w:keepNext/>
+      </w:pPr>
+      <w:r>
+        <w:rPr>
+          <w:noProof/>
+          <w:lang w:eastAsia="en-GB"/>
+        </w:rPr>
+        <w:lastRenderedPageBreak/>
+        <w:drawing>
+          <wp:inline distT="0" distB="0" distL="0" distR="0" wp14:anchorId="6A4E4296" wp14:editId="575D5D8A">
+            <wp:extent cx="5731510" cy="4262120"/>
+            <wp:effectExtent l="0" t="0" r="2540" b="5080"/>
+            <wp:docPr id="7" name="Picture 7"/>
+            <wp:cNvGraphicFramePr>
+              <a:graphicFrameLocks xmlns:a="http://schemas.openxmlformats.org/drawingml/2006/main" noChangeAspect="1"/>
+            </wp:cNvGraphicFramePr>
+            <a:graphic xmlns:a="http://schemas.openxmlformats.org/drawingml/2006/main">
+              <a:graphicData uri="http://schemas.openxmlformats.org/drawingml/2006/picture">
+                <pic:pic xmlns:pic="http://schemas.openxmlformats.org/drawingml/2006/picture">
+                  <pic:nvPicPr>
+                    <pic:cNvPr id="7" name="07022BD.tmp"/>
+                    <pic:cNvPicPr/>
+                  </pic:nvPicPr>
+                  <pic:blipFill>
+                    <a:blip r:embed="rId11">
+                      <a:extLst>
+                        <a:ext uri="{28A0092B-C50C-407E-A947-70E740481C1C}">
+                          <a14:useLocalDpi xmlns:a14="http://schemas.microsoft.com/office/drawing/2010/main" val="0"/>
+                        </a:ext>
+                      </a:extLst>
+                    </a:blip>
+                    <a:stretch>
+                      <a:fillRect/>
+                    </a:stretch>
+                  </pic:blipFill>
+                  <pic:spPr>
+                    <a:xfrm>
+                      <a:off x="0" y="0"/>
+                      <a:ext cx="5731510" cy="4262120"/>
+                    </a:xfrm>
+                    <a:prstGeom prst="rect">
+                      <a:avLst/>
+                    </a:prstGeom>
+                  </pic:spPr>
+                </pic:pic>
+              </a:graphicData>
+            </a:graphic>
+          </wp:inline>
+        </w:drawing>
+      </w:r>
+    </w:p>
+    <w:p>
+      <w:pPr>
+        <w:pStyle w:val="Caption"/>
+      </w:pPr>
+      <w:bookmarkStart w:id="5" w:name="_Ref480968557"/>
+      <w:r>
+        <w:t xml:space="preserve">Figure </w:t>
+      </w:r>
+      <w:r>
+        <w:fldChar w:fldCharType="begin"/>
+      </w:r>
+      <w:r>
+        <w:instrText xml:space="preserve"> SEQ Figure \* ARABIC </w:instrText>
+      </w:r>
+      <w:r>
+        <w:fldChar w:fldCharType="separate"/>
+      </w:r>
+      <w:r>
+        <w:rPr>
+          <w:noProof/>
+        </w:rPr>
         <w:t>4</w:t>
       </w:r>
       <w:r>
         <w:fldChar w:fldCharType="end"/>
       </w:r>
-      <w:r>
-        <w:t xml:space="preserve"> - Transect summary CSV files can also be saved automatically when Ecospace runs on the Ecospace parameters page.</w:t>
-      </w:r>
-    </w:p>
+      <w:bookmarkEnd w:id="5"/>
+      <w:r>
+        <w:t xml:space="preserve"> </w:t>
+      </w:r>
+      <w:r>
+        <w:t>–</w:t>
+      </w:r>
+      <w:r>
+        <w:t xml:space="preserve"> </w:t>
+      </w:r>
+      <w:r>
+        <w:t xml:space="preserve">Configuring Ecospace to automatically save transect </w:t>
+      </w:r>
+      <w:r>
+        <w:t>summary CSV files.</w:t>
+      </w:r>
+    </w:p>
+    <w:p/>
     <w:sectPr>
       <w:pgSz w:w="11906" w:h="16838"/>
       <w:pgMar w:top="1440" w:right="1440" w:bottom="1440" w:left="1440" w:header="708" w:footer="708" w:gutter="0"/>
@@ -357,6 +1362,394 @@
     </w:sectPr>
   </w:body>
 </w:document>
+</file>
+
+<file path=word/comments.xml><?xml version="1.0" encoding="utf-8"?>
+<w:comments xmlns:wpc="http://schemas.microsoft.com/office/word/2010/wordprocessingCanvas" xmlns:cx="http://schemas.microsoft.com/office/drawing/2014/chartex" xmlns:cx1="http://schemas.microsoft.com/office/drawing/2015/9/8/chartex" xmlns:mc="http://schemas.openxmlformats.org/markup-compatibility/2006" xmlns:o="urn:schemas-microsoft-com:office:office" xmlns:r="http://schemas.openxmlformats.org/officeDocument/2006/relationships" xmlns:m="http://schemas.openxmlformats.org/officeDocument/2006/math" xmlns:v="urn:schemas-microsoft-com:vml" xmlns:wp14="http://schemas.microsoft.com/office/word/2010/wordprocessingDrawing" xmlns:wp="http://schemas.openxmlformats.org/drawingml/2006/wordprocessingDrawing" xmlns:w10="urn:schemas-microsoft-com:office:word" xmlns:w="http://schemas.openxmlformats.org/wordprocessingml/2006/main" xmlns:w14="http://schemas.microsoft.com/office/word/2010/wordml" xmlns:w15="http://schemas.microsoft.com/office/word/2012/wordml" xmlns:w16se="http://schemas.microsoft.com/office/word/2015/wordml/symex" xmlns:wpg="http://schemas.microsoft.com/office/word/2010/wordprocessingGroup" xmlns:wpi="http://schemas.microsoft.com/office/word/2010/wordprocessingInk" xmlns:wne="http://schemas.microsoft.com/office/word/2006/wordml" xmlns:wps="http://schemas.microsoft.com/office/word/2010/wordprocessingShape" mc:Ignorable="w14 w15 w16se wp14">
+  <w:comment w:id="1" w:author="Jeroen Steenbeek" w:date="2017-04-26T11:19:00Z" w:initials="JS">
+    <w:p>
+      <w:pPr>
+        <w:pStyle w:val="CommentText"/>
+      </w:pPr>
+      <w:r>
+        <w:rPr>
+          <w:rStyle w:val="CommentReference"/>
+        </w:rPr>
+        <w:annotationRef/>
+      </w:r>
+      <w:r>
+        <w:t>This can be written out much more neatly. Chris, suggestions?</w:t>
+      </w:r>
+    </w:p>
+  </w:comment>
+</w:comments>
+</file>
+
+<file path=word/commentsExtended.xml><?xml version="1.0" encoding="utf-8"?>
+<w15:commentsEx xmlns:wpc="http://schemas.microsoft.com/office/word/2010/wordprocessingCanvas" xmlns:cx="http://schemas.microsoft.com/office/drawing/2014/chartex" xmlns:cx1="http://schemas.microsoft.com/office/drawing/2015/9/8/chartex" xmlns:mc="http://schemas.openxmlformats.org/markup-compatibility/2006" xmlns:o="urn:schemas-microsoft-com:office:office" xmlns:r="http://schemas.openxmlformats.org/officeDocument/2006/relationships" xmlns:m="http://schemas.openxmlformats.org/officeDocument/2006/math" xmlns:v="urn:schemas-microsoft-com:vml" xmlns:wp14="http://schemas.microsoft.com/office/word/2010/wordprocessingDrawing" xmlns:wp="http://schemas.openxmlformats.org/drawingml/2006/wordprocessingDrawing" xmlns:w10="urn:schemas-microsoft-com:office:word" xmlns:w="http://schemas.openxmlformats.org/wordprocessingml/2006/main" xmlns:w14="http://schemas.microsoft.com/office/word/2010/wordml" xmlns:w15="http://schemas.microsoft.com/office/word/2012/wordml" xmlns:w16se="http://schemas.microsoft.com/office/word/2015/wordml/symex" xmlns:wpg="http://schemas.microsoft.com/office/word/2010/wordprocessingGroup" xmlns:wpi="http://schemas.microsoft.com/office/word/2010/wordprocessingInk" xmlns:wne="http://schemas.microsoft.com/office/word/2006/wordml" xmlns:wps="http://schemas.microsoft.com/office/word/2010/wordprocessingShape" mc:Ignorable="w14 w15 w16se wp14">
+  <w15:commentEx w15:paraId="1CB1F4C6" w15:done="0"/>
+</w15:commentsEx>
+</file>
+
+<file path=word/numbering.xml><?xml version="1.0" encoding="utf-8"?>
+<w:numbering xmlns:wpc="http://schemas.microsoft.com/office/word/2010/wordprocessingCanvas" xmlns:cx="http://schemas.microsoft.com/office/drawing/2014/chartex" xmlns:cx1="http://schemas.microsoft.com/office/drawing/2015/9/8/chartex" xmlns:mc="http://schemas.openxmlformats.org/markup-compatibility/2006" xmlns:o="urn:schemas-microsoft-com:office:office" xmlns:r="http://schemas.openxmlformats.org/officeDocument/2006/relationships" xmlns:m="http://schemas.openxmlformats.org/officeDocument/2006/math" xmlns:v="urn:schemas-microsoft-com:vml" xmlns:wp14="http://schemas.microsoft.com/office/word/2010/wordprocessingDrawing" xmlns:wp="http://schemas.openxmlformats.org/drawingml/2006/wordprocessingDrawing" xmlns:w10="urn:schemas-microsoft-com:office:word" xmlns:w="http://schemas.openxmlformats.org/wordprocessingml/2006/main" xmlns:w14="http://schemas.microsoft.com/office/word/2010/wordml" xmlns:w15="http://schemas.microsoft.com/office/word/2012/wordml" xmlns:w16se="http://schemas.microsoft.com/office/word/2015/wordml/symex" xmlns:wpg="http://schemas.microsoft.com/office/word/2010/wordprocessingGroup" xmlns:wpi="http://schemas.microsoft.com/office/word/2010/wordprocessingInk" xmlns:wne="http://schemas.microsoft.com/office/word/2006/wordml" xmlns:wps="http://schemas.microsoft.com/office/word/2010/wordprocessingShape" mc:Ignorable="w14 w15 w16se wp14">
+  <w:abstractNum w:abstractNumId="0" w15:restartNumberingAfterBreak="0">
+    <w:nsid w:val="0AB57391"/>
+    <w:multiLevelType w:val="hybridMultilevel"/>
+    <w:tmpl w:val="BAF03822"/>
+    <w:lvl w:ilvl="0" w:tplc="08090001">
+      <w:start w:val="1"/>
+      <w:numFmt w:val="bullet"/>
+      <w:lvlText w:val=""/>
+      <w:lvlJc w:val="left"/>
+      <w:pPr>
+        <w:ind w:left="720" w:hanging="360"/>
+      </w:pPr>
+      <w:rPr>
+        <w:rFonts w:ascii="Symbol" w:hAnsi="Symbol" w:hint="default"/>
+      </w:rPr>
+    </w:lvl>
+    <w:lvl w:ilvl="1" w:tplc="08090003" w:tentative="1">
+      <w:start w:val="1"/>
+      <w:numFmt w:val="bullet"/>
+      <w:lvlText w:val="o"/>
+      <w:lvlJc w:val="left"/>
+      <w:pPr>
+        <w:ind w:left="1440" w:hanging="360"/>
+      </w:pPr>
+      <w:rPr>
+        <w:rFonts w:ascii="Courier New" w:hAnsi="Courier New" w:cs="Courier New" w:hint="default"/>
+      </w:rPr>
+    </w:lvl>
+    <w:lvl w:ilvl="2" w:tplc="08090005" w:tentative="1">
+      <w:start w:val="1"/>
+      <w:numFmt w:val="bullet"/>
+      <w:lvlText w:val=""/>
+      <w:lvlJc w:val="left"/>
+      <w:pPr>
+        <w:ind w:left="2160" w:hanging="360"/>
+      </w:pPr>
+      <w:rPr>
+        <w:rFonts w:ascii="Wingdings" w:hAnsi="Wingdings" w:hint="default"/>
+      </w:rPr>
+    </w:lvl>
+    <w:lvl w:ilvl="3" w:tplc="08090001" w:tentative="1">
+      <w:start w:val="1"/>
+      <w:numFmt w:val="bullet"/>
+      <w:lvlText w:val=""/>
+      <w:lvlJc w:val="left"/>
+      <w:pPr>
+        <w:ind w:left="2880" w:hanging="360"/>
+      </w:pPr>
+      <w:rPr>
+        <w:rFonts w:ascii="Symbol" w:hAnsi="Symbol" w:hint="default"/>
+      </w:rPr>
+    </w:lvl>
+    <w:lvl w:ilvl="4" w:tplc="08090003" w:tentative="1">
+      <w:start w:val="1"/>
+      <w:numFmt w:val="bullet"/>
+      <w:lvlText w:val="o"/>
+      <w:lvlJc w:val="left"/>
+      <w:pPr>
+        <w:ind w:left="3600" w:hanging="360"/>
+      </w:pPr>
+      <w:rPr>
+        <w:rFonts w:ascii="Courier New" w:hAnsi="Courier New" w:cs="Courier New" w:hint="default"/>
+      </w:rPr>
+    </w:lvl>
+    <w:lvl w:ilvl="5" w:tplc="08090005" w:tentative="1">
+      <w:start w:val="1"/>
+      <w:numFmt w:val="bullet"/>
+      <w:lvlText w:val=""/>
+      <w:lvlJc w:val="left"/>
+      <w:pPr>
+        <w:ind w:left="4320" w:hanging="360"/>
+      </w:pPr>
+      <w:rPr>
+        <w:rFonts w:ascii="Wingdings" w:hAnsi="Wingdings" w:hint="default"/>
+      </w:rPr>
+    </w:lvl>
+    <w:lvl w:ilvl="6" w:tplc="08090001" w:tentative="1">
+      <w:start w:val="1"/>
+      <w:numFmt w:val="bullet"/>
+      <w:lvlText w:val=""/>
+      <w:lvlJc w:val="left"/>
+      <w:pPr>
+        <w:ind w:left="5040" w:hanging="360"/>
+      </w:pPr>
+      <w:rPr>
+        <w:rFonts w:ascii="Symbol" w:hAnsi="Symbol" w:hint="default"/>
+      </w:rPr>
+    </w:lvl>
+    <w:lvl w:ilvl="7" w:tplc="08090003" w:tentative="1">
+      <w:start w:val="1"/>
+      <w:numFmt w:val="bullet"/>
+      <w:lvlText w:val="o"/>
+      <w:lvlJc w:val="left"/>
+      <w:pPr>
+        <w:ind w:left="5760" w:hanging="360"/>
+      </w:pPr>
+      <w:rPr>
+        <w:rFonts w:ascii="Courier New" w:hAnsi="Courier New" w:cs="Courier New" w:hint="default"/>
+      </w:rPr>
+    </w:lvl>
+    <w:lvl w:ilvl="8" w:tplc="08090005" w:tentative="1">
+      <w:start w:val="1"/>
+      <w:numFmt w:val="bullet"/>
+      <w:lvlText w:val=""/>
+      <w:lvlJc w:val="left"/>
+      <w:pPr>
+        <w:ind w:left="6480" w:hanging="360"/>
+      </w:pPr>
+      <w:rPr>
+        <w:rFonts w:ascii="Wingdings" w:hAnsi="Wingdings" w:hint="default"/>
+      </w:rPr>
+    </w:lvl>
+  </w:abstractNum>
+  <w:abstractNum w:abstractNumId="1" w15:restartNumberingAfterBreak="0">
+    <w:nsid w:val="2FA04E2F"/>
+    <w:multiLevelType w:val="hybridMultilevel"/>
+    <w:tmpl w:val="41D27D22"/>
+    <w:lvl w:ilvl="0" w:tplc="08090001">
+      <w:start w:val="1"/>
+      <w:numFmt w:val="bullet"/>
+      <w:lvlText w:val=""/>
+      <w:lvlJc w:val="left"/>
+      <w:pPr>
+        <w:ind w:left="720" w:hanging="360"/>
+      </w:pPr>
+      <w:rPr>
+        <w:rFonts w:ascii="Symbol" w:hAnsi="Symbol" w:hint="default"/>
+      </w:rPr>
+    </w:lvl>
+    <w:lvl w:ilvl="1" w:tplc="08090003" w:tentative="1">
+      <w:start w:val="1"/>
+      <w:numFmt w:val="bullet"/>
+      <w:lvlText w:val="o"/>
+      <w:lvlJc w:val="left"/>
+      <w:pPr>
+        <w:ind w:left="1440" w:hanging="360"/>
+      </w:pPr>
+      <w:rPr>
+        <w:rFonts w:ascii="Courier New" w:hAnsi="Courier New" w:cs="Courier New" w:hint="default"/>
+      </w:rPr>
+    </w:lvl>
+    <w:lvl w:ilvl="2" w:tplc="08090005" w:tentative="1">
+      <w:start w:val="1"/>
+      <w:numFmt w:val="bullet"/>
+      <w:lvlText w:val=""/>
+      <w:lvlJc w:val="left"/>
+      <w:pPr>
+        <w:ind w:left="2160" w:hanging="360"/>
+      </w:pPr>
+      <w:rPr>
+        <w:rFonts w:ascii="Wingdings" w:hAnsi="Wingdings" w:hint="default"/>
+      </w:rPr>
+    </w:lvl>
+    <w:lvl w:ilvl="3" w:tplc="08090001" w:tentative="1">
+      <w:start w:val="1"/>
+      <w:numFmt w:val="bullet"/>
+      <w:lvlText w:val=""/>
+      <w:lvlJc w:val="left"/>
+      <w:pPr>
+        <w:ind w:left="2880" w:hanging="360"/>
+      </w:pPr>
+      <w:rPr>
+        <w:rFonts w:ascii="Symbol" w:hAnsi="Symbol" w:hint="default"/>
+      </w:rPr>
+    </w:lvl>
+    <w:lvl w:ilvl="4" w:tplc="08090003" w:tentative="1">
+      <w:start w:val="1"/>
+      <w:numFmt w:val="bullet"/>
+      <w:lvlText w:val="o"/>
+      <w:lvlJc w:val="left"/>
+      <w:pPr>
+        <w:ind w:left="3600" w:hanging="360"/>
+      </w:pPr>
+      <w:rPr>
+        <w:rFonts w:ascii="Courier New" w:hAnsi="Courier New" w:cs="Courier New" w:hint="default"/>
+      </w:rPr>
+    </w:lvl>
+    <w:lvl w:ilvl="5" w:tplc="08090005" w:tentative="1">
+      <w:start w:val="1"/>
+      <w:numFmt w:val="bullet"/>
+      <w:lvlText w:val=""/>
+      <w:lvlJc w:val="left"/>
+      <w:pPr>
+        <w:ind w:left="4320" w:hanging="360"/>
+      </w:pPr>
+      <w:rPr>
+        <w:rFonts w:ascii="Wingdings" w:hAnsi="Wingdings" w:hint="default"/>
+      </w:rPr>
+    </w:lvl>
+    <w:lvl w:ilvl="6" w:tplc="08090001" w:tentative="1">
+      <w:start w:val="1"/>
+      <w:numFmt w:val="bullet"/>
+      <w:lvlText w:val=""/>
+      <w:lvlJc w:val="left"/>
+      <w:pPr>
+        <w:ind w:left="5040" w:hanging="360"/>
+      </w:pPr>
+      <w:rPr>
+        <w:rFonts w:ascii="Symbol" w:hAnsi="Symbol" w:hint="default"/>
+      </w:rPr>
+    </w:lvl>
+    <w:lvl w:ilvl="7" w:tplc="08090003" w:tentative="1">
+      <w:start w:val="1"/>
+      <w:numFmt w:val="bullet"/>
+      <w:lvlText w:val="o"/>
+      <w:lvlJc w:val="left"/>
+      <w:pPr>
+        <w:ind w:left="5760" w:hanging="360"/>
+      </w:pPr>
+      <w:rPr>
+        <w:rFonts w:ascii="Courier New" w:hAnsi="Courier New" w:cs="Courier New" w:hint="default"/>
+      </w:rPr>
+    </w:lvl>
+    <w:lvl w:ilvl="8" w:tplc="08090005" w:tentative="1">
+      <w:start w:val="1"/>
+      <w:numFmt w:val="bullet"/>
+      <w:lvlText w:val=""/>
+      <w:lvlJc w:val="left"/>
+      <w:pPr>
+        <w:ind w:left="6480" w:hanging="360"/>
+      </w:pPr>
+      <w:rPr>
+        <w:rFonts w:ascii="Wingdings" w:hAnsi="Wingdings" w:hint="default"/>
+      </w:rPr>
+    </w:lvl>
+  </w:abstractNum>
+  <w:abstractNum w:abstractNumId="2" w15:restartNumberingAfterBreak="0">
+    <w:nsid w:val="40D02130"/>
+    <w:multiLevelType w:val="hybridMultilevel"/>
+    <w:tmpl w:val="185CC99E"/>
+    <w:lvl w:ilvl="0" w:tplc="08090001">
+      <w:start w:val="1"/>
+      <w:numFmt w:val="bullet"/>
+      <w:lvlText w:val=""/>
+      <w:lvlJc w:val="left"/>
+      <w:pPr>
+        <w:ind w:left="720" w:hanging="360"/>
+      </w:pPr>
+      <w:rPr>
+        <w:rFonts w:ascii="Symbol" w:hAnsi="Symbol" w:hint="default"/>
+      </w:rPr>
+    </w:lvl>
+    <w:lvl w:ilvl="1" w:tplc="08090003" w:tentative="1">
+      <w:start w:val="1"/>
+      <w:numFmt w:val="bullet"/>
+      <w:lvlText w:val="o"/>
+      <w:lvlJc w:val="left"/>
+      <w:pPr>
+        <w:ind w:left="1440" w:hanging="360"/>
+      </w:pPr>
+      <w:rPr>
+        <w:rFonts w:ascii="Courier New" w:hAnsi="Courier New" w:cs="Courier New" w:hint="default"/>
+      </w:rPr>
+    </w:lvl>
+    <w:lvl w:ilvl="2" w:tplc="08090005" w:tentative="1">
+      <w:start w:val="1"/>
+      <w:numFmt w:val="bullet"/>
+      <w:lvlText w:val=""/>
+      <w:lvlJc w:val="left"/>
+      <w:pPr>
+        <w:ind w:left="2160" w:hanging="360"/>
+      </w:pPr>
+      <w:rPr>
+        <w:rFonts w:ascii="Wingdings" w:hAnsi="Wingdings" w:hint="default"/>
+      </w:rPr>
+    </w:lvl>
+    <w:lvl w:ilvl="3" w:tplc="08090001" w:tentative="1">
+      <w:start w:val="1"/>
+      <w:numFmt w:val="bullet"/>
+      <w:lvlText w:val=""/>
+      <w:lvlJc w:val="left"/>
+      <w:pPr>
+        <w:ind w:left="2880" w:hanging="360"/>
+      </w:pPr>
+      <w:rPr>
+        <w:rFonts w:ascii="Symbol" w:hAnsi="Symbol" w:hint="default"/>
+      </w:rPr>
+    </w:lvl>
+    <w:lvl w:ilvl="4" w:tplc="08090003" w:tentative="1">
+      <w:start w:val="1"/>
+      <w:numFmt w:val="bullet"/>
+      <w:lvlText w:val="o"/>
+      <w:lvlJc w:val="left"/>
+      <w:pPr>
+        <w:ind w:left="3600" w:hanging="360"/>
+      </w:pPr>
+      <w:rPr>
+        <w:rFonts w:ascii="Courier New" w:hAnsi="Courier New" w:cs="Courier New" w:hint="default"/>
+      </w:rPr>
+    </w:lvl>
+    <w:lvl w:ilvl="5" w:tplc="08090005" w:tentative="1">
+      <w:start w:val="1"/>
+      <w:numFmt w:val="bullet"/>
+      <w:lvlText w:val=""/>
+      <w:lvlJc w:val="left"/>
+      <w:pPr>
+        <w:ind w:left="4320" w:hanging="360"/>
+      </w:pPr>
+      <w:rPr>
+        <w:rFonts w:ascii="Wingdings" w:hAnsi="Wingdings" w:hint="default"/>
+      </w:rPr>
+    </w:lvl>
+    <w:lvl w:ilvl="6" w:tplc="08090001" w:tentative="1">
+      <w:start w:val="1"/>
+      <w:numFmt w:val="bullet"/>
+      <w:lvlText w:val=""/>
+      <w:lvlJc w:val="left"/>
+      <w:pPr>
+        <w:ind w:left="5040" w:hanging="360"/>
+      </w:pPr>
+      <w:rPr>
+        <w:rFonts w:ascii="Symbol" w:hAnsi="Symbol" w:hint="default"/>
+      </w:rPr>
+    </w:lvl>
+    <w:lvl w:ilvl="7" w:tplc="08090003" w:tentative="1">
+      <w:start w:val="1"/>
+      <w:numFmt w:val="bullet"/>
+      <w:lvlText w:val="o"/>
+      <w:lvlJc w:val="left"/>
+      <w:pPr>
+        <w:ind w:left="5760" w:hanging="360"/>
+      </w:pPr>
+      <w:rPr>
+        <w:rFonts w:ascii="Courier New" w:hAnsi="Courier New" w:cs="Courier New" w:hint="default"/>
+      </w:rPr>
+    </w:lvl>
+    <w:lvl w:ilvl="8" w:tplc="08090005" w:tentative="1">
+      <w:start w:val="1"/>
+      <w:numFmt w:val="bullet"/>
+      <w:lvlText w:val=""/>
+      <w:lvlJc w:val="left"/>
+      <w:pPr>
+        <w:ind w:left="6480" w:hanging="360"/>
+      </w:pPr>
+      <w:rPr>
+        <w:rFonts w:ascii="Wingdings" w:hAnsi="Wingdings" w:hint="default"/>
+      </w:rPr>
+    </w:lvl>
+  </w:abstractNum>
+  <w:num w:numId="1">
+    <w:abstractNumId w:val="2"/>
+  </w:num>
+  <w:num w:numId="2">
+    <w:abstractNumId w:val="1"/>
+  </w:num>
+  <w:num w:numId="3">
+    <w:abstractNumId w:val="0"/>
+  </w:num>
+</w:numbering>
+</file>
+
+<file path=word/people.xml><?xml version="1.0" encoding="utf-8"?>
+<w15:people xmlns:wpc="http://schemas.microsoft.com/office/word/2010/wordprocessingCanvas" xmlns:cx="http://schemas.microsoft.com/office/drawing/2014/chartex" xmlns:cx1="http://schemas.microsoft.com/office/drawing/2015/9/8/chartex" xmlns:mc="http://schemas.openxmlformats.org/markup-compatibility/2006" xmlns:o="urn:schemas-microsoft-com:office:office" xmlns:r="http://schemas.openxmlformats.org/officeDocument/2006/relationships" xmlns:m="http://schemas.openxmlformats.org/officeDocument/2006/math" xmlns:v="urn:schemas-microsoft-com:vml" xmlns:wp14="http://schemas.microsoft.com/office/word/2010/wordprocessingDrawing" xmlns:wp="http://schemas.openxmlformats.org/drawingml/2006/wordprocessingDrawing" xmlns:w10="urn:schemas-microsoft-com:office:word" xmlns:w="http://schemas.openxmlformats.org/wordprocessingml/2006/main" xmlns:w14="http://schemas.microsoft.com/office/word/2010/wordml" xmlns:w15="http://schemas.microsoft.com/office/word/2012/wordml" xmlns:w16se="http://schemas.microsoft.com/office/word/2015/wordml/symex" xmlns:wpg="http://schemas.microsoft.com/office/word/2010/wordprocessingGroup" xmlns:wpi="http://schemas.microsoft.com/office/word/2010/wordprocessingInk" xmlns:wne="http://schemas.microsoft.com/office/word/2006/wordml" xmlns:wps="http://schemas.microsoft.com/office/word/2010/wordprocessingShape" mc:Ignorable="w14 w15 w16se wp14">
+  <w15:person w15:author="Jeroen Steenbeek">
+    <w15:presenceInfo w15:providerId="None" w15:userId="Jeroen Steenbeek"/>
+  </w15:person>
+</w15:people>
 </file>
 
 <file path=word/styles.xml><?xml version="1.0" encoding="utf-8"?>
@@ -753,6 +2146,93 @@
     <w:name w:val="Normal"/>
     <w:qFormat/>
   </w:style>
+  <w:style w:type="paragraph" w:styleId="Heading1">
+    <w:name w:val="heading 1"/>
+    <w:basedOn w:val="Normal"/>
+    <w:next w:val="Normal"/>
+    <w:link w:val="Heading1Char"/>
+    <w:uiPriority w:val="9"/>
+    <w:qFormat/>
+    <w:rsid w:val="00120DE0"/>
+    <w:pPr>
+      <w:keepNext/>
+      <w:keepLines/>
+      <w:spacing w:before="240" w:after="0"/>
+      <w:outlineLvl w:val="0"/>
+    </w:pPr>
+    <w:rPr>
+      <w:rFonts w:asciiTheme="majorHAnsi" w:eastAsiaTheme="majorEastAsia" w:hAnsiTheme="majorHAnsi" w:cstheme="majorBidi"/>
+      <w:color w:val="2E74B5" w:themeColor="accent1" w:themeShade="BF"/>
+      <w:sz w:val="32"/>
+      <w:szCs w:val="32"/>
+    </w:rPr>
+  </w:style>
+  <w:style w:type="paragraph" w:styleId="Heading2">
+    <w:name w:val="heading 2"/>
+    <w:basedOn w:val="Normal"/>
+    <w:next w:val="Normal"/>
+    <w:link w:val="Heading2Char"/>
+    <w:uiPriority w:val="9"/>
+    <w:unhideWhenUsed/>
+    <w:qFormat/>
+    <w:rsid w:val="00120DE0"/>
+    <w:pPr>
+      <w:keepNext/>
+      <w:keepLines/>
+      <w:spacing w:before="40" w:after="0"/>
+      <w:outlineLvl w:val="1"/>
+    </w:pPr>
+    <w:rPr>
+      <w:rFonts w:asciiTheme="majorHAnsi" w:eastAsiaTheme="majorEastAsia" w:hAnsiTheme="majorHAnsi" w:cstheme="majorBidi"/>
+      <w:color w:val="2E74B5" w:themeColor="accent1" w:themeShade="BF"/>
+      <w:sz w:val="26"/>
+      <w:szCs w:val="26"/>
+    </w:rPr>
+  </w:style>
+  <w:style w:type="paragraph" w:styleId="Heading3">
+    <w:name w:val="heading 3"/>
+    <w:basedOn w:val="Normal"/>
+    <w:next w:val="Normal"/>
+    <w:link w:val="Heading3Char"/>
+    <w:uiPriority w:val="9"/>
+    <w:unhideWhenUsed/>
+    <w:qFormat/>
+    <w:rsid w:val="00120DE0"/>
+    <w:pPr>
+      <w:keepNext/>
+      <w:keepLines/>
+      <w:spacing w:before="40" w:after="0"/>
+      <w:outlineLvl w:val="2"/>
+    </w:pPr>
+    <w:rPr>
+      <w:rFonts w:asciiTheme="majorHAnsi" w:eastAsiaTheme="majorEastAsia" w:hAnsiTheme="majorHAnsi" w:cstheme="majorBidi"/>
+      <w:color w:val="1F4D78" w:themeColor="accent1" w:themeShade="7F"/>
+      <w:sz w:val="24"/>
+      <w:szCs w:val="24"/>
+    </w:rPr>
+  </w:style>
+  <w:style w:type="paragraph" w:styleId="Heading4">
+    <w:name w:val="heading 4"/>
+    <w:basedOn w:val="Normal"/>
+    <w:next w:val="Normal"/>
+    <w:link w:val="Heading4Char"/>
+    <w:uiPriority w:val="9"/>
+    <w:unhideWhenUsed/>
+    <w:qFormat/>
+    <w:rsid w:val="00B26017"/>
+    <w:pPr>
+      <w:keepNext/>
+      <w:keepLines/>
+      <w:spacing w:before="40" w:after="0"/>
+      <w:outlineLvl w:val="3"/>
+    </w:pPr>
+    <w:rPr>
+      <w:rFonts w:asciiTheme="majorHAnsi" w:eastAsiaTheme="majorEastAsia" w:hAnsiTheme="majorHAnsi" w:cstheme="majorBidi"/>
+      <w:i/>
+      <w:iCs/>
+      <w:color w:val="2E74B5" w:themeColor="accent1" w:themeShade="BF"/>
+    </w:rPr>
+  </w:style>
   <w:style w:type="character" w:default="1" w:styleId="DefaultParagraphFont">
     <w:name w:val="Default Paragraph Font"/>
     <w:uiPriority w:val="1"/>
@@ -795,6 +2275,167 @@
       <w:i/>
       <w:iCs/>
       <w:color w:val="44546A" w:themeColor="text2"/>
+      <w:sz w:val="18"/>
+      <w:szCs w:val="18"/>
+    </w:rPr>
+  </w:style>
+  <w:style w:type="character" w:customStyle="1" w:styleId="Heading1Char">
+    <w:name w:val="Heading 1 Char"/>
+    <w:basedOn w:val="DefaultParagraphFont"/>
+    <w:link w:val="Heading1"/>
+    <w:uiPriority w:val="9"/>
+    <w:rsid w:val="00120DE0"/>
+    <w:rPr>
+      <w:rFonts w:asciiTheme="majorHAnsi" w:eastAsiaTheme="majorEastAsia" w:hAnsiTheme="majorHAnsi" w:cstheme="majorBidi"/>
+      <w:color w:val="2E74B5" w:themeColor="accent1" w:themeShade="BF"/>
+      <w:sz w:val="32"/>
+      <w:szCs w:val="32"/>
+    </w:rPr>
+  </w:style>
+  <w:style w:type="character" w:customStyle="1" w:styleId="Heading2Char">
+    <w:name w:val="Heading 2 Char"/>
+    <w:basedOn w:val="DefaultParagraphFont"/>
+    <w:link w:val="Heading2"/>
+    <w:uiPriority w:val="9"/>
+    <w:rsid w:val="00120DE0"/>
+    <w:rPr>
+      <w:rFonts w:asciiTheme="majorHAnsi" w:eastAsiaTheme="majorEastAsia" w:hAnsiTheme="majorHAnsi" w:cstheme="majorBidi"/>
+      <w:color w:val="2E74B5" w:themeColor="accent1" w:themeShade="BF"/>
+      <w:sz w:val="26"/>
+      <w:szCs w:val="26"/>
+    </w:rPr>
+  </w:style>
+  <w:style w:type="character" w:customStyle="1" w:styleId="Heading3Char">
+    <w:name w:val="Heading 3 Char"/>
+    <w:basedOn w:val="DefaultParagraphFont"/>
+    <w:link w:val="Heading3"/>
+    <w:uiPriority w:val="9"/>
+    <w:rsid w:val="00120DE0"/>
+    <w:rPr>
+      <w:rFonts w:asciiTheme="majorHAnsi" w:eastAsiaTheme="majorEastAsia" w:hAnsiTheme="majorHAnsi" w:cstheme="majorBidi"/>
+      <w:color w:val="1F4D78" w:themeColor="accent1" w:themeShade="7F"/>
+      <w:sz w:val="24"/>
+      <w:szCs w:val="24"/>
+    </w:rPr>
+  </w:style>
+  <w:style w:type="character" w:customStyle="1" w:styleId="Heading4Char">
+    <w:name w:val="Heading 4 Char"/>
+    <w:basedOn w:val="DefaultParagraphFont"/>
+    <w:link w:val="Heading4"/>
+    <w:uiPriority w:val="9"/>
+    <w:rsid w:val="00B26017"/>
+    <w:rPr>
+      <w:rFonts w:asciiTheme="majorHAnsi" w:eastAsiaTheme="majorEastAsia" w:hAnsiTheme="majorHAnsi" w:cstheme="majorBidi"/>
+      <w:i/>
+      <w:iCs/>
+      <w:color w:val="2E74B5" w:themeColor="accent1" w:themeShade="BF"/>
+    </w:rPr>
+  </w:style>
+  <w:style w:type="paragraph" w:styleId="ListParagraph">
+    <w:name w:val="List Paragraph"/>
+    <w:basedOn w:val="Normal"/>
+    <w:uiPriority w:val="34"/>
+    <w:qFormat/>
+    <w:rsid w:val="009715C7"/>
+    <w:pPr>
+      <w:ind w:left="720"/>
+      <w:contextualSpacing/>
+    </w:pPr>
+  </w:style>
+  <w:style w:type="character" w:styleId="CommentReference">
+    <w:name w:val="annotation reference"/>
+    <w:basedOn w:val="DefaultParagraphFont"/>
+    <w:uiPriority w:val="99"/>
+    <w:semiHidden/>
+    <w:unhideWhenUsed/>
+    <w:rsid w:val="000E7774"/>
+    <w:rPr>
+      <w:sz w:val="16"/>
+      <w:szCs w:val="16"/>
+    </w:rPr>
+  </w:style>
+  <w:style w:type="paragraph" w:styleId="CommentText">
+    <w:name w:val="annotation text"/>
+    <w:basedOn w:val="Normal"/>
+    <w:link w:val="CommentTextChar"/>
+    <w:uiPriority w:val="99"/>
+    <w:semiHidden/>
+    <w:unhideWhenUsed/>
+    <w:rsid w:val="000E7774"/>
+    <w:pPr>
+      <w:spacing w:line="240" w:lineRule="auto"/>
+    </w:pPr>
+    <w:rPr>
+      <w:sz w:val="20"/>
+      <w:szCs w:val="20"/>
+    </w:rPr>
+  </w:style>
+  <w:style w:type="character" w:customStyle="1" w:styleId="CommentTextChar">
+    <w:name w:val="Comment Text Char"/>
+    <w:basedOn w:val="DefaultParagraphFont"/>
+    <w:link w:val="CommentText"/>
+    <w:uiPriority w:val="99"/>
+    <w:semiHidden/>
+    <w:rsid w:val="000E7774"/>
+    <w:rPr>
+      <w:sz w:val="20"/>
+      <w:szCs w:val="20"/>
+    </w:rPr>
+  </w:style>
+  <w:style w:type="paragraph" w:styleId="CommentSubject">
+    <w:name w:val="annotation subject"/>
+    <w:basedOn w:val="CommentText"/>
+    <w:next w:val="CommentText"/>
+    <w:link w:val="CommentSubjectChar"/>
+    <w:uiPriority w:val="99"/>
+    <w:semiHidden/>
+    <w:unhideWhenUsed/>
+    <w:rsid w:val="000E7774"/>
+    <w:rPr>
+      <w:b/>
+      <w:bCs/>
+    </w:rPr>
+  </w:style>
+  <w:style w:type="character" w:customStyle="1" w:styleId="CommentSubjectChar">
+    <w:name w:val="Comment Subject Char"/>
+    <w:basedOn w:val="CommentTextChar"/>
+    <w:link w:val="CommentSubject"/>
+    <w:uiPriority w:val="99"/>
+    <w:semiHidden/>
+    <w:rsid w:val="000E7774"/>
+    <w:rPr>
+      <w:b/>
+      <w:bCs/>
+      <w:sz w:val="20"/>
+      <w:szCs w:val="20"/>
+    </w:rPr>
+  </w:style>
+  <w:style w:type="paragraph" w:styleId="BalloonText">
+    <w:name w:val="Balloon Text"/>
+    <w:basedOn w:val="Normal"/>
+    <w:link w:val="BalloonTextChar"/>
+    <w:uiPriority w:val="99"/>
+    <w:semiHidden/>
+    <w:unhideWhenUsed/>
+    <w:rsid w:val="000E7774"/>
+    <w:pPr>
+      <w:spacing w:after="0" w:line="240" w:lineRule="auto"/>
+    </w:pPr>
+    <w:rPr>
+      <w:rFonts w:ascii="Segoe UI" w:hAnsi="Segoe UI" w:cs="Segoe UI"/>
+      <w:sz w:val="18"/>
+      <w:szCs w:val="18"/>
+    </w:rPr>
+  </w:style>
+  <w:style w:type="character" w:customStyle="1" w:styleId="BalloonTextChar">
+    <w:name w:val="Balloon Text Char"/>
+    <w:basedOn w:val="DefaultParagraphFont"/>
+    <w:link w:val="BalloonText"/>
+    <w:uiPriority w:val="99"/>
+    <w:semiHidden/>
+    <w:rsid w:val="000E7774"/>
+    <w:rPr>
+      <w:rFonts w:ascii="Segoe UI" w:hAnsi="Segoe UI" w:cs="Segoe UI"/>
       <w:sz w:val="18"/>
       <w:szCs w:val="18"/>
     </w:rPr>
@@ -1061,4 +2702,16 @@
     </a:ext>
   </a:extLst>
 </a:theme>
+</file>
+
+<file path=customXml/item1.xml><?xml version="1.0" encoding="utf-8"?>
+<b:Sources xmlns:b="http://schemas.openxmlformats.org/officeDocument/2006/bibliography" xmlns="http://schemas.openxmlformats.org/officeDocument/2006/bibliography" SelectedStyle="\APASixthEditionOfficeOnline.xsl" StyleName="APA" Version="6"/>
+</file>
+
+<file path=customXml/itemProps1.xml><?xml version="1.0" encoding="utf-8"?>
+<ds:datastoreItem xmlns:ds="http://schemas.openxmlformats.org/officeDocument/2006/customXml" ds:itemID="{6C7EE6DB-13D0-4172-A44B-F7BA5C488274}">
+  <ds:schemaRefs>
+    <ds:schemaRef ds:uri="http://schemas.openxmlformats.org/officeDocument/2006/bibliography"/>
+  </ds:schemaRefs>
+</ds:datastoreItem>
 </file>
</xml_diff>

<commit_message>
Fixed transect axis labels Vector transect uses styleguide colours Updated documentation
git-svn-id: https://sources.ecopath.org/svn/Ecopath/trunk/Ecopath6@14640 a725721c-0ed6-864e-a6a8-02c2a1988c9d
</commit_message>
<xml_diff>
--- a/Sources Internal/Plugins/EwETransectExtractionPlugin/Documentation/Transects.docx
+++ b/Sources Internal/Plugins/EwETransectExtractionPlugin/Documentation/Transects.docx
@@ -35,13 +35,7 @@
           <w:lang w:eastAsia="en-GB"/>
         </w:rPr>
         <w:br/>
-        <w:t xml:space="preserve">Version 1.0, </w:t>
-      </w:r>
-      <w:r>
-        <w:rPr>
-          <w:lang w:eastAsia="en-GB"/>
-        </w:rPr>
-        <w:t>, 26 April 2017</w:t>
+        <w:t>Version 1.0, , 26 April 2017</w:t>
       </w:r>
     </w:p>
     <w:p>
@@ -76,8 +70,6 @@
         </w:rPr>
         <w:t xml:space="preserve">plotted </w:t>
       </w:r>
-      <w:bookmarkStart w:id="0" w:name="_GoBack"/>
-      <w:bookmarkEnd w:id="0"/>
       <w:r>
         <w:rPr>
           <w:lang w:eastAsia="en-GB"/>
@@ -445,13 +437,7 @@
         <w:rPr>
           <w:lang w:eastAsia="en-GB"/>
         </w:rPr>
-        <w:t xml:space="preserve">Computed Ecospace catch </w:t>
-      </w:r>
-      <w:r>
-        <w:rPr>
-          <w:lang w:eastAsia="en-GB"/>
-        </w:rPr>
-        <w:t>(t/km</w:t>
+        <w:t>Computed Ecospace catch (t/km</w:t>
       </w:r>
       <w:r>
         <w:rPr>
@@ -464,13 +450,7 @@
         <w:rPr>
           <w:lang w:eastAsia="en-GB"/>
         </w:rPr>
-        <w:t>)</w:t>
-      </w:r>
-      <w:r>
-        <w:rPr>
-          <w:lang w:eastAsia="en-GB"/>
-        </w:rPr>
-        <w:t>, per group, at a given time step.</w:t>
+        <w:t>), per group, at a given time step.</w:t>
       </w:r>
     </w:p>
     <w:p>
@@ -571,25 +551,7 @@
         <w:rPr>
           <w:lang w:eastAsia="en-GB"/>
         </w:rPr>
-        <w:t>A</w:t>
-      </w:r>
-      <w:r>
-        <w:rPr>
-          <w:lang w:eastAsia="en-GB"/>
-        </w:rPr>
-        <w:t xml:space="preserve">nimation </w:t>
-      </w:r>
-      <w:r>
-        <w:rPr>
-          <w:lang w:eastAsia="en-GB"/>
-        </w:rPr>
-        <w:t xml:space="preserve">of </w:t>
-      </w:r>
-      <w:r>
-        <w:rPr>
-          <w:lang w:eastAsia="en-GB"/>
-        </w:rPr>
-        <w:t>Ecospace transect summaries over time. The animation speed is set, and users cannot manually select the time step to view.</w:t>
+        <w:t>Animation of Ecospace transect summaries over time. The animation speed is set, and users cannot manually select the time step to view.</w:t>
       </w:r>
     </w:p>
     <w:p>
@@ -693,7 +655,7 @@
         <w:rPr>
           <w:lang w:eastAsia="en-GB"/>
         </w:rPr>
-        <w:t>Known issues and future improvements</w:t>
+        <w:t>Known issues</w:t>
       </w:r>
     </w:p>
     <w:p>
@@ -731,7 +693,7 @@
     </w:p>
     <w:p>
       <w:pPr>
-        <w:pStyle w:val="Heading2"/>
+        <w:pStyle w:val="Heading3"/>
         <w:rPr>
           <w:lang w:eastAsia="en-GB"/>
         </w:rPr>
@@ -800,6 +762,129 @@
     </w:p>
     <w:p>
       <w:pPr>
+        <w:pStyle w:val="Heading2"/>
+        <w:rPr>
+          <w:lang w:eastAsia="en-GB"/>
+        </w:rPr>
+      </w:pPr>
+      <w:r>
+        <w:rPr>
+          <w:lang w:eastAsia="en-GB"/>
+        </w:rPr>
+        <w:t>Future developments</w:t>
+      </w:r>
+    </w:p>
+    <w:p>
+      <w:pPr>
+        <w:rPr>
+          <w:lang w:eastAsia="en-GB"/>
+        </w:rPr>
+      </w:pPr>
+      <w:r>
+        <w:rPr>
+          <w:lang w:eastAsia="en-GB"/>
+        </w:rPr>
+        <w:t xml:space="preserve">The </w:t>
+      </w:r>
+      <w:r>
+        <w:rPr>
+          <w:lang w:eastAsia="en-GB"/>
+        </w:rPr>
+        <w:t xml:space="preserve">transect functionality </w:t>
+      </w:r>
+      <w:r>
+        <w:rPr>
+          <w:lang w:eastAsia="en-GB"/>
+        </w:rPr>
+        <w:t xml:space="preserve">logic is </w:t>
+      </w:r>
+      <w:r>
+        <w:rPr>
+          <w:lang w:eastAsia="en-GB"/>
+        </w:rPr>
+        <w:t xml:space="preserve">still in prototype stage and is rather </w:t>
+      </w:r>
+      <w:r>
+        <w:rPr>
+          <w:lang w:eastAsia="en-GB"/>
+        </w:rPr>
+        <w:t xml:space="preserve">unpolished. </w:t>
+      </w:r>
+      <w:r>
+        <w:rPr>
+          <w:lang w:eastAsia="en-GB"/>
+        </w:rPr>
+        <w:t xml:space="preserve">A range </w:t>
+      </w:r>
+      <w:r>
+        <w:rPr>
+          <w:lang w:eastAsia="en-GB"/>
+        </w:rPr>
+        <w:t>of</w:t>
+      </w:r>
+      <w:r>
+        <w:rPr>
+          <w:lang w:eastAsia="en-GB"/>
+        </w:rPr>
+        <w:t xml:space="preserve"> </w:t>
+      </w:r>
+      <w:r>
+        <w:rPr>
+          <w:lang w:eastAsia="en-GB"/>
+        </w:rPr>
+        <w:t xml:space="preserve">additional </w:t>
+      </w:r>
+      <w:r>
+        <w:rPr>
+          <w:lang w:eastAsia="en-GB"/>
+        </w:rPr>
+        <w:t xml:space="preserve">features </w:t>
+      </w:r>
+      <w:r>
+        <w:rPr>
+          <w:lang w:eastAsia="en-GB"/>
+        </w:rPr>
+        <w:t xml:space="preserve">could be </w:t>
+      </w:r>
+      <w:r>
+        <w:rPr>
+          <w:lang w:eastAsia="en-GB"/>
+        </w:rPr>
+        <w:t>foreseen such as listed below. However, b</w:t>
+      </w:r>
+      <w:r>
+        <w:rPr>
+          <w:lang w:eastAsia="en-GB"/>
+        </w:rPr>
+        <w:t xml:space="preserve">efore implementing additional features, it </w:t>
+      </w:r>
+      <w:r>
+        <w:rPr>
+          <w:lang w:eastAsia="en-GB"/>
+        </w:rPr>
+        <w:t xml:space="preserve">may be prudent to decide which lacking features are most needed by </w:t>
+      </w:r>
+      <w:r>
+        <w:rPr>
+          <w:lang w:eastAsia="en-GB"/>
+        </w:rPr>
+        <w:t xml:space="preserve">gather </w:t>
+      </w:r>
+      <w:r>
+        <w:rPr>
+          <w:lang w:eastAsia="en-GB"/>
+        </w:rPr>
+        <w:t xml:space="preserve">usage </w:t>
+      </w:r>
+      <w:r>
+        <w:rPr>
+          <w:lang w:eastAsia="en-GB"/>
+        </w:rPr>
+        <w:t>feedback on current functionality. This feedback will help identifying shortcomings in the current user interface, and will be used to prioritize future development efforts.</w:t>
+      </w:r>
+    </w:p>
+    <w:p>
+      <w:pPr>
         <w:pStyle w:val="Heading3"/>
         <w:rPr>
           <w:lang w:eastAsia="en-GB"/>
@@ -809,50 +894,65 @@
         <w:rPr>
           <w:lang w:eastAsia="en-GB"/>
         </w:rPr>
-        <w:t>New features</w:t>
-      </w:r>
-    </w:p>
-    <w:p>
-      <w:pPr>
-        <w:rPr>
-          <w:lang w:eastAsia="en-GB"/>
-        </w:rPr>
-      </w:pPr>
-      <w:r>
-        <w:rPr>
-          <w:lang w:eastAsia="en-GB"/>
-        </w:rPr>
-        <w:t xml:space="preserve">The </w:t>
-      </w:r>
-      <w:r>
-        <w:rPr>
-          <w:lang w:eastAsia="en-GB"/>
-        </w:rPr>
-        <w:t xml:space="preserve">transect functionality </w:t>
-      </w:r>
-      <w:r>
-        <w:rPr>
-          <w:lang w:eastAsia="en-GB"/>
-        </w:rPr>
-        <w:t xml:space="preserve">logic is </w:t>
-      </w:r>
-      <w:r>
-        <w:rPr>
-          <w:lang w:eastAsia="en-GB"/>
-        </w:rPr>
-        <w:t xml:space="preserve">still in prototype stage and is rather </w:t>
-      </w:r>
-      <w:r>
-        <w:rPr>
-          <w:lang w:eastAsia="en-GB"/>
-        </w:rPr>
-        <w:t xml:space="preserve">unpolished. </w:t>
-      </w:r>
-      <w:r>
-        <w:rPr>
-          <w:lang w:eastAsia="en-GB"/>
-        </w:rPr>
-        <w:t>A range pf new features can be foreseen:</w:t>
+        <w:t>Transects</w:t>
+      </w:r>
+    </w:p>
+    <w:p>
+      <w:pPr>
+        <w:pStyle w:val="ListParagraph"/>
+        <w:numPr>
+          <w:ilvl w:val="0"/>
+          <w:numId w:val="4"/>
+        </w:numPr>
+        <w:rPr>
+          <w:lang w:eastAsia="en-GB"/>
+        </w:rPr>
+      </w:pPr>
+      <w:r>
+        <w:rPr>
+          <w:lang w:eastAsia="en-GB"/>
+        </w:rPr>
+        <w:t xml:space="preserve">A transect is defined at by coordinates (lon, lat). The cells of the transect are determined from the centroid of the cell where the transect starts to the centroid of the cell where the transect ends. </w:t>
+      </w:r>
+      <w:r>
+        <w:rPr>
+          <w:lang w:eastAsia="en-GB"/>
+        </w:rPr>
+        <w:t xml:space="preserve">The intersecting cells logic </w:t>
+      </w:r>
+      <w:bookmarkStart w:id="0" w:name="_GoBack"/>
+      <w:bookmarkEnd w:id="0"/>
+      <w:r>
+        <w:rPr>
+          <w:lang w:eastAsia="en-GB"/>
+        </w:rPr>
+        <w:t>can be refined to use the true start and end location of the transect.</w:t>
+      </w:r>
+    </w:p>
+    <w:p>
+      <w:pPr>
+        <w:pStyle w:val="Heading3"/>
+        <w:rPr>
+          <w:lang w:eastAsia="en-GB"/>
+        </w:rPr>
+      </w:pPr>
+      <w:r>
+        <w:rPr>
+          <w:lang w:eastAsia="en-GB"/>
+        </w:rPr>
+        <w:t>T</w:t>
+      </w:r>
+      <w:r>
+        <w:rPr>
+          <w:lang w:eastAsia="en-GB"/>
+        </w:rPr>
+        <w:t>ransect inp</w:t>
+      </w:r>
+      <w:r>
+        <w:rPr>
+          <w:lang w:eastAsia="en-GB"/>
+        </w:rPr>
+        <w:t xml:space="preserve">ut form </w:t>
       </w:r>
     </w:p>
     <w:p>
@@ -870,7 +970,19 @@
         <w:rPr>
           <w:lang w:eastAsia="en-GB"/>
         </w:rPr>
-        <w:t xml:space="preserve">The transect input form could use improvements: transects cannot be renamed, and transect points cannot be edited by entering the start and end coordinates. </w:t>
+        <w:t xml:space="preserve">Possibility to rename </w:t>
+      </w:r>
+      <w:r>
+        <w:rPr>
+          <w:lang w:eastAsia="en-GB"/>
+        </w:rPr>
+        <w:t>transects</w:t>
+      </w:r>
+      <w:r>
+        <w:rPr>
+          <w:lang w:eastAsia="en-GB"/>
+        </w:rPr>
+        <w:t>;</w:t>
       </w:r>
     </w:p>
     <w:p>
@@ -888,7 +1000,45 @@
         <w:rPr>
           <w:lang w:eastAsia="en-GB"/>
         </w:rPr>
-        <w:t>The transect summary pages could do with some changes too. The animation speed in the transect summary form cannot be altered. Perhaps information is not grouped well; it might be more useful if one variable is across all transects, instead of displaying all variables for a single transect. Last, perhaps the Ecospace result graphs could benefit from showing and hiding data for selected functional groups.</w:t>
+        <w:t>Possibility</w:t>
+      </w:r>
+      <w:r>
+        <w:rPr>
+          <w:lang w:eastAsia="en-GB"/>
+        </w:rPr>
+        <w:t xml:space="preserve"> to set the start and end locations of transects by </w:t>
+      </w:r>
+      <w:r>
+        <w:rPr>
+          <w:lang w:eastAsia="en-GB"/>
+        </w:rPr>
+        <w:t xml:space="preserve">entering </w:t>
+      </w:r>
+      <w:r>
+        <w:rPr>
+          <w:lang w:eastAsia="en-GB"/>
+        </w:rPr>
+        <w:t>these positions in a dedicated user interface</w:t>
+      </w:r>
+      <w:r>
+        <w:rPr>
+          <w:lang w:eastAsia="en-GB"/>
+        </w:rPr>
+        <w:t xml:space="preserve">. </w:t>
+      </w:r>
+    </w:p>
+    <w:p>
+      <w:pPr>
+        <w:pStyle w:val="Heading3"/>
+        <w:rPr>
+          <w:lang w:eastAsia="en-GB"/>
+        </w:rPr>
+      </w:pPr>
+      <w:r>
+        <w:rPr>
+          <w:lang w:eastAsia="en-GB"/>
+        </w:rPr>
+        <w:t>Transect summary form</w:t>
       </w:r>
     </w:p>
     <w:p>
@@ -906,20 +1056,208 @@
         <w:rPr>
           <w:lang w:eastAsia="en-GB"/>
         </w:rPr>
-        <w:t>The transect CSV file provides transect summaries for every group and every Ecospace time step. It might be practical if also annual averages CSV files would be produced, as well as transect averages per time step.</w:t>
-      </w:r>
-    </w:p>
-    <w:p>
-      <w:pPr>
-        <w:rPr>
-          <w:lang w:eastAsia="en-GB"/>
-        </w:rPr>
-      </w:pPr>
-      <w:r>
-        <w:rPr>
-          <w:lang w:eastAsia="en-GB"/>
-        </w:rPr>
-        <w:t>Before implementing additional features, it is suggested that the transects logic should be used by a range of EwE modellers to gather feedback on current functionality. This feedback will help identifying shortcomings in the current user interface, and will be used to prioritize future development efforts.</w:t>
+        <w:t>Possibility</w:t>
+      </w:r>
+      <w:r>
+        <w:rPr>
+          <w:lang w:eastAsia="en-GB"/>
+        </w:rPr>
+        <w:t xml:space="preserve"> to change the animation speed;</w:t>
+      </w:r>
+    </w:p>
+    <w:p>
+      <w:pPr>
+        <w:pStyle w:val="ListParagraph"/>
+        <w:numPr>
+          <w:ilvl w:val="0"/>
+          <w:numId w:val="2"/>
+        </w:numPr>
+        <w:rPr>
+          <w:lang w:eastAsia="en-GB"/>
+        </w:rPr>
+      </w:pPr>
+      <w:r>
+        <w:rPr>
+          <w:lang w:eastAsia="en-GB"/>
+        </w:rPr>
+        <w:t>Possibility</w:t>
+      </w:r>
+      <w:r>
+        <w:rPr>
+          <w:lang w:eastAsia="en-GB"/>
+        </w:rPr>
+        <w:t xml:space="preserve"> to select the time step to show;</w:t>
+      </w:r>
+    </w:p>
+    <w:p>
+      <w:pPr>
+        <w:pStyle w:val="ListParagraph"/>
+        <w:numPr>
+          <w:ilvl w:val="0"/>
+          <w:numId w:val="2"/>
+        </w:numPr>
+        <w:rPr>
+          <w:lang w:eastAsia="en-GB"/>
+        </w:rPr>
+      </w:pPr>
+      <w:r>
+        <w:rPr>
+          <w:lang w:eastAsia="en-GB"/>
+        </w:rPr>
+        <w:t>Possibility</w:t>
+      </w:r>
+      <w:r>
+        <w:rPr>
+          <w:lang w:eastAsia="en-GB"/>
+        </w:rPr>
+        <w:t xml:space="preserve"> to decide which data is shown in the plots: show or hide plots, add mode variables;</w:t>
+      </w:r>
+    </w:p>
+    <w:p>
+      <w:pPr>
+        <w:pStyle w:val="ListParagraph"/>
+        <w:numPr>
+          <w:ilvl w:val="0"/>
+          <w:numId w:val="2"/>
+        </w:numPr>
+        <w:rPr>
+          <w:lang w:eastAsia="en-GB"/>
+        </w:rPr>
+      </w:pPr>
+      <w:r>
+        <w:rPr>
+          <w:lang w:eastAsia="en-GB"/>
+        </w:rPr>
+        <w:t xml:space="preserve">The plots now show all available variables, in separate plots, for a single transect. Perhaps </w:t>
+      </w:r>
+      <w:r>
+        <w:rPr>
+          <w:lang w:eastAsia="en-GB"/>
+        </w:rPr>
+        <w:t xml:space="preserve">it might be more useful </w:t>
+      </w:r>
+      <w:r>
+        <w:rPr>
+          <w:lang w:eastAsia="en-GB"/>
+        </w:rPr>
+        <w:t xml:space="preserve">to show the same variable </w:t>
+      </w:r>
+      <w:r>
+        <w:rPr>
+          <w:lang w:eastAsia="en-GB"/>
+        </w:rPr>
+        <w:t xml:space="preserve">across all transects, </w:t>
+      </w:r>
+      <w:r>
+        <w:rPr>
+          <w:lang w:eastAsia="en-GB"/>
+        </w:rPr>
+        <w:t>one plot per transect;</w:t>
+      </w:r>
+    </w:p>
+    <w:p>
+      <w:pPr>
+        <w:pStyle w:val="ListParagraph"/>
+        <w:numPr>
+          <w:ilvl w:val="0"/>
+          <w:numId w:val="2"/>
+        </w:numPr>
+        <w:rPr>
+          <w:lang w:eastAsia="en-GB"/>
+        </w:rPr>
+      </w:pPr>
+      <w:r>
+        <w:rPr>
+          <w:lang w:eastAsia="en-GB"/>
+        </w:rPr>
+        <w:t xml:space="preserve">Possibility to show or hide </w:t>
+      </w:r>
+      <w:r>
+        <w:rPr>
+          <w:lang w:eastAsia="en-GB"/>
+        </w:rPr>
+        <w:t>functional groups.</w:t>
+      </w:r>
+    </w:p>
+    <w:p>
+      <w:pPr>
+        <w:pStyle w:val="Heading3"/>
+        <w:rPr>
+          <w:lang w:eastAsia="en-GB"/>
+        </w:rPr>
+      </w:pPr>
+      <w:r>
+        <w:rPr>
+          <w:lang w:eastAsia="en-GB"/>
+        </w:rPr>
+        <w:t>CSV file format</w:t>
+      </w:r>
+    </w:p>
+    <w:p>
+      <w:pPr>
+        <w:pStyle w:val="ListParagraph"/>
+        <w:numPr>
+          <w:ilvl w:val="0"/>
+          <w:numId w:val="2"/>
+        </w:numPr>
+        <w:rPr>
+          <w:lang w:eastAsia="en-GB"/>
+        </w:rPr>
+      </w:pPr>
+      <w:r>
+        <w:rPr>
+          <w:lang w:eastAsia="en-GB"/>
+        </w:rPr>
+        <w:t>Add transect annual averages</w:t>
+      </w:r>
+      <w:r>
+        <w:rPr>
+          <w:lang w:eastAsia="en-GB"/>
+        </w:rPr>
+        <w:t xml:space="preserve"> CSV files</w:t>
+      </w:r>
+      <w:r>
+        <w:rPr>
+          <w:lang w:eastAsia="en-GB"/>
+        </w:rPr>
+        <w:t>;</w:t>
+      </w:r>
+    </w:p>
+    <w:p>
+      <w:pPr>
+        <w:pStyle w:val="ListParagraph"/>
+        <w:numPr>
+          <w:ilvl w:val="0"/>
+          <w:numId w:val="2"/>
+        </w:numPr>
+        <w:rPr>
+          <w:lang w:eastAsia="en-GB"/>
+        </w:rPr>
+      </w:pPr>
+      <w:r>
+        <w:rPr>
+          <w:lang w:eastAsia="en-GB"/>
+        </w:rPr>
+        <w:lastRenderedPageBreak/>
+        <w:t>Add</w:t>
+      </w:r>
+      <w:r>
+        <w:rPr>
+          <w:lang w:eastAsia="en-GB"/>
+        </w:rPr>
+        <w:t xml:space="preserve"> </w:t>
+      </w:r>
+      <w:r>
+        <w:rPr>
+          <w:lang w:eastAsia="en-GB"/>
+        </w:rPr>
+        <w:t xml:space="preserve">transect averages per </w:t>
+      </w:r>
+      <w:r>
+        <w:rPr>
+          <w:lang w:eastAsia="en-GB"/>
+        </w:rPr>
+        <w:t>time step.</w:t>
       </w:r>
     </w:p>
     <w:p>
@@ -963,6 +1301,34 @@
           <w:lang w:eastAsia="en-GB"/>
         </w:rPr>
       </w:pPr>
+      <w:r>
+        <w:rPr>
+          <w:lang w:eastAsia="en-GB"/>
+        </w:rPr>
+        <w:br w:type="page"/>
+      </w:r>
+    </w:p>
+    <w:p>
+      <w:pPr>
+        <w:pStyle w:val="Heading1"/>
+        <w:rPr>
+          <w:lang w:eastAsia="en-GB"/>
+        </w:rPr>
+      </w:pPr>
+      <w:r>
+        <w:rPr>
+          <w:lang w:eastAsia="en-GB"/>
+        </w:rPr>
+        <w:lastRenderedPageBreak/>
+        <w:t>Figures</w:t>
+      </w:r>
+    </w:p>
+    <w:p>
+      <w:pPr>
+        <w:rPr>
+          <w:lang w:eastAsia="en-GB"/>
+        </w:rPr>
+      </w:pPr>
     </w:p>
     <w:p>
       <w:pPr>
@@ -973,7 +1339,6 @@
           <w:noProof/>
           <w:lang w:eastAsia="en-GB"/>
         </w:rPr>
-        <w:lastRenderedPageBreak/>
         <w:drawing>
           <wp:inline distT="0" distB="0" distL="0" distR="0" wp14:anchorId="33DA6A4C" wp14:editId="5D2CC66A">
             <wp:extent cx="4942800" cy="3675600"/>
@@ -1025,24 +1390,14 @@
       <w:r>
         <w:t xml:space="preserve">Figure </w:t>
       </w:r>
-      <w:r>
-        <w:fldChar w:fldCharType="begin"/>
-      </w:r>
-      <w:r>
-        <w:instrText xml:space="preserve"> SEQ Figure \* ARABIC </w:instrText>
-      </w:r>
-      <w:r>
-        <w:fldChar w:fldCharType="separate"/>
-      </w:r>
-      <w:r>
-        <w:rPr>
-          <w:noProof/>
-        </w:rPr>
-        <w:t>1</w:t>
-      </w:r>
-      <w:r>
-        <w:fldChar w:fldCharType="end"/>
-      </w:r>
+      <w:fldSimple w:instr=" SEQ Figure \* ARABIC ">
+        <w:r>
+          <w:rPr>
+            <w:noProof/>
+          </w:rPr>
+          <w:t>1</w:t>
+        </w:r>
+      </w:fldSimple>
       <w:bookmarkEnd w:id="2"/>
       <w:r>
         <w:t xml:space="preserve"> – Transects input screen, where transects</w:t>
@@ -1134,24 +1489,14 @@
       <w:r>
         <w:t xml:space="preserve">Figure </w:t>
       </w:r>
-      <w:r>
-        <w:fldChar w:fldCharType="begin"/>
-      </w:r>
-      <w:r>
-        <w:instrText xml:space="preserve"> SEQ Figure \* ARABIC </w:instrText>
-      </w:r>
-      <w:r>
-        <w:fldChar w:fldCharType="separate"/>
-      </w:r>
-      <w:r>
-        <w:rPr>
-          <w:noProof/>
-        </w:rPr>
-        <w:t>2</w:t>
-      </w:r>
-      <w:r>
-        <w:fldChar w:fldCharType="end"/>
-      </w:r>
+      <w:fldSimple w:instr=" SEQ Figure \* ARABIC ">
+        <w:r>
+          <w:rPr>
+            <w:noProof/>
+          </w:rPr>
+          <w:t>2</w:t>
+        </w:r>
+      </w:fldSimple>
       <w:bookmarkEnd w:id="3"/>
       <w:r>
         <w:t xml:space="preserve"> - The transect </w:t>
@@ -1234,24 +1579,14 @@
       <w:r>
         <w:t xml:space="preserve">Figure </w:t>
       </w:r>
-      <w:r>
-        <w:fldChar w:fldCharType="begin"/>
-      </w:r>
-      <w:r>
-        <w:instrText xml:space="preserve"> SEQ Figure \* ARABIC </w:instrText>
-      </w:r>
-      <w:r>
-        <w:fldChar w:fldCharType="separate"/>
-      </w:r>
-      <w:r>
-        <w:rPr>
-          <w:noProof/>
-        </w:rPr>
-        <w:t>3</w:t>
-      </w:r>
-      <w:r>
-        <w:fldChar w:fldCharType="end"/>
-      </w:r>
+      <w:fldSimple w:instr=" SEQ Figure \* ARABIC ">
+        <w:r>
+          <w:rPr>
+            <w:noProof/>
+          </w:rPr>
+          <w:t>3</w:t>
+        </w:r>
+      </w:fldSimple>
       <w:bookmarkEnd w:id="4"/>
       <w:r>
         <w:t xml:space="preserve"> - Transect summary screen after running Ecospace. Note that transect 2 crosses the one and only MPA and a few land cells. Biomass and Catch are unavailable for land cells. Catch is 0 within the MPA. Also note that the animation controls and the Save to CSV options are available once Ecospace has executed.</w:t>
@@ -1318,24 +1653,14 @@
       <w:r>
         <w:t xml:space="preserve">Figure </w:t>
       </w:r>
-      <w:r>
-        <w:fldChar w:fldCharType="begin"/>
-      </w:r>
-      <w:r>
-        <w:instrText xml:space="preserve"> SEQ Figure \* ARABIC </w:instrText>
-      </w:r>
-      <w:r>
-        <w:fldChar w:fldCharType="separate"/>
-      </w:r>
-      <w:r>
-        <w:rPr>
-          <w:noProof/>
-        </w:rPr>
-        <w:t>4</w:t>
-      </w:r>
-      <w:r>
-        <w:fldChar w:fldCharType="end"/>
-      </w:r>
+      <w:fldSimple w:instr=" SEQ Figure \* ARABIC ">
+        <w:r>
+          <w:rPr>
+            <w:noProof/>
+          </w:rPr>
+          <w:t>4</w:t>
+        </w:r>
+      </w:fldSimple>
       <w:bookmarkEnd w:id="5"/>
       <w:r>
         <w:t xml:space="preserve"> </w:t>
@@ -1507,6 +1832,119 @@
     </w:lvl>
   </w:abstractNum>
   <w:abstractNum w:abstractNumId="1" w15:restartNumberingAfterBreak="0">
+    <w:nsid w:val="16BE2D4A"/>
+    <w:multiLevelType w:val="hybridMultilevel"/>
+    <w:tmpl w:val="6EF2CDF4"/>
+    <w:lvl w:ilvl="0" w:tplc="08090001">
+      <w:start w:val="1"/>
+      <w:numFmt w:val="bullet"/>
+      <w:lvlText w:val=""/>
+      <w:lvlJc w:val="left"/>
+      <w:pPr>
+        <w:ind w:left="720" w:hanging="360"/>
+      </w:pPr>
+      <w:rPr>
+        <w:rFonts w:ascii="Symbol" w:hAnsi="Symbol" w:hint="default"/>
+      </w:rPr>
+    </w:lvl>
+    <w:lvl w:ilvl="1" w:tplc="08090003" w:tentative="1">
+      <w:start w:val="1"/>
+      <w:numFmt w:val="bullet"/>
+      <w:lvlText w:val="o"/>
+      <w:lvlJc w:val="left"/>
+      <w:pPr>
+        <w:ind w:left="1440" w:hanging="360"/>
+      </w:pPr>
+      <w:rPr>
+        <w:rFonts w:ascii="Courier New" w:hAnsi="Courier New" w:cs="Courier New" w:hint="default"/>
+      </w:rPr>
+    </w:lvl>
+    <w:lvl w:ilvl="2" w:tplc="08090005" w:tentative="1">
+      <w:start w:val="1"/>
+      <w:numFmt w:val="bullet"/>
+      <w:lvlText w:val=""/>
+      <w:lvlJc w:val="left"/>
+      <w:pPr>
+        <w:ind w:left="2160" w:hanging="360"/>
+      </w:pPr>
+      <w:rPr>
+        <w:rFonts w:ascii="Wingdings" w:hAnsi="Wingdings" w:hint="default"/>
+      </w:rPr>
+    </w:lvl>
+    <w:lvl w:ilvl="3" w:tplc="08090001" w:tentative="1">
+      <w:start w:val="1"/>
+      <w:numFmt w:val="bullet"/>
+      <w:lvlText w:val=""/>
+      <w:lvlJc w:val="left"/>
+      <w:pPr>
+        <w:ind w:left="2880" w:hanging="360"/>
+      </w:pPr>
+      <w:rPr>
+        <w:rFonts w:ascii="Symbol" w:hAnsi="Symbol" w:hint="default"/>
+      </w:rPr>
+    </w:lvl>
+    <w:lvl w:ilvl="4" w:tplc="08090003" w:tentative="1">
+      <w:start w:val="1"/>
+      <w:numFmt w:val="bullet"/>
+      <w:lvlText w:val="o"/>
+      <w:lvlJc w:val="left"/>
+      <w:pPr>
+        <w:ind w:left="3600" w:hanging="360"/>
+      </w:pPr>
+      <w:rPr>
+        <w:rFonts w:ascii="Courier New" w:hAnsi="Courier New" w:cs="Courier New" w:hint="default"/>
+      </w:rPr>
+    </w:lvl>
+    <w:lvl w:ilvl="5" w:tplc="08090005" w:tentative="1">
+      <w:start w:val="1"/>
+      <w:numFmt w:val="bullet"/>
+      <w:lvlText w:val=""/>
+      <w:lvlJc w:val="left"/>
+      <w:pPr>
+        <w:ind w:left="4320" w:hanging="360"/>
+      </w:pPr>
+      <w:rPr>
+        <w:rFonts w:ascii="Wingdings" w:hAnsi="Wingdings" w:hint="default"/>
+      </w:rPr>
+    </w:lvl>
+    <w:lvl w:ilvl="6" w:tplc="08090001" w:tentative="1">
+      <w:start w:val="1"/>
+      <w:numFmt w:val="bullet"/>
+      <w:lvlText w:val=""/>
+      <w:lvlJc w:val="left"/>
+      <w:pPr>
+        <w:ind w:left="5040" w:hanging="360"/>
+      </w:pPr>
+      <w:rPr>
+        <w:rFonts w:ascii="Symbol" w:hAnsi="Symbol" w:hint="default"/>
+      </w:rPr>
+    </w:lvl>
+    <w:lvl w:ilvl="7" w:tplc="08090003" w:tentative="1">
+      <w:start w:val="1"/>
+      <w:numFmt w:val="bullet"/>
+      <w:lvlText w:val="o"/>
+      <w:lvlJc w:val="left"/>
+      <w:pPr>
+        <w:ind w:left="5760" w:hanging="360"/>
+      </w:pPr>
+      <w:rPr>
+        <w:rFonts w:ascii="Courier New" w:hAnsi="Courier New" w:cs="Courier New" w:hint="default"/>
+      </w:rPr>
+    </w:lvl>
+    <w:lvl w:ilvl="8" w:tplc="08090005" w:tentative="1">
+      <w:start w:val="1"/>
+      <w:numFmt w:val="bullet"/>
+      <w:lvlText w:val=""/>
+      <w:lvlJc w:val="left"/>
+      <w:pPr>
+        <w:ind w:left="6480" w:hanging="360"/>
+      </w:pPr>
+      <w:rPr>
+        <w:rFonts w:ascii="Wingdings" w:hAnsi="Wingdings" w:hint="default"/>
+      </w:rPr>
+    </w:lvl>
+  </w:abstractNum>
+  <w:abstractNum w:abstractNumId="2" w15:restartNumberingAfterBreak="0">
     <w:nsid w:val="2FA04E2F"/>
     <w:multiLevelType w:val="hybridMultilevel"/>
     <w:tmpl w:val="41D27D22"/>
@@ -1619,7 +2057,7 @@
       </w:rPr>
     </w:lvl>
   </w:abstractNum>
-  <w:abstractNum w:abstractNumId="2" w15:restartNumberingAfterBreak="0">
+  <w:abstractNum w:abstractNumId="3" w15:restartNumberingAfterBreak="0">
     <w:nsid w:val="40D02130"/>
     <w:multiLevelType w:val="hybridMultilevel"/>
     <w:tmpl w:val="185CC99E"/>
@@ -1733,13 +2171,16 @@
     </w:lvl>
   </w:abstractNum>
   <w:num w:numId="1">
-    <w:abstractNumId w:val="2"/>
+    <w:abstractNumId w:val="3"/>
   </w:num>
   <w:num w:numId="2">
-    <w:abstractNumId w:val="1"/>
+    <w:abstractNumId w:val="2"/>
   </w:num>
   <w:num w:numId="3">
     <w:abstractNumId w:val="0"/>
+  </w:num>
+  <w:num w:numId="4">
+    <w:abstractNumId w:val="1"/>
   </w:num>
 </w:numbering>
 </file>
@@ -2709,7 +3150,7 @@
 </file>
 
 <file path=customXml/itemProps1.xml><?xml version="1.0" encoding="utf-8"?>
-<ds:datastoreItem xmlns:ds="http://schemas.openxmlformats.org/officeDocument/2006/customXml" ds:itemID="{6C7EE6DB-13D0-4172-A44B-F7BA5C488274}">
+<ds:datastoreItem xmlns:ds="http://schemas.openxmlformats.org/officeDocument/2006/customXml" ds:itemID="{58085699-733E-4245-8362-EA8294DFDDA2}">
   <ds:schemaRefs>
     <ds:schemaRef ds:uri="http://schemas.openxmlformats.org/officeDocument/2006/bibliography"/>
   </ds:schemaRefs>

</xml_diff>

<commit_message>
Fixed class names, plug-in names Added datasource plug-in, for now just to clear transects when closing Ecospace
git-svn-id: https://sources.ecopath.org/svn/Ecopath/trunk/Ecopath6@14641 a725721c-0ed6-864e-a6a8-02c2a1988c9d
</commit_message>
<xml_diff>
--- a/Sources Internal/Plugins/EwETransectExtractionPlugin/Documentation/Transects.docx
+++ b/Sources Internal/Plugins/EwETransectExtractionPlugin/Documentation/Transects.docx
@@ -28,14 +28,118 @@
         <w:rPr>
           <w:lang w:eastAsia="en-GB"/>
         </w:rPr>
-        <w:t>Author: Jeroen Steenbeek (EII)</w:t>
+        <w:t>Author: Jeroe</w:t>
+      </w:r>
+      <w:r>
+        <w:rPr>
+          <w:lang w:eastAsia="en-GB"/>
+        </w:rPr>
+        <w:t>n Steenbeek (EII)</w:t>
       </w:r>
       <w:r>
         <w:rPr>
           <w:lang w:eastAsia="en-GB"/>
         </w:rPr>
         <w:br/>
-        <w:t>Version 1.0, , 26 April 2017</w:t>
+        <w:t>Version 1.0,</w:t>
+      </w:r>
+      <w:r>
+        <w:rPr>
+          <w:lang w:eastAsia="en-GB"/>
+        </w:rPr>
+        <w:t xml:space="preserve"> 26 April 2017</w:t>
+      </w:r>
+    </w:p>
+    <w:p>
+      <w:pPr>
+        <w:pStyle w:val="Heading1"/>
+        <w:rPr>
+          <w:lang w:eastAsia="en-GB"/>
+        </w:rPr>
+      </w:pPr>
+      <w:r>
+        <w:rPr>
+          <w:lang w:eastAsia="en-GB"/>
+        </w:rPr>
+        <w:t>Scope</w:t>
+      </w:r>
+    </w:p>
+    <w:p>
+      <w:pPr>
+        <w:rPr>
+          <w:lang w:eastAsia="en-GB"/>
+        </w:rPr>
+      </w:pPr>
+      <w:r>
+        <w:rPr>
+          <w:lang w:eastAsia="en-GB"/>
+        </w:rPr>
+        <w:t xml:space="preserve">Transects, like regions, are a mechanism to extract results for selected map cells from Ecospace. Where regions provide area averages for a cluster of cells, transects retain the actual cell values which can be </w:t>
+      </w:r>
+      <w:r>
+        <w:rPr>
+          <w:lang w:eastAsia="en-GB"/>
+        </w:rPr>
+        <w:t xml:space="preserve">plotted </w:t>
+      </w:r>
+      <w:r>
+        <w:rPr>
+          <w:lang w:eastAsia="en-GB"/>
+        </w:rPr>
+        <w:t>on screen, and can be written to file.</w:t>
+      </w:r>
+    </w:p>
+    <w:p>
+      <w:pPr>
+        <w:pStyle w:val="Heading1"/>
+        <w:rPr>
+          <w:lang w:eastAsia="en-GB"/>
+        </w:rPr>
+      </w:pPr>
+      <w:r>
+        <w:rPr>
+          <w:lang w:eastAsia="en-GB"/>
+        </w:rPr>
+        <w:t>Requirements</w:t>
+      </w:r>
+    </w:p>
+    <w:p>
+      <w:pPr>
+        <w:rPr>
+          <w:lang w:eastAsia="en-GB"/>
+        </w:rPr>
+      </w:pPr>
+      <w:r>
+        <w:rPr>
+          <w:lang w:eastAsia="en-GB"/>
+        </w:rPr>
+        <w:t xml:space="preserve">The </w:t>
+      </w:r>
+      <w:r>
+        <w:rPr>
+          <w:lang w:eastAsia="en-GB"/>
+        </w:rPr>
+        <w:t>EwETransectExtractionPlugin</w:t>
+      </w:r>
+      <w:r>
+        <w:rPr>
+          <w:lang w:eastAsia="en-GB"/>
+        </w:rPr>
+        <w:t xml:space="preserve"> is needed to use the transect logic.</w:t>
+      </w:r>
+    </w:p>
+    <w:p>
+      <w:pPr>
+        <w:pStyle w:val="Heading1"/>
+        <w:rPr>
+          <w:lang w:eastAsia="en-GB"/>
+        </w:rPr>
+      </w:pPr>
+      <w:r>
+        <w:rPr>
+          <w:lang w:eastAsia="en-GB"/>
+        </w:rPr>
+        <w:t>Usage</w:t>
       </w:r>
     </w:p>
     <w:p>
@@ -49,32 +153,236 @@
         <w:rPr>
           <w:lang w:eastAsia="en-GB"/>
         </w:rPr>
-        <w:t>Scope</w:t>
-      </w:r>
-    </w:p>
-    <w:p>
-      <w:pPr>
-        <w:rPr>
-          <w:lang w:eastAsia="en-GB"/>
-        </w:rPr>
-      </w:pPr>
-      <w:r>
-        <w:rPr>
-          <w:lang w:eastAsia="en-GB"/>
-        </w:rPr>
-        <w:t xml:space="preserve">Transects, like regions, are a mechanism to extract results for selected map cells from Ecospace. Where regions provide area averages for a cluster of cells, transects retain the actual cell values which can be </w:t>
-      </w:r>
-      <w:r>
-        <w:rPr>
-          <w:lang w:eastAsia="en-GB"/>
-        </w:rPr>
-        <w:t xml:space="preserve">plotted </w:t>
-      </w:r>
-      <w:r>
-        <w:rPr>
-          <w:lang w:eastAsia="en-GB"/>
-        </w:rPr>
-        <w:t>on screen, and can be written to file.</w:t>
+        <w:t>Define transects</w:t>
+      </w:r>
+    </w:p>
+    <w:p>
+      <w:pPr>
+        <w:rPr>
+          <w:lang w:eastAsia="en-GB"/>
+        </w:rPr>
+      </w:pPr>
+      <w:r>
+        <w:rPr>
+          <w:lang w:eastAsia="en-GB"/>
+        </w:rPr>
+        <w:t xml:space="preserve">Transects are defined in the </w:t>
+      </w:r>
+      <w:r>
+        <w:rPr>
+          <w:lang w:eastAsia="en-GB"/>
+        </w:rPr>
+        <w:t>Ecospace input form (Navigator &gt; Ecospace &gt; Input &gt; Transects</w:t>
+      </w:r>
+      <w:r>
+        <w:rPr>
+          <w:lang w:eastAsia="en-GB"/>
+        </w:rPr>
+        <w:t>;</w:t>
+      </w:r>
+      <w:r>
+        <w:rPr>
+          <w:lang w:eastAsia="en-GB"/>
+        </w:rPr>
+        <w:t xml:space="preserve"> </w:t>
+      </w:r>
+      <w:r>
+        <w:rPr>
+          <w:lang w:eastAsia="en-GB"/>
+        </w:rPr>
+        <w:fldChar w:fldCharType="begin"/>
+      </w:r>
+      <w:r>
+        <w:rPr>
+          <w:lang w:eastAsia="en-GB"/>
+        </w:rPr>
+        <w:instrText xml:space="preserve"> REF _Ref480965781 \h </w:instrText>
+      </w:r>
+      <w:r>
+        <w:rPr>
+          <w:lang w:eastAsia="en-GB"/>
+        </w:rPr>
+      </w:r>
+      <w:r>
+        <w:rPr>
+          <w:lang w:eastAsia="en-GB"/>
+        </w:rPr>
+        <w:fldChar w:fldCharType="separate"/>
+      </w:r>
+      <w:r>
+        <w:t xml:space="preserve">Figure </w:t>
+      </w:r>
+      <w:r>
+        <w:rPr>
+          <w:noProof/>
+        </w:rPr>
+        <w:t>1</w:t>
+      </w:r>
+      <w:r>
+        <w:rPr>
+          <w:lang w:eastAsia="en-GB"/>
+        </w:rPr>
+        <w:fldChar w:fldCharType="end"/>
+      </w:r>
+      <w:r>
+        <w:rPr>
+          <w:lang w:eastAsia="en-GB"/>
+        </w:rPr>
+        <w:t>)</w:t>
+      </w:r>
+      <w:r>
+        <w:rPr>
+          <w:lang w:eastAsia="en-GB"/>
+        </w:rPr>
+        <w:t>. A transect is created by clicking on the map</w:t>
+      </w:r>
+      <w:r>
+        <w:rPr>
+          <w:lang w:eastAsia="en-GB"/>
+        </w:rPr>
+        <w:t xml:space="preserve"> which sets the start location of a new transect</w:t>
+      </w:r>
+      <w:r>
+        <w:rPr>
+          <w:lang w:eastAsia="en-GB"/>
+        </w:rPr>
+        <w:t xml:space="preserve">, and </w:t>
+      </w:r>
+      <w:r>
+        <w:rPr>
+          <w:lang w:eastAsia="en-GB"/>
+        </w:rPr>
+        <w:t xml:space="preserve">moving the mouse while keeping the left mouse button down to </w:t>
+      </w:r>
+      <w:r>
+        <w:rPr>
+          <w:lang w:eastAsia="en-GB"/>
+        </w:rPr>
+        <w:t xml:space="preserve">draw </w:t>
+      </w:r>
+      <w:r>
+        <w:rPr>
+          <w:lang w:eastAsia="en-GB"/>
+        </w:rPr>
+        <w:t xml:space="preserve">the end location of the transect. </w:t>
+      </w:r>
+      <w:r>
+        <w:rPr>
+          <w:lang w:eastAsia="en-GB"/>
+        </w:rPr>
+        <w:t>Release the left mouse button to finish the transect.</w:t>
+      </w:r>
+    </w:p>
+    <w:p>
+      <w:pPr>
+        <w:rPr>
+          <w:lang w:eastAsia="en-GB"/>
+        </w:rPr>
+      </w:pPr>
+      <w:r>
+        <w:rPr>
+          <w:lang w:eastAsia="en-GB"/>
+        </w:rPr>
+        <w:t xml:space="preserve">Transect </w:t>
+      </w:r>
+      <w:r>
+        <w:rPr>
+          <w:lang w:eastAsia="en-GB"/>
+        </w:rPr>
+        <w:t xml:space="preserve">end points </w:t>
+      </w:r>
+      <w:r>
+        <w:rPr>
+          <w:lang w:eastAsia="en-GB"/>
+        </w:rPr>
+        <w:t>can be clicked and dragged, and the entire transect line can be clicked and dragged as well.</w:t>
+      </w:r>
+    </w:p>
+    <w:p>
+      <w:pPr>
+        <w:rPr>
+          <w:lang w:eastAsia="en-GB"/>
+        </w:rPr>
+      </w:pPr>
+      <w:r>
+        <w:rPr>
+          <w:lang w:eastAsia="en-GB"/>
+        </w:rPr>
+        <w:t>The selected transect is drawn using the EwE system colour ‘highlight’ (orange by default), and the cells that the transect crosses are drawn as well. Non-selected transects are drawn using the EwE system colour ‘</w:t>
+      </w:r>
+      <w:r>
+        <w:rPr>
+          <w:lang w:eastAsia="en-GB"/>
+        </w:rPr>
+        <w:t>r</w:t>
+      </w:r>
+      <w:r>
+        <w:rPr>
+          <w:lang w:eastAsia="en-GB"/>
+        </w:rPr>
+        <w:t>ead</w:t>
+      </w:r>
+      <w:r>
+        <w:rPr>
+          <w:lang w:eastAsia="en-GB"/>
+        </w:rPr>
+        <w:t>o</w:t>
+      </w:r>
+      <w:r>
+        <w:rPr>
+          <w:lang w:eastAsia="en-GB"/>
+        </w:rPr>
+        <w:t xml:space="preserve">nly’ (bluish-grey by default). EwE system colours be changed via Menu &gt; Tools &gt; Options &gt; </w:t>
+      </w:r>
+      <w:r>
+        <w:rPr>
+          <w:lang w:eastAsia="en-GB"/>
+        </w:rPr>
+        <w:t xml:space="preserve">Display &gt; </w:t>
+      </w:r>
+      <w:r>
+        <w:rPr>
+          <w:lang w:eastAsia="en-GB"/>
+        </w:rPr>
+        <w:t>Colours.</w:t>
+      </w:r>
+    </w:p>
+    <w:p>
+      <w:pPr>
+        <w:rPr>
+          <w:lang w:eastAsia="en-GB"/>
+        </w:rPr>
+      </w:pPr>
+      <w:r>
+        <w:rPr>
+          <w:lang w:eastAsia="en-GB"/>
+        </w:rPr>
+        <w:t xml:space="preserve">A selected </w:t>
+      </w:r>
+      <w:r>
+        <w:rPr>
+          <w:lang w:eastAsia="en-GB"/>
+        </w:rPr>
+        <w:t>transect can be deleted by pressing the [Delete transect] button</w:t>
+      </w:r>
+      <w:r>
+        <w:rPr>
+          <w:lang w:eastAsia="en-GB"/>
+        </w:rPr>
+        <w:t>.</w:t>
+      </w:r>
+    </w:p>
+    <w:p>
+      <w:pPr>
+        <w:rPr>
+          <w:lang w:eastAsia="en-GB"/>
+        </w:rPr>
+      </w:pPr>
+      <w:r>
+        <w:rPr>
+          <w:lang w:eastAsia="en-GB"/>
+        </w:rPr>
+        <w:t>Only one transect can be selected at the time.</w:t>
       </w:r>
     </w:p>
     <w:p>
@@ -88,32 +396,70 @@
         <w:rPr>
           <w:lang w:eastAsia="en-GB"/>
         </w:rPr>
-        <w:t>Requirements</w:t>
-      </w:r>
-    </w:p>
-    <w:p>
-      <w:pPr>
-        <w:rPr>
-          <w:lang w:eastAsia="en-GB"/>
-        </w:rPr>
-      </w:pPr>
-      <w:r>
-        <w:rPr>
-          <w:lang w:eastAsia="en-GB"/>
-        </w:rPr>
-        <w:t xml:space="preserve">The </w:t>
-      </w:r>
-      <w:r>
-        <w:rPr>
-          <w:lang w:eastAsia="en-GB"/>
-        </w:rPr>
-        <w:t>EwETransectExtractionPlugin</w:t>
-      </w:r>
-      <w:r>
-        <w:rPr>
-          <w:lang w:eastAsia="en-GB"/>
-        </w:rPr>
-        <w:t xml:space="preserve"> is needed to use the transect logic.</w:t>
+        <w:t>Gathering transect summaries</w:t>
+      </w:r>
+    </w:p>
+    <w:p>
+      <w:pPr>
+        <w:rPr>
+          <w:lang w:eastAsia="en-GB"/>
+        </w:rPr>
+      </w:pPr>
+      <w:r>
+        <w:rPr>
+          <w:lang w:eastAsia="en-GB"/>
+        </w:rPr>
+        <w:t>Transect summary data is collected w</w:t>
+      </w:r>
+      <w:r>
+        <w:rPr>
+          <w:lang w:eastAsia="en-GB"/>
+        </w:rPr>
+        <w:t xml:space="preserve">hen Ecospace </w:t>
+      </w:r>
+      <w:r>
+        <w:rPr>
+          <w:lang w:eastAsia="en-GB"/>
+        </w:rPr>
+        <w:t>runs.</w:t>
+      </w:r>
+      <w:r>
+        <w:rPr>
+          <w:lang w:eastAsia="en-GB"/>
+        </w:rPr>
+        <w:t xml:space="preserve"> </w:t>
+      </w:r>
+      <w:r>
+        <w:rPr>
+          <w:lang w:eastAsia="en-GB"/>
+        </w:rPr>
+        <w:t xml:space="preserve">Summary data for a transect is discarded </w:t>
+      </w:r>
+      <w:r>
+        <w:rPr>
+          <w:lang w:eastAsia="en-GB"/>
+        </w:rPr>
+        <w:t xml:space="preserve">once </w:t>
+      </w:r>
+      <w:bookmarkStart w:id="0" w:name="_GoBack"/>
+      <w:bookmarkEnd w:id="0"/>
+      <w:r>
+        <w:rPr>
+          <w:lang w:eastAsia="en-GB"/>
+        </w:rPr>
+        <w:t xml:space="preserve">a </w:t>
+      </w:r>
+      <w:r>
+        <w:rPr>
+          <w:lang w:eastAsia="en-GB"/>
+        </w:rPr>
+        <w:t xml:space="preserve">transect is </w:t>
+      </w:r>
+      <w:r>
+        <w:rPr>
+          <w:lang w:eastAsia="en-GB"/>
+        </w:rPr>
+        <w:t>repositioned.</w:t>
       </w:r>
     </w:p>
     <w:p>
@@ -127,46 +473,32 @@
         <w:rPr>
           <w:lang w:eastAsia="en-GB"/>
         </w:rPr>
-        <w:t>Usage</w:t>
-      </w:r>
-    </w:p>
-    <w:p>
-      <w:pPr>
-        <w:pStyle w:val="Heading4"/>
-        <w:rPr>
-          <w:lang w:eastAsia="en-GB"/>
-        </w:rPr>
-      </w:pPr>
-      <w:r>
-        <w:rPr>
-          <w:lang w:eastAsia="en-GB"/>
-        </w:rPr>
-        <w:t>Define transects</w:t>
-      </w:r>
-    </w:p>
-    <w:p>
-      <w:pPr>
-        <w:rPr>
-          <w:lang w:eastAsia="en-GB"/>
-        </w:rPr>
-      </w:pPr>
-      <w:r>
-        <w:rPr>
-          <w:lang w:eastAsia="en-GB"/>
-        </w:rPr>
-        <w:t xml:space="preserve">Transects are defined in the </w:t>
-      </w:r>
-      <w:r>
-        <w:rPr>
-          <w:lang w:eastAsia="en-GB"/>
-        </w:rPr>
-        <w:t>Ecospace input form (Navigator &gt; Ecospace &gt; Input &gt; Transects)</w:t>
-      </w:r>
-      <w:r>
-        <w:rPr>
-          <w:lang w:eastAsia="en-GB"/>
-        </w:rPr>
-        <w:t xml:space="preserve">, see </w:t>
+        <w:t>Viewing transect summaries</w:t>
+      </w:r>
+    </w:p>
+    <w:p>
+      <w:pPr>
+        <w:rPr>
+          <w:lang w:eastAsia="en-GB"/>
+        </w:rPr>
+      </w:pPr>
+      <w:r>
+        <w:rPr>
+          <w:lang w:eastAsia="en-GB"/>
+        </w:rPr>
+        <w:t xml:space="preserve">Transect summary data is </w:t>
+      </w:r>
+      <w:r>
+        <w:rPr>
+          <w:lang w:eastAsia="en-GB"/>
+        </w:rPr>
+        <w:t>viewed in the transect summary form (Navigator &gt; Ecospace &gt; Output &gt; Transect summary</w:t>
+      </w:r>
+      <w:r>
+        <w:rPr>
+          <w:lang w:eastAsia="en-GB"/>
+        </w:rPr>
+        <w:t xml:space="preserve">; </w:t>
       </w:r>
       <w:r>
         <w:rPr>
@@ -178,7 +510,7 @@
         <w:rPr>
           <w:lang w:eastAsia="en-GB"/>
         </w:rPr>
-        <w:instrText xml:space="preserve"> REF _Ref480965781 \h </w:instrText>
+        <w:instrText xml:space="preserve"> REF _Ref480966426 \h </w:instrText>
       </w:r>
       <w:r>
         <w:rPr>
@@ -198,7 +530,7 @@
         <w:rPr>
           <w:noProof/>
         </w:rPr>
-        <w:t>1</w:t>
+        <w:t>2</w:t>
       </w:r>
       <w:r>
         <w:rPr>
@@ -210,149 +542,25 @@
         <w:rPr>
           <w:lang w:eastAsia="en-GB"/>
         </w:rPr>
-        <w:t>. A transect is created by clicking on the map</w:t>
-      </w:r>
-      <w:r>
-        <w:rPr>
-          <w:lang w:eastAsia="en-GB"/>
-        </w:rPr>
-        <w:t xml:space="preserve"> which sets the start location of a new transect</w:t>
-      </w:r>
-      <w:r>
-        <w:rPr>
-          <w:lang w:eastAsia="en-GB"/>
-        </w:rPr>
-        <w:t xml:space="preserve">, and </w:t>
-      </w:r>
-      <w:r>
-        <w:rPr>
-          <w:lang w:eastAsia="en-GB"/>
-        </w:rPr>
-        <w:t>moving the mouse while keeping the left mouse button down to the end location of the transect. The start and end location of a transect can be clicked and dragged, and the entire transect line can be clicked and dragged as well.</w:t>
-      </w:r>
-    </w:p>
-    <w:p>
-      <w:pPr>
-        <w:rPr>
-          <w:lang w:eastAsia="en-GB"/>
-        </w:rPr>
-      </w:pPr>
-      <w:r>
-        <w:rPr>
-          <w:lang w:eastAsia="en-GB"/>
-        </w:rPr>
-        <w:t>The selected transect will be rendered in Orange, other transects are rendered in Blue. The actual raster cells of the selected transect are rendered as well.</w:t>
-      </w:r>
-    </w:p>
-    <w:p>
-      <w:pPr>
-        <w:rPr>
-          <w:lang w:eastAsia="en-GB"/>
-        </w:rPr>
-      </w:pPr>
-      <w:r>
-        <w:rPr>
-          <w:lang w:eastAsia="en-GB"/>
-        </w:rPr>
-        <w:t>The selected transect can be deleted by pressing the [Delete transect] button, which is only enabled when a transect is selected.</w:t>
-      </w:r>
-    </w:p>
-    <w:p>
-      <w:pPr>
-        <w:pStyle w:val="Heading4"/>
-        <w:rPr>
-          <w:lang w:eastAsia="en-GB"/>
-        </w:rPr>
-      </w:pPr>
-      <w:r>
-        <w:rPr>
-          <w:lang w:eastAsia="en-GB"/>
-        </w:rPr>
-        <w:t>Running Ecospace</w:t>
-      </w:r>
-    </w:p>
-    <w:p>
-      <w:pPr>
-        <w:rPr>
-          <w:lang w:eastAsia="en-GB"/>
-        </w:rPr>
-      </w:pPr>
-      <w:r>
-        <w:rPr>
-          <w:lang w:eastAsia="en-GB"/>
-        </w:rPr>
-        <w:t>When Ecospace is executed, a summary for all defined transects will be recorded automatically. These summary results can be viewed in the EwE desktop software, and can be written to disk.</w:t>
-      </w:r>
-    </w:p>
-    <w:p>
-      <w:pPr>
-        <w:pStyle w:val="Heading4"/>
-        <w:rPr>
-          <w:lang w:eastAsia="en-GB"/>
-        </w:rPr>
-      </w:pPr>
-      <w:r>
-        <w:rPr>
-          <w:lang w:eastAsia="en-GB"/>
-        </w:rPr>
-        <w:t>Viewing transect summaries</w:t>
-      </w:r>
-    </w:p>
-    <w:p>
-      <w:pPr>
-        <w:rPr>
-          <w:lang w:eastAsia="en-GB"/>
-        </w:rPr>
-      </w:pPr>
-      <w:r>
-        <w:rPr>
-          <w:lang w:eastAsia="en-GB"/>
-        </w:rPr>
-        <w:t xml:space="preserve">Transect summaries are viewed in the transect summary form (Navigator &gt; Ecospace &gt; Output &gt; Transect summary), see </w:t>
-      </w:r>
-      <w:r>
-        <w:rPr>
-          <w:lang w:eastAsia="en-GB"/>
-        </w:rPr>
-        <w:fldChar w:fldCharType="begin"/>
-      </w:r>
-      <w:r>
-        <w:rPr>
-          <w:lang w:eastAsia="en-GB"/>
-        </w:rPr>
-        <w:instrText xml:space="preserve"> REF _Ref480966426 \h </w:instrText>
-      </w:r>
-      <w:r>
-        <w:rPr>
-          <w:lang w:eastAsia="en-GB"/>
-        </w:rPr>
-      </w:r>
-      <w:r>
-        <w:rPr>
-          <w:lang w:eastAsia="en-GB"/>
-        </w:rPr>
-        <w:fldChar w:fldCharType="separate"/>
-      </w:r>
-      <w:r>
-        <w:t xml:space="preserve">Figure </w:t>
-      </w:r>
-      <w:r>
-        <w:rPr>
-          <w:noProof/>
-        </w:rPr>
-        <w:t>2</w:t>
-      </w:r>
-      <w:r>
-        <w:rPr>
-          <w:lang w:eastAsia="en-GB"/>
-        </w:rPr>
-        <w:fldChar w:fldCharType="end"/>
-      </w:r>
-      <w:r>
-        <w:rPr>
-          <w:lang w:eastAsia="en-GB"/>
-        </w:rPr>
-        <w:t>. For now, a limited number of plots is shown for a selected transect:</w:t>
+        <w:t>)</w:t>
+      </w:r>
+      <w:r>
+        <w:rPr>
+          <w:lang w:eastAsia="en-GB"/>
+        </w:rPr>
+        <w:t xml:space="preserve">. </w:t>
+      </w:r>
+      <w:r>
+        <w:rPr>
+          <w:lang w:eastAsia="en-GB"/>
+        </w:rPr>
+        <w:t xml:space="preserve">The following plots are shown for the </w:t>
+      </w:r>
+      <w:r>
+        <w:rPr>
+          <w:lang w:eastAsia="en-GB"/>
+        </w:rPr>
+        <w:t>selected transect:</w:t>
       </w:r>
     </w:p>
     <w:p>
@@ -406,7 +614,31 @@
         <w:rPr>
           <w:lang w:eastAsia="en-GB"/>
         </w:rPr>
-        <w:t>Computed Ecospace biomass (t/km</w:t>
+        <w:t xml:space="preserve">Ecospace biomass </w:t>
+      </w:r>
+      <w:r>
+        <w:rPr>
+          <w:lang w:eastAsia="en-GB"/>
+        </w:rPr>
+        <w:t xml:space="preserve">estimates </w:t>
+      </w:r>
+      <w:r>
+        <w:rPr>
+          <w:lang w:eastAsia="en-GB"/>
+        </w:rPr>
+        <w:t>(</w:t>
+      </w:r>
+      <w:r>
+        <w:rPr>
+          <w:lang w:eastAsia="en-GB"/>
+        </w:rPr>
+        <w:t xml:space="preserve">in </w:t>
+      </w:r>
+      <w:r>
+        <w:rPr>
+          <w:lang w:eastAsia="en-GB"/>
+        </w:rPr>
+        <w:t>t/km</w:t>
       </w:r>
       <w:r>
         <w:rPr>
@@ -437,7 +669,31 @@
         <w:rPr>
           <w:lang w:eastAsia="en-GB"/>
         </w:rPr>
-        <w:t>Computed Ecospace catch (t/km</w:t>
+        <w:t xml:space="preserve">Ecospace catch </w:t>
+      </w:r>
+      <w:r>
+        <w:rPr>
+          <w:lang w:eastAsia="en-GB"/>
+        </w:rPr>
+        <w:t xml:space="preserve">estimates </w:t>
+      </w:r>
+      <w:r>
+        <w:rPr>
+          <w:lang w:eastAsia="en-GB"/>
+        </w:rPr>
+        <w:t>(</w:t>
+      </w:r>
+      <w:r>
+        <w:rPr>
+          <w:lang w:eastAsia="en-GB"/>
+        </w:rPr>
+        <w:t xml:space="preserve">in </w:t>
+      </w:r>
+      <w:r>
+        <w:rPr>
+          <w:lang w:eastAsia="en-GB"/>
+        </w:rPr>
+        <w:t>t/km</w:t>
       </w:r>
       <w:r>
         <w:rPr>
@@ -463,33 +719,80 @@
         <w:rPr>
           <w:lang w:eastAsia="en-GB"/>
         </w:rPr>
-        <w:t>The depth and MPA plots will always show data, as these plots are based on Ecospace input data. The Ecospace result plots require Ecospace, well, to have ran.</w:t>
-      </w:r>
-    </w:p>
-    <w:p>
-      <w:pPr>
-        <w:rPr>
-          <w:lang w:eastAsia="en-GB"/>
-        </w:rPr>
-      </w:pPr>
-      <w:r>
-        <w:rPr>
-          <w:lang w:eastAsia="en-GB"/>
-        </w:rPr>
-        <w:t>Note that the summary data is discarded when a transect is modified. Ecospace will need to re-run to build the summary for a new transect cell configuration.</w:t>
-      </w:r>
-    </w:p>
-    <w:p>
-      <w:pPr>
-        <w:rPr>
-          <w:lang w:eastAsia="en-GB"/>
-        </w:rPr>
-      </w:pPr>
-      <w:r>
-        <w:rPr>
-          <w:lang w:eastAsia="en-GB"/>
-        </w:rPr>
-        <w:t xml:space="preserve">Once Ecospace has ran, the summary enables two additional options, see </w:t>
+        <w:t xml:space="preserve">The depth </w:t>
+      </w:r>
+      <w:r>
+        <w:rPr>
+          <w:lang w:eastAsia="en-GB"/>
+        </w:rPr>
+        <w:t xml:space="preserve">profile </w:t>
+      </w:r>
+      <w:r>
+        <w:rPr>
+          <w:lang w:eastAsia="en-GB"/>
+        </w:rPr>
+        <w:t xml:space="preserve">and MPA </w:t>
+      </w:r>
+      <w:r>
+        <w:rPr>
+          <w:lang w:eastAsia="en-GB"/>
+        </w:rPr>
+        <w:t xml:space="preserve">overlap </w:t>
+      </w:r>
+      <w:r>
+        <w:rPr>
+          <w:lang w:eastAsia="en-GB"/>
+        </w:rPr>
+        <w:t xml:space="preserve">plots will always show data, as these plots are based on Ecospace input data. The Ecospace </w:t>
+      </w:r>
+      <w:r>
+        <w:rPr>
+          <w:lang w:eastAsia="en-GB"/>
+        </w:rPr>
+        <w:t xml:space="preserve">estimate </w:t>
+      </w:r>
+      <w:r>
+        <w:rPr>
+          <w:lang w:eastAsia="en-GB"/>
+        </w:rPr>
+        <w:t>plots require Ecospace</w:t>
+      </w:r>
+      <w:r>
+        <w:rPr>
+          <w:lang w:eastAsia="en-GB"/>
+        </w:rPr>
+        <w:t xml:space="preserve"> </w:t>
+      </w:r>
+      <w:r>
+        <w:rPr>
+          <w:lang w:eastAsia="en-GB"/>
+        </w:rPr>
+        <w:t>to have ran.</w:t>
+      </w:r>
+    </w:p>
+    <w:p>
+      <w:pPr>
+        <w:rPr>
+          <w:lang w:eastAsia="en-GB"/>
+        </w:rPr>
+      </w:pPr>
+      <w:r>
+        <w:rPr>
+          <w:lang w:eastAsia="en-GB"/>
+        </w:rPr>
+        <w:t xml:space="preserve">Once Ecospace has ran </w:t>
+      </w:r>
+      <w:r>
+        <w:rPr>
+          <w:lang w:eastAsia="en-GB"/>
+        </w:rPr>
+        <w:t>two additional options</w:t>
+      </w:r>
+      <w:r>
+        <w:rPr>
+          <w:lang w:eastAsia="en-GB"/>
+        </w:rPr>
+        <w:t xml:space="preserve"> become available (</w:t>
       </w:r>
       <w:r>
         <w:rPr>
@@ -528,6 +831,12 @@
           <w:lang w:eastAsia="en-GB"/>
         </w:rPr>
         <w:fldChar w:fldCharType="end"/>
+      </w:r>
+      <w:r>
+        <w:rPr>
+          <w:lang w:eastAsia="en-GB"/>
+        </w:rPr>
+        <w:t>)</w:t>
       </w:r>
       <w:r>
         <w:rPr>
@@ -551,7 +860,8 @@
         <w:rPr>
           <w:lang w:eastAsia="en-GB"/>
         </w:rPr>
-        <w:t>Animation of Ecospace transect summaries over time. The animation speed is set, and users cannot manually select the time step to view.</w:t>
+        <w:lastRenderedPageBreak/>
+        <w:t>Play and Stop controls can be used to view changing transect summaries over time;</w:t>
       </w:r>
     </w:p>
     <w:p>
@@ -569,21 +879,50 @@
         <w:rPr>
           <w:lang w:eastAsia="en-GB"/>
         </w:rPr>
-        <w:t>Export of transect summaries to CSV file.</w:t>
-      </w:r>
-    </w:p>
-    <w:p>
-      <w:pPr>
-        <w:pStyle w:val="Heading3"/>
-        <w:rPr>
-          <w:lang w:eastAsia="en-GB"/>
-        </w:rPr>
-      </w:pPr>
-      <w:r>
-        <w:rPr>
-          <w:lang w:eastAsia="en-GB"/>
-        </w:rPr>
-        <w:lastRenderedPageBreak/>
+        <w:t>T</w:t>
+      </w:r>
+      <w:r>
+        <w:rPr>
+          <w:lang w:eastAsia="en-GB"/>
+        </w:rPr>
+        <w:t xml:space="preserve">ransect summaries </w:t>
+      </w:r>
+      <w:r>
+        <w:rPr>
+          <w:lang w:eastAsia="en-GB"/>
+        </w:rPr>
+        <w:t xml:space="preserve">over time can be saved to </w:t>
+      </w:r>
+      <w:r>
+        <w:rPr>
+          <w:lang w:eastAsia="en-GB"/>
+        </w:rPr>
+        <w:t>CSV file</w:t>
+      </w:r>
+      <w:r>
+        <w:rPr>
+          <w:lang w:eastAsia="en-GB"/>
+        </w:rPr>
+        <w:t>s, where transects are written to individual files</w:t>
+      </w:r>
+      <w:r>
+        <w:rPr>
+          <w:lang w:eastAsia="en-GB"/>
+        </w:rPr>
+        <w:t>.</w:t>
+      </w:r>
+    </w:p>
+    <w:p>
+      <w:pPr>
+        <w:pStyle w:val="Heading2"/>
+        <w:rPr>
+          <w:lang w:eastAsia="en-GB"/>
+        </w:rPr>
+      </w:pPr>
+      <w:r>
+        <w:rPr>
+          <w:lang w:eastAsia="en-GB"/>
+        </w:rPr>
         <w:t>Auto-saving transect summaries</w:t>
       </w:r>
     </w:p>
@@ -597,7 +936,31 @@
         <w:rPr>
           <w:lang w:eastAsia="en-GB"/>
         </w:rPr>
-        <w:t xml:space="preserve">Transect summary data can be automatically saved when Ecospace runs. This option can be configured via the Ecospace parameters form (Navigator &gt; Ecospace &gt; Input &gt; Ecospace parameters), see </w:t>
+        <w:t xml:space="preserve">Transect summary </w:t>
+      </w:r>
+      <w:r>
+        <w:rPr>
+          <w:lang w:eastAsia="en-GB"/>
+        </w:rPr>
+        <w:t xml:space="preserve">CSV files </w:t>
+      </w:r>
+      <w:r>
+        <w:rPr>
+          <w:lang w:eastAsia="en-GB"/>
+        </w:rPr>
+        <w:t xml:space="preserve">can be automatically saved when Ecospace runs. This can be </w:t>
+      </w:r>
+      <w:r>
+        <w:rPr>
+          <w:lang w:eastAsia="en-GB"/>
+        </w:rPr>
+        <w:t xml:space="preserve">configured in </w:t>
+      </w:r>
+      <w:r>
+        <w:rPr>
+          <w:lang w:eastAsia="en-GB"/>
+        </w:rPr>
+        <w:t xml:space="preserve">the Ecospace parameters form (Navigator &gt; Ecospace &gt; Input &gt; Ecospace parameters), see </w:t>
       </w:r>
       <w:r>
         <w:rPr>
@@ -646,7 +1009,7 @@
     </w:p>
     <w:p>
       <w:pPr>
-        <w:pStyle w:val="Heading2"/>
+        <w:pStyle w:val="Heading1"/>
         <w:rPr>
           <w:lang w:eastAsia="en-GB"/>
         </w:rPr>
@@ -660,68 +1023,86 @@
     </w:p>
     <w:p>
       <w:pPr>
-        <w:pStyle w:val="Heading3"/>
-        <w:rPr>
-          <w:lang w:eastAsia="en-GB"/>
-        </w:rPr>
-      </w:pPr>
-      <w:r>
-        <w:rPr>
-          <w:lang w:eastAsia="en-GB"/>
-        </w:rPr>
-        <w:t>Persistence</w:t>
-      </w:r>
-      <w:r>
-        <w:rPr>
-          <w:lang w:eastAsia="en-GB"/>
-        </w:rPr>
-        <w:t xml:space="preserve"> issues</w:t>
-      </w:r>
-    </w:p>
-    <w:p>
-      <w:pPr>
-        <w:rPr>
-          <w:lang w:eastAsia="en-GB"/>
-        </w:rPr>
-      </w:pPr>
-      <w:r>
-        <w:rPr>
-          <w:lang w:eastAsia="en-GB"/>
-        </w:rPr>
-        <w:t>The current implementation is based on the EwE plug-in system. Transects integrate with the Ecospace software as expected, but transects are not saved with the Ecospace scenario. When a scenario is closed, sketched transects are lost. It is foreseen that the transect logic will become an integral part of the EwE source code, and that transects will be stored within the EwE model file.</w:t>
-      </w:r>
-    </w:p>
-    <w:p>
-      <w:pPr>
-        <w:pStyle w:val="Heading3"/>
-        <w:rPr>
-          <w:lang w:eastAsia="en-GB"/>
-        </w:rPr>
-      </w:pPr>
-      <w:r>
-        <w:rPr>
-          <w:lang w:eastAsia="en-GB"/>
-        </w:rPr>
-        <w:t xml:space="preserve">User </w:t>
-      </w:r>
-      <w:r>
-        <w:rPr>
-          <w:lang w:eastAsia="en-GB"/>
-        </w:rPr>
-        <w:t>interface issues</w:t>
-      </w:r>
-    </w:p>
-    <w:p>
-      <w:pPr>
-        <w:rPr>
-          <w:lang w:eastAsia="en-GB"/>
-        </w:rPr>
-      </w:pPr>
-      <w:r>
-        <w:rPr>
-          <w:lang w:eastAsia="en-GB"/>
-        </w:rPr>
-        <w:t>There are a few issues in the user interface that will be addressed shortly:</w:t>
+        <w:pStyle w:val="ListParagraph"/>
+        <w:numPr>
+          <w:ilvl w:val="0"/>
+          <w:numId w:val="6"/>
+        </w:numPr>
+        <w:rPr>
+          <w:lang w:eastAsia="en-GB"/>
+        </w:rPr>
+      </w:pPr>
+      <w:r>
+        <w:rPr>
+          <w:lang w:eastAsia="en-GB"/>
+        </w:rPr>
+        <w:t xml:space="preserve">The </w:t>
+      </w:r>
+      <w:r>
+        <w:rPr>
+          <w:lang w:eastAsia="en-GB"/>
+        </w:rPr>
+        <w:t xml:space="preserve">transect logic </w:t>
+      </w:r>
+      <w:r>
+        <w:rPr>
+          <w:lang w:eastAsia="en-GB"/>
+        </w:rPr>
+        <w:t xml:space="preserve">is </w:t>
+      </w:r>
+      <w:r>
+        <w:rPr>
+          <w:lang w:eastAsia="en-GB"/>
+        </w:rPr>
+        <w:t xml:space="preserve">implemented as an </w:t>
+      </w:r>
+      <w:r>
+        <w:rPr>
+          <w:lang w:eastAsia="en-GB"/>
+        </w:rPr>
+        <w:t xml:space="preserve">EwE plug-in. </w:t>
+      </w:r>
+      <w:r>
+        <w:rPr>
+          <w:lang w:eastAsia="en-GB"/>
+        </w:rPr>
+        <w:t xml:space="preserve">Plug-ins cannot add new types of records to the EwE model database, and as such, </w:t>
+      </w:r>
+      <w:r>
+        <w:rPr>
+          <w:lang w:eastAsia="en-GB"/>
+        </w:rPr>
+        <w:t>transects are not saved with the Ecospace scenario. When a</w:t>
+      </w:r>
+      <w:r>
+        <w:rPr>
+          <w:lang w:eastAsia="en-GB"/>
+        </w:rPr>
+        <w:t>n Ecospace</w:t>
+      </w:r>
+      <w:r>
+        <w:rPr>
+          <w:lang w:eastAsia="en-GB"/>
+        </w:rPr>
+        <w:t xml:space="preserve"> scenario is closed, </w:t>
+      </w:r>
+      <w:r>
+        <w:rPr>
+          <w:lang w:eastAsia="en-GB"/>
+        </w:rPr>
+        <w:t>defined transects are lost</w:t>
+      </w:r>
+      <w:r>
+        <w:rPr>
+          <w:lang w:eastAsia="en-GB"/>
+        </w:rPr>
+        <w:t>.</w:t>
+      </w:r>
+      <w:r>
+        <w:rPr>
+          <w:lang w:eastAsia="en-GB"/>
+        </w:rPr>
+        <w:t xml:space="preserve"> This can be fixed by using the database system extension introduced by the ValueChain plug-in;</w:t>
       </w:r>
     </w:p>
     <w:p>
@@ -739,7 +1120,120 @@
         <w:rPr>
           <w:lang w:eastAsia="en-GB"/>
         </w:rPr>
-        <w:t>Although the start location is always shown on the x-axis labels in the transect summary graphs, sometimes the end location (x, y) of a transect is not shown. This should not happen; the end location should be displayed at any time.</w:t>
+        <w:t>T</w:t>
+      </w:r>
+      <w:r>
+        <w:rPr>
+          <w:lang w:eastAsia="en-GB"/>
+        </w:rPr>
+        <w:t>ransect summ</w:t>
+      </w:r>
+      <w:r>
+        <w:rPr>
+          <w:lang w:eastAsia="en-GB"/>
+        </w:rPr>
+        <w:t>ary graphs do not show units</w:t>
+      </w:r>
+      <w:r>
+        <w:rPr>
+          <w:lang w:eastAsia="en-GB"/>
+        </w:rPr>
+        <w:t>.</w:t>
+      </w:r>
+    </w:p>
+    <w:p>
+      <w:pPr>
+        <w:pStyle w:val="Heading1"/>
+        <w:rPr>
+          <w:lang w:eastAsia="en-GB"/>
+        </w:rPr>
+      </w:pPr>
+      <w:r>
+        <w:rPr>
+          <w:lang w:eastAsia="en-GB"/>
+        </w:rPr>
+        <w:t>Foreseen improvement</w:t>
+      </w:r>
+      <w:r>
+        <w:rPr>
+          <w:lang w:eastAsia="en-GB"/>
+        </w:rPr>
+        <w:t>s</w:t>
+      </w:r>
+    </w:p>
+    <w:p>
+      <w:pPr>
+        <w:rPr>
+          <w:lang w:eastAsia="en-GB"/>
+        </w:rPr>
+      </w:pPr>
+      <w:r>
+        <w:rPr>
+          <w:lang w:eastAsia="en-GB"/>
+        </w:rPr>
+        <w:t xml:space="preserve">The </w:t>
+      </w:r>
+      <w:r>
+        <w:rPr>
+          <w:lang w:eastAsia="en-GB"/>
+        </w:rPr>
+        <w:t xml:space="preserve">transect functionality </w:t>
+      </w:r>
+      <w:r>
+        <w:rPr>
+          <w:lang w:eastAsia="en-GB"/>
+        </w:rPr>
+        <w:t xml:space="preserve">is </w:t>
+      </w:r>
+      <w:r>
+        <w:rPr>
+          <w:lang w:eastAsia="en-GB"/>
+        </w:rPr>
+        <w:t xml:space="preserve">a </w:t>
+      </w:r>
+      <w:r>
+        <w:rPr>
+          <w:lang w:eastAsia="en-GB"/>
+        </w:rPr>
+        <w:t>prototype</w:t>
+      </w:r>
+      <w:r>
+        <w:rPr>
+          <w:lang w:eastAsia="en-GB"/>
+        </w:rPr>
+        <w:t xml:space="preserve"> to which many </w:t>
+      </w:r>
+      <w:r>
+        <w:rPr>
+          <w:lang w:eastAsia="en-GB"/>
+        </w:rPr>
+        <w:t xml:space="preserve">features </w:t>
+      </w:r>
+      <w:r>
+        <w:rPr>
+          <w:lang w:eastAsia="en-GB"/>
+        </w:rPr>
+        <w:t xml:space="preserve">could be </w:t>
+      </w:r>
+      <w:r>
+        <w:rPr>
+          <w:lang w:eastAsia="en-GB"/>
+        </w:rPr>
+        <w:t>added, such as:</w:t>
+      </w:r>
+    </w:p>
+    <w:p>
+      <w:pPr>
+        <w:pStyle w:val="Heading2"/>
+        <w:rPr>
+          <w:lang w:eastAsia="en-GB"/>
+        </w:rPr>
+      </w:pPr>
+      <w:r>
+        <w:rPr>
+          <w:lang w:eastAsia="en-GB"/>
+        </w:rPr>
+        <w:t>Transects</w:t>
       </w:r>
     </w:p>
     <w:p>
@@ -747,7 +1241,7 @@
         <w:pStyle w:val="ListParagraph"/>
         <w:numPr>
           <w:ilvl w:val="0"/>
-          <w:numId w:val="1"/>
+          <w:numId w:val="5"/>
         </w:numPr>
         <w:rPr>
           <w:lang w:eastAsia="en-GB"/>
@@ -757,7 +1251,187 @@
         <w:rPr>
           <w:lang w:eastAsia="en-GB"/>
         </w:rPr>
-        <w:t>The transect summary graphs do not show units yet.</w:t>
+        <w:t xml:space="preserve">The end points of a </w:t>
+      </w:r>
+      <w:r>
+        <w:rPr>
+          <w:lang w:eastAsia="en-GB"/>
+        </w:rPr>
+        <w:t xml:space="preserve">transect </w:t>
+      </w:r>
+      <w:r>
+        <w:rPr>
+          <w:lang w:eastAsia="en-GB"/>
+        </w:rPr>
+        <w:t>are expressed in map units (</w:t>
+      </w:r>
+      <w:r>
+        <w:rPr>
+          <w:lang w:eastAsia="en-GB"/>
+        </w:rPr>
+        <w:t>lon</w:t>
+      </w:r>
+      <w:r>
+        <w:rPr>
+          <w:lang w:eastAsia="en-GB"/>
+        </w:rPr>
+        <w:t>gitude and latitude)</w:t>
+      </w:r>
+      <w:r>
+        <w:rPr>
+          <w:lang w:eastAsia="en-GB"/>
+        </w:rPr>
+        <w:t xml:space="preserve">. The </w:t>
+      </w:r>
+      <w:r>
+        <w:rPr>
+          <w:lang w:eastAsia="en-GB"/>
+        </w:rPr>
+        <w:t xml:space="preserve">actual cells used by a </w:t>
+      </w:r>
+      <w:r>
+        <w:rPr>
+          <w:lang w:eastAsia="en-GB"/>
+        </w:rPr>
+        <w:t xml:space="preserve">transect are </w:t>
+      </w:r>
+      <w:r>
+        <w:rPr>
+          <w:lang w:eastAsia="en-GB"/>
+        </w:rPr>
+        <w:t xml:space="preserve">calculated from the </w:t>
+      </w:r>
+      <w:r>
+        <w:rPr>
+          <w:lang w:eastAsia="en-GB"/>
+        </w:rPr>
+        <w:t>centroid</w:t>
+      </w:r>
+      <w:r>
+        <w:rPr>
+          <w:lang w:eastAsia="en-GB"/>
+        </w:rPr>
+        <w:t>s</w:t>
+      </w:r>
+      <w:r>
+        <w:rPr>
+          <w:lang w:eastAsia="en-GB"/>
+        </w:rPr>
+        <w:t xml:space="preserve"> </w:t>
+      </w:r>
+      <w:r>
+        <w:rPr>
+          <w:lang w:eastAsia="en-GB"/>
+        </w:rPr>
+        <w:t xml:space="preserve">(row, col) </w:t>
+      </w:r>
+      <w:r>
+        <w:rPr>
+          <w:lang w:eastAsia="en-GB"/>
+        </w:rPr>
+        <w:t>of the cell</w:t>
+      </w:r>
+      <w:r>
+        <w:rPr>
+          <w:lang w:eastAsia="en-GB"/>
+        </w:rPr>
+        <w:t>s</w:t>
+      </w:r>
+      <w:r>
+        <w:rPr>
+          <w:lang w:eastAsia="en-GB"/>
+        </w:rPr>
+        <w:t xml:space="preserve"> </w:t>
+      </w:r>
+      <w:r>
+        <w:rPr>
+          <w:lang w:eastAsia="en-GB"/>
+        </w:rPr>
+        <w:t xml:space="preserve">that contain the </w:t>
+      </w:r>
+      <w:r>
+        <w:rPr>
+          <w:lang w:eastAsia="en-GB"/>
+        </w:rPr>
+        <w:t xml:space="preserve">transect </w:t>
+      </w:r>
+      <w:r>
+        <w:rPr>
+          <w:lang w:eastAsia="en-GB"/>
+        </w:rPr>
+        <w:t>end points</w:t>
+      </w:r>
+      <w:r>
+        <w:rPr>
+          <w:lang w:eastAsia="en-GB"/>
+        </w:rPr>
+        <w:t xml:space="preserve">. </w:t>
+      </w:r>
+      <w:r>
+        <w:rPr>
+          <w:lang w:eastAsia="en-GB"/>
+        </w:rPr>
+        <w:t xml:space="preserve">The transect may thus use cells that do not visually overlap with the transect line. This </w:t>
+      </w:r>
+      <w:r>
+        <w:rPr>
+          <w:lang w:eastAsia="en-GB"/>
+        </w:rPr>
+        <w:t xml:space="preserve">can be addressed by </w:t>
+      </w:r>
+      <w:r>
+        <w:rPr>
+          <w:lang w:eastAsia="en-GB"/>
+        </w:rPr>
+        <w:t xml:space="preserve">1) </w:t>
+      </w:r>
+      <w:r>
+        <w:rPr>
+          <w:lang w:eastAsia="en-GB"/>
+        </w:rPr>
+        <w:t>using</w:t>
+      </w:r>
+      <w:r>
+        <w:rPr>
+          <w:lang w:eastAsia="en-GB"/>
+        </w:rPr>
+        <w:t xml:space="preserve"> the </w:t>
+      </w:r>
+      <w:r>
+        <w:rPr>
+          <w:lang w:eastAsia="en-GB"/>
+        </w:rPr>
+        <w:t xml:space="preserve">end point </w:t>
+      </w:r>
+      <w:r>
+        <w:rPr>
+          <w:lang w:eastAsia="en-GB"/>
+        </w:rPr>
+        <w:t xml:space="preserve">locations </w:t>
+      </w:r>
+      <w:r>
+        <w:rPr>
+          <w:lang w:eastAsia="en-GB"/>
+        </w:rPr>
+        <w:t xml:space="preserve">instead of cell centroids </w:t>
+      </w:r>
+      <w:r>
+        <w:rPr>
+          <w:lang w:eastAsia="en-GB"/>
+        </w:rPr>
+        <w:t>to determine the intersecting cells</w:t>
+      </w:r>
+      <w:r>
+        <w:rPr>
+          <w:lang w:eastAsia="en-GB"/>
+        </w:rPr>
+        <w:t>; or 2) snapping the transect end points to the centroid of cells</w:t>
+      </w:r>
+      <w:r>
+        <w:rPr>
+          <w:lang w:eastAsia="en-GB"/>
+        </w:rPr>
+        <w:t>.</w:t>
       </w:r>
     </w:p>
     <w:p>
@@ -771,175 +1445,6 @@
         <w:rPr>
           <w:lang w:eastAsia="en-GB"/>
         </w:rPr>
-        <w:t>Future developments</w:t>
-      </w:r>
-    </w:p>
-    <w:p>
-      <w:pPr>
-        <w:rPr>
-          <w:lang w:eastAsia="en-GB"/>
-        </w:rPr>
-      </w:pPr>
-      <w:r>
-        <w:rPr>
-          <w:lang w:eastAsia="en-GB"/>
-        </w:rPr>
-        <w:t xml:space="preserve">The </w:t>
-      </w:r>
-      <w:r>
-        <w:rPr>
-          <w:lang w:eastAsia="en-GB"/>
-        </w:rPr>
-        <w:t xml:space="preserve">transect functionality </w:t>
-      </w:r>
-      <w:r>
-        <w:rPr>
-          <w:lang w:eastAsia="en-GB"/>
-        </w:rPr>
-        <w:t xml:space="preserve">logic is </w:t>
-      </w:r>
-      <w:r>
-        <w:rPr>
-          <w:lang w:eastAsia="en-GB"/>
-        </w:rPr>
-        <w:t xml:space="preserve">still in prototype stage and is rather </w:t>
-      </w:r>
-      <w:r>
-        <w:rPr>
-          <w:lang w:eastAsia="en-GB"/>
-        </w:rPr>
-        <w:t xml:space="preserve">unpolished. </w:t>
-      </w:r>
-      <w:r>
-        <w:rPr>
-          <w:lang w:eastAsia="en-GB"/>
-        </w:rPr>
-        <w:t xml:space="preserve">A range </w:t>
-      </w:r>
-      <w:r>
-        <w:rPr>
-          <w:lang w:eastAsia="en-GB"/>
-        </w:rPr>
-        <w:t>of</w:t>
-      </w:r>
-      <w:r>
-        <w:rPr>
-          <w:lang w:eastAsia="en-GB"/>
-        </w:rPr>
-        <w:t xml:space="preserve"> </w:t>
-      </w:r>
-      <w:r>
-        <w:rPr>
-          <w:lang w:eastAsia="en-GB"/>
-        </w:rPr>
-        <w:t xml:space="preserve">additional </w:t>
-      </w:r>
-      <w:r>
-        <w:rPr>
-          <w:lang w:eastAsia="en-GB"/>
-        </w:rPr>
-        <w:t xml:space="preserve">features </w:t>
-      </w:r>
-      <w:r>
-        <w:rPr>
-          <w:lang w:eastAsia="en-GB"/>
-        </w:rPr>
-        <w:t xml:space="preserve">could be </w:t>
-      </w:r>
-      <w:r>
-        <w:rPr>
-          <w:lang w:eastAsia="en-GB"/>
-        </w:rPr>
-        <w:t>foreseen such as listed below. However, b</w:t>
-      </w:r>
-      <w:r>
-        <w:rPr>
-          <w:lang w:eastAsia="en-GB"/>
-        </w:rPr>
-        <w:t xml:space="preserve">efore implementing additional features, it </w:t>
-      </w:r>
-      <w:r>
-        <w:rPr>
-          <w:lang w:eastAsia="en-GB"/>
-        </w:rPr>
-        <w:t xml:space="preserve">may be prudent to decide which lacking features are most needed by </w:t>
-      </w:r>
-      <w:r>
-        <w:rPr>
-          <w:lang w:eastAsia="en-GB"/>
-        </w:rPr>
-        <w:t xml:space="preserve">gather </w:t>
-      </w:r>
-      <w:r>
-        <w:rPr>
-          <w:lang w:eastAsia="en-GB"/>
-        </w:rPr>
-        <w:t xml:space="preserve">usage </w:t>
-      </w:r>
-      <w:r>
-        <w:rPr>
-          <w:lang w:eastAsia="en-GB"/>
-        </w:rPr>
-        <w:t>feedback on current functionality. This feedback will help identifying shortcomings in the current user interface, and will be used to prioritize future development efforts.</w:t>
-      </w:r>
-    </w:p>
-    <w:p>
-      <w:pPr>
-        <w:pStyle w:val="Heading3"/>
-        <w:rPr>
-          <w:lang w:eastAsia="en-GB"/>
-        </w:rPr>
-      </w:pPr>
-      <w:r>
-        <w:rPr>
-          <w:lang w:eastAsia="en-GB"/>
-        </w:rPr>
-        <w:t>Transects</w:t>
-      </w:r>
-    </w:p>
-    <w:p>
-      <w:pPr>
-        <w:pStyle w:val="ListParagraph"/>
-        <w:numPr>
-          <w:ilvl w:val="0"/>
-          <w:numId w:val="4"/>
-        </w:numPr>
-        <w:rPr>
-          <w:lang w:eastAsia="en-GB"/>
-        </w:rPr>
-      </w:pPr>
-      <w:r>
-        <w:rPr>
-          <w:lang w:eastAsia="en-GB"/>
-        </w:rPr>
-        <w:t xml:space="preserve">A transect is defined at by coordinates (lon, lat). The cells of the transect are determined from the centroid of the cell where the transect starts to the centroid of the cell where the transect ends. </w:t>
-      </w:r>
-      <w:r>
-        <w:rPr>
-          <w:lang w:eastAsia="en-GB"/>
-        </w:rPr>
-        <w:t xml:space="preserve">The intersecting cells logic </w:t>
-      </w:r>
-      <w:bookmarkStart w:id="0" w:name="_GoBack"/>
-      <w:bookmarkEnd w:id="0"/>
-      <w:r>
-        <w:rPr>
-          <w:lang w:eastAsia="en-GB"/>
-        </w:rPr>
-        <w:t>can be refined to use the true start and end location of the transect.</w:t>
-      </w:r>
-    </w:p>
-    <w:p>
-      <w:pPr>
-        <w:pStyle w:val="Heading3"/>
-        <w:rPr>
-          <w:lang w:eastAsia="en-GB"/>
-        </w:rPr>
-      </w:pPr>
-      <w:r>
-        <w:rPr>
-          <w:lang w:eastAsia="en-GB"/>
-        </w:rPr>
         <w:t>T</w:t>
       </w:r>
       <w:r>
@@ -952,7 +1457,7 @@
         <w:rPr>
           <w:lang w:eastAsia="en-GB"/>
         </w:rPr>
-        <w:t xml:space="preserve">ut form </w:t>
+        <w:t>ut</w:t>
       </w:r>
     </w:p>
     <w:p>
@@ -970,13 +1475,19 @@
         <w:rPr>
           <w:lang w:eastAsia="en-GB"/>
         </w:rPr>
-        <w:t xml:space="preserve">Possibility to rename </w:t>
-      </w:r>
-      <w:r>
-        <w:rPr>
-          <w:lang w:eastAsia="en-GB"/>
-        </w:rPr>
-        <w:t>transects</w:t>
+        <w:t xml:space="preserve">Transects cannot be </w:t>
+      </w:r>
+      <w:r>
+        <w:rPr>
+          <w:lang w:eastAsia="en-GB"/>
+        </w:rPr>
+        <w:t>rename</w:t>
+      </w:r>
+      <w:r>
+        <w:rPr>
+          <w:lang w:eastAsia="en-GB"/>
+        </w:rPr>
+        <w:t>d, which may be desired</w:t>
       </w:r>
       <w:r>
         <w:rPr>
@@ -1000,25 +1511,19 @@
         <w:rPr>
           <w:lang w:eastAsia="en-GB"/>
         </w:rPr>
-        <w:t>Possibility</w:t>
-      </w:r>
-      <w:r>
-        <w:rPr>
-          <w:lang w:eastAsia="en-GB"/>
-        </w:rPr>
-        <w:t xml:space="preserve"> to set the start and end locations of transects by </w:t>
-      </w:r>
-      <w:r>
-        <w:rPr>
-          <w:lang w:eastAsia="en-GB"/>
-        </w:rPr>
-        <w:t xml:space="preserve">entering </w:t>
-      </w:r>
-      <w:r>
-        <w:rPr>
-          <w:lang w:eastAsia="en-GB"/>
-        </w:rPr>
-        <w:t>these positions in a dedicated user interface</w:t>
+        <w:t xml:space="preserve">Transects can only be placed via the mouse. It may be desired to allow users to enter numerical </w:t>
+      </w:r>
+      <w:r>
+        <w:rPr>
+          <w:lang w:eastAsia="en-GB"/>
+        </w:rPr>
+        <w:t xml:space="preserve">start and end locations of </w:t>
+      </w:r>
+      <w:r>
+        <w:rPr>
+          <w:lang w:eastAsia="en-GB"/>
+        </w:rPr>
+        <w:t>a transect to place transects with more precision</w:t>
       </w:r>
       <w:r>
         <w:rPr>
@@ -1029,16 +1534,22 @@
     </w:p>
     <w:p>
       <w:pPr>
-        <w:pStyle w:val="Heading3"/>
-        <w:rPr>
-          <w:lang w:eastAsia="en-GB"/>
-        </w:rPr>
-      </w:pPr>
-      <w:r>
-        <w:rPr>
-          <w:lang w:eastAsia="en-GB"/>
-        </w:rPr>
-        <w:t>Transect summary form</w:t>
+        <w:pStyle w:val="Heading2"/>
+        <w:rPr>
+          <w:lang w:eastAsia="en-GB"/>
+        </w:rPr>
+      </w:pPr>
+      <w:r>
+        <w:rPr>
+          <w:lang w:eastAsia="en-GB"/>
+        </w:rPr>
+        <w:t>Transect summar</w:t>
+      </w:r>
+      <w:r>
+        <w:rPr>
+          <w:lang w:eastAsia="en-GB"/>
+        </w:rPr>
+        <w:t>ies</w:t>
       </w:r>
     </w:p>
     <w:p>
@@ -1056,13 +1567,13 @@
         <w:rPr>
           <w:lang w:eastAsia="en-GB"/>
         </w:rPr>
-        <w:t>Possibility</w:t>
-      </w:r>
-      <w:r>
-        <w:rPr>
-          <w:lang w:eastAsia="en-GB"/>
-        </w:rPr>
-        <w:t xml:space="preserve"> to change the animation speed;</w:t>
+        <w:t>Transect animation play at a fixed speed of 100ms per tick. This speed could become user configurable</w:t>
+      </w:r>
+      <w:r>
+        <w:rPr>
+          <w:lang w:eastAsia="en-GB"/>
+        </w:rPr>
+        <w:t>;</w:t>
       </w:r>
     </w:p>
     <w:p>
@@ -1080,13 +1591,13 @@
         <w:rPr>
           <w:lang w:eastAsia="en-GB"/>
         </w:rPr>
-        <w:t>Possibility</w:t>
-      </w:r>
-      <w:r>
-        <w:rPr>
-          <w:lang w:eastAsia="en-GB"/>
-        </w:rPr>
-        <w:t xml:space="preserve"> to select the time step to show;</w:t>
+        <w:t>It is not possible to view the transect summary for a specific time step other than waiting for the animation to show that time step. The ability to select which time step to display can be added</w:t>
+      </w:r>
+      <w:r>
+        <w:rPr>
+          <w:lang w:eastAsia="en-GB"/>
+        </w:rPr>
+        <w:t>;</w:t>
       </w:r>
     </w:p>
     <w:p>
@@ -1104,13 +1615,13 @@
         <w:rPr>
           <w:lang w:eastAsia="en-GB"/>
         </w:rPr>
-        <w:t>Possibility</w:t>
-      </w:r>
-      <w:r>
-        <w:rPr>
-          <w:lang w:eastAsia="en-GB"/>
-        </w:rPr>
-        <w:t xml:space="preserve"> to decide which data is shown in the plots: show or hide plots, add mode variables;</w:t>
+        <w:t>The content of the summary view is fixed to the four variables listed earlier. More variables could be shown, and the option to show/hide specific variables can be added</w:t>
+      </w:r>
+      <w:r>
+        <w:rPr>
+          <w:lang w:eastAsia="en-GB"/>
+        </w:rPr>
+        <w:t>;</w:t>
       </w:r>
     </w:p>
     <w:p>
@@ -1128,31 +1639,55 @@
         <w:rPr>
           <w:lang w:eastAsia="en-GB"/>
         </w:rPr>
-        <w:t xml:space="preserve">The plots now show all available variables, in separate plots, for a single transect. Perhaps </w:t>
-      </w:r>
-      <w:r>
-        <w:rPr>
-          <w:lang w:eastAsia="en-GB"/>
-        </w:rPr>
-        <w:t xml:space="preserve">it might be more useful </w:t>
-      </w:r>
-      <w:r>
-        <w:rPr>
-          <w:lang w:eastAsia="en-GB"/>
-        </w:rPr>
-        <w:t xml:space="preserve">to show the same variable </w:t>
-      </w:r>
-      <w:r>
-        <w:rPr>
-          <w:lang w:eastAsia="en-GB"/>
-        </w:rPr>
-        <w:t xml:space="preserve">across all transects, </w:t>
-      </w:r>
-      <w:r>
-        <w:rPr>
-          <w:lang w:eastAsia="en-GB"/>
-        </w:rPr>
-        <w:t>one plot per transect;</w:t>
+        <w:t xml:space="preserve">The </w:t>
+      </w:r>
+      <w:r>
+        <w:rPr>
+          <w:lang w:eastAsia="en-GB"/>
+        </w:rPr>
+        <w:t>summaries plot form</w:t>
+      </w:r>
+      <w:r>
+        <w:rPr>
+          <w:lang w:eastAsia="en-GB"/>
+        </w:rPr>
+        <w:t xml:space="preserve"> </w:t>
+      </w:r>
+      <w:r>
+        <w:rPr>
+          <w:lang w:eastAsia="en-GB"/>
+        </w:rPr>
+        <w:t xml:space="preserve">is transect-oriented, showing </w:t>
+      </w:r>
+      <w:r>
+        <w:rPr>
+          <w:lang w:eastAsia="en-GB"/>
+        </w:rPr>
+        <w:t xml:space="preserve">all available variables, in separate plots, for </w:t>
+      </w:r>
+      <w:r>
+        <w:rPr>
+          <w:lang w:eastAsia="en-GB"/>
+        </w:rPr>
+        <w:t xml:space="preserve">a selected </w:t>
+      </w:r>
+      <w:r>
+        <w:rPr>
+          <w:lang w:eastAsia="en-GB"/>
+        </w:rPr>
+        <w:t xml:space="preserve">transect. </w:t>
+      </w:r>
+      <w:r>
+        <w:rPr>
+          <w:lang w:eastAsia="en-GB"/>
+        </w:rPr>
+        <w:t>The summaries form could become variable-oriented, showing how a selected variable compares across different transects in separate plots</w:t>
+      </w:r>
+      <w:r>
+        <w:rPr>
+          <w:lang w:eastAsia="en-GB"/>
+        </w:rPr>
+        <w:t>;</w:t>
       </w:r>
     </w:p>
     <w:p>
@@ -1170,13 +1705,7 @@
         <w:rPr>
           <w:lang w:eastAsia="en-GB"/>
         </w:rPr>
-        <w:t xml:space="preserve">Possibility to show or hide </w:t>
-      </w:r>
-      <w:r>
-        <w:rPr>
-          <w:lang w:eastAsia="en-GB"/>
-        </w:rPr>
-        <w:t>functional groups.</w:t>
+        <w:t>It may be useful to be able to show/hide data for functional groups in the Ecospace estimates plots.</w:t>
       </w:r>
     </w:p>
     <w:p>
@@ -1190,7 +1719,22 @@
         <w:rPr>
           <w:lang w:eastAsia="en-GB"/>
         </w:rPr>
+        <w:lastRenderedPageBreak/>
         <w:t>CSV file format</w:t>
+      </w:r>
+    </w:p>
+    <w:p>
+      <w:r>
+        <w:rPr>
+          <w:lang w:eastAsia="en-GB"/>
+        </w:rPr>
+        <w:t>Transect summary files contain biomass and catch Ecospace estimates for all time steps, and all groups, for all cells in the transect.</w:t>
+      </w:r>
+      <w:r>
+        <w:rPr>
+          <w:lang w:eastAsia="en-GB"/>
+        </w:rPr>
+        <w:t xml:space="preserve"> Such CVS files can get large.</w:t>
       </w:r>
     </w:p>
     <w:p>
@@ -1208,13 +1752,25 @@
         <w:rPr>
           <w:lang w:eastAsia="en-GB"/>
         </w:rPr>
-        <w:t>Add transect annual averages</w:t>
-      </w:r>
-      <w:r>
-        <w:rPr>
-          <w:lang w:eastAsia="en-GB"/>
-        </w:rPr>
-        <w:t xml:space="preserve"> CSV files</w:t>
+        <w:t xml:space="preserve">It might be useful to add a CSV file format with </w:t>
+      </w:r>
+      <w:r>
+        <w:rPr>
+          <w:lang w:eastAsia="en-GB"/>
+        </w:rPr>
+        <w:t>annual averages</w:t>
+      </w:r>
+      <w:r>
+        <w:rPr>
+          <w:lang w:eastAsia="en-GB"/>
+        </w:rPr>
+        <w:t xml:space="preserve"> </w:t>
+      </w:r>
+      <w:r>
+        <w:rPr>
+          <w:lang w:eastAsia="en-GB"/>
+        </w:rPr>
+        <w:t>per transect</w:t>
       </w:r>
       <w:r>
         <w:rPr>
@@ -1238,20 +1794,25 @@
         <w:rPr>
           <w:lang w:eastAsia="en-GB"/>
         </w:rPr>
-        <w:lastRenderedPageBreak/>
-        <w:t>Add</w:t>
-      </w:r>
-      <w:r>
-        <w:rPr>
-          <w:lang w:eastAsia="en-GB"/>
-        </w:rPr>
-        <w:t xml:space="preserve"> </w:t>
-      </w:r>
-      <w:r>
-        <w:rPr>
-          <w:lang w:eastAsia="en-GB"/>
-        </w:rPr>
-        <w:t xml:space="preserve">transect averages per </w:t>
+        <w:t xml:space="preserve">It might be useful to add a CSV file format with </w:t>
+      </w:r>
+      <w:r>
+        <w:rPr>
+          <w:lang w:eastAsia="en-GB"/>
+        </w:rPr>
+        <w:t>average</w:t>
+      </w:r>
+      <w:r>
+        <w:rPr>
+          <w:lang w:eastAsia="en-GB"/>
+        </w:rPr>
+        <w:t xml:space="preserve"> values for the entire transect </w:t>
+      </w:r>
+      <w:r>
+        <w:rPr>
+          <w:lang w:eastAsia="en-GB"/>
+        </w:rPr>
+        <w:t xml:space="preserve">per </w:t>
       </w:r>
       <w:r>
         <w:rPr>
@@ -1271,7 +1832,25 @@
         <w:rPr>
           <w:lang w:eastAsia="en-GB"/>
         </w:rPr>
-        <w:t>Acknoweldgements</w:t>
+        <w:t>Acknow</w:t>
+      </w:r>
+      <w:r>
+        <w:rPr>
+          <w:lang w:eastAsia="en-GB"/>
+        </w:rPr>
+        <w:t>l</w:t>
+      </w:r>
+      <w:r>
+        <w:rPr>
+          <w:lang w:eastAsia="en-GB"/>
+        </w:rPr>
+        <w:t>e</w:t>
+      </w:r>
+      <w:r>
+        <w:rPr>
+          <w:lang w:eastAsia="en-GB"/>
+        </w:rPr>
+        <w:t>dgements</w:t>
       </w:r>
     </w:p>
     <w:p>
@@ -1297,19 +1876,6 @@
     </w:p>
     <w:p>
       <w:pPr>
-        <w:rPr>
-          <w:lang w:eastAsia="en-GB"/>
-        </w:rPr>
-      </w:pPr>
-      <w:r>
-        <w:rPr>
-          <w:lang w:eastAsia="en-GB"/>
-        </w:rPr>
-        <w:br w:type="page"/>
-      </w:r>
-    </w:p>
-    <w:p>
-      <w:pPr>
         <w:pStyle w:val="Heading1"/>
         <w:rPr>
           <w:lang w:eastAsia="en-GB"/>
@@ -1319,19 +1885,11 @@
         <w:rPr>
           <w:lang w:eastAsia="en-GB"/>
         </w:rPr>
-        <w:lastRenderedPageBreak/>
         <w:t>Figures</w:t>
       </w:r>
     </w:p>
     <w:p>
       <w:pPr>
-        <w:rPr>
-          <w:lang w:eastAsia="en-GB"/>
-        </w:rPr>
-      </w:pPr>
-    </w:p>
-    <w:p>
-      <w:pPr>
         <w:keepNext/>
       </w:pPr>
       <w:r>
@@ -1340,10 +1898,10 @@
           <w:lang w:eastAsia="en-GB"/>
         </w:rPr>
         <w:drawing>
-          <wp:inline distT="0" distB="0" distL="0" distR="0" wp14:anchorId="33DA6A4C" wp14:editId="5D2CC66A">
-            <wp:extent cx="4942800" cy="3675600"/>
-            <wp:effectExtent l="0" t="0" r="0" b="1270"/>
-            <wp:docPr id="3" name="Picture 3"/>
+          <wp:inline distT="0" distB="0" distL="0" distR="0" wp14:anchorId="299CFC07" wp14:editId="71D6869C">
+            <wp:extent cx="5425200" cy="3686400"/>
+            <wp:effectExtent l="0" t="0" r="4445" b="0"/>
+            <wp:docPr id="2" name="Picture 2"/>
             <wp:cNvGraphicFramePr>
               <a:graphicFrameLocks xmlns:a="http://schemas.openxmlformats.org/drawingml/2006/main" noChangeAspect="1"/>
             </wp:cNvGraphicFramePr>
@@ -1351,7 +1909,7 @@
               <a:graphicData uri="http://schemas.openxmlformats.org/drawingml/2006/picture">
                 <pic:pic xmlns:pic="http://schemas.openxmlformats.org/drawingml/2006/picture">
                   <pic:nvPicPr>
-                    <pic:cNvPr id="3" name="070DD30.tmp"/>
+                    <pic:cNvPr id="2" name="004CD4B.tmp"/>
                     <pic:cNvPicPr/>
                   </pic:nvPicPr>
                   <pic:blipFill>
@@ -1369,7 +1927,7 @@
                   <pic:spPr>
                     <a:xfrm>
                       <a:off x="0" y="0"/>
-                      <a:ext cx="4942800" cy="3675600"/>
+                      <a:ext cx="5425200" cy="3686400"/>
                     </a:xfrm>
                     <a:prstGeom prst="rect">
                       <a:avLst/>
@@ -1390,14 +1948,27 @@
       <w:r>
         <w:t xml:space="preserve">Figure </w:t>
       </w:r>
-      <w:fldSimple w:instr=" SEQ Figure \* ARABIC ">
-        <w:r>
-          <w:rPr>
-            <w:noProof/>
-          </w:rPr>
-          <w:t>1</w:t>
-        </w:r>
-      </w:fldSimple>
+      <w:r>
+        <w:fldChar w:fldCharType="begin"/>
+      </w:r>
+      <w:r>
+        <w:instrText xml:space="preserve"> SEQ Figure \* ARABIC </w:instrText>
+      </w:r>
+      <w:r>
+        <w:fldChar w:fldCharType="separate"/>
+      </w:r>
+      <w:r>
+        <w:rPr>
+          <w:noProof/>
+        </w:rPr>
+        <w:t>1</w:t>
+      </w:r>
+      <w:r>
+        <w:rPr>
+          <w:noProof/>
+        </w:rPr>
+        <w:fldChar w:fldCharType="end"/>
+      </w:r>
       <w:bookmarkEnd w:id="2"/>
       <w:r>
         <w:t xml:space="preserve"> – Transects input screen, where transects</w:t>
@@ -1427,7 +1998,6 @@
         <w:t>.</w:t>
       </w:r>
     </w:p>
-    <w:p/>
     <w:p>
       <w:pPr>
         <w:keepNext/>
@@ -1439,10 +2009,10 @@
         </w:rPr>
         <w:lastRenderedPageBreak/>
         <w:drawing>
-          <wp:inline distT="0" distB="0" distL="0" distR="0" wp14:anchorId="19C4C46D" wp14:editId="2CB03D00">
-            <wp:extent cx="5731510" cy="4262120"/>
-            <wp:effectExtent l="0" t="0" r="2540" b="5080"/>
-            <wp:docPr id="10" name="Picture 10"/>
+          <wp:inline distT="0" distB="0" distL="0" distR="0" wp14:anchorId="1B5C14D2" wp14:editId="4DF70176">
+            <wp:extent cx="5425200" cy="3686400"/>
+            <wp:effectExtent l="0" t="0" r="4445" b="0"/>
+            <wp:docPr id="4" name="Picture 4"/>
             <wp:cNvGraphicFramePr>
               <a:graphicFrameLocks xmlns:a="http://schemas.openxmlformats.org/drawingml/2006/main" noChangeAspect="1"/>
             </wp:cNvGraphicFramePr>
@@ -1450,7 +2020,7 @@
               <a:graphicData uri="http://schemas.openxmlformats.org/drawingml/2006/picture">
                 <pic:pic xmlns:pic="http://schemas.openxmlformats.org/drawingml/2006/picture">
                   <pic:nvPicPr>
-                    <pic:cNvPr id="10" name="07026.tmp"/>
+                    <pic:cNvPr id="4" name="0045F0C.tmp"/>
                     <pic:cNvPicPr/>
                   </pic:nvPicPr>
                   <pic:blipFill>
@@ -1468,7 +2038,7 @@
                   <pic:spPr>
                     <a:xfrm>
                       <a:off x="0" y="0"/>
-                      <a:ext cx="5731510" cy="4262120"/>
+                      <a:ext cx="5425200" cy="3686400"/>
                     </a:xfrm>
                     <a:prstGeom prst="rect">
                       <a:avLst/>
@@ -1489,14 +2059,27 @@
       <w:r>
         <w:t xml:space="preserve">Figure </w:t>
       </w:r>
-      <w:fldSimple w:instr=" SEQ Figure \* ARABIC ">
-        <w:r>
-          <w:rPr>
-            <w:noProof/>
-          </w:rPr>
-          <w:t>2</w:t>
-        </w:r>
-      </w:fldSimple>
+      <w:r>
+        <w:fldChar w:fldCharType="begin"/>
+      </w:r>
+      <w:r>
+        <w:instrText xml:space="preserve"> SEQ Figure \* ARABIC </w:instrText>
+      </w:r>
+      <w:r>
+        <w:fldChar w:fldCharType="separate"/>
+      </w:r>
+      <w:r>
+        <w:rPr>
+          <w:noProof/>
+        </w:rPr>
+        <w:t>2</w:t>
+      </w:r>
+      <w:r>
+        <w:rPr>
+          <w:noProof/>
+        </w:rPr>
+        <w:fldChar w:fldCharType="end"/>
+      </w:r>
       <w:bookmarkEnd w:id="3"/>
       <w:r>
         <w:t xml:space="preserve"> - The transect </w:t>
@@ -1527,12 +2110,11 @@
           <w:noProof/>
           <w:lang w:eastAsia="en-GB"/>
         </w:rPr>
-        <w:lastRenderedPageBreak/>
         <w:drawing>
-          <wp:inline distT="0" distB="0" distL="0" distR="0" wp14:anchorId="0020F3B5" wp14:editId="0B321DE8">
-            <wp:extent cx="5731510" cy="4262120"/>
-            <wp:effectExtent l="0" t="0" r="2540" b="5080"/>
-            <wp:docPr id="8" name="Picture 8"/>
+          <wp:inline distT="0" distB="0" distL="0" distR="0" wp14:anchorId="38126E52" wp14:editId="17FFF033">
+            <wp:extent cx="5425200" cy="3686400"/>
+            <wp:effectExtent l="0" t="0" r="4445" b="0"/>
+            <wp:docPr id="5" name="Picture 5"/>
             <wp:cNvGraphicFramePr>
               <a:graphicFrameLocks xmlns:a="http://schemas.openxmlformats.org/drawingml/2006/main" noChangeAspect="1"/>
             </wp:cNvGraphicFramePr>
@@ -1540,7 +2122,7 @@
               <a:graphicData uri="http://schemas.openxmlformats.org/drawingml/2006/picture">
                 <pic:pic xmlns:pic="http://schemas.openxmlformats.org/drawingml/2006/picture">
                   <pic:nvPicPr>
-                    <pic:cNvPr id="8" name="070D9CB.tmp"/>
+                    <pic:cNvPr id="5" name="00435D6.tmp"/>
                     <pic:cNvPicPr/>
                   </pic:nvPicPr>
                   <pic:blipFill>
@@ -1558,7 +2140,7 @@
                   <pic:spPr>
                     <a:xfrm>
                       <a:off x="0" y="0"/>
-                      <a:ext cx="5731510" cy="4262120"/>
+                      <a:ext cx="5425200" cy="3686400"/>
                     </a:xfrm>
                     <a:prstGeom prst="rect">
                       <a:avLst/>
@@ -1579,17 +2161,72 @@
       <w:r>
         <w:t xml:space="preserve">Figure </w:t>
       </w:r>
-      <w:fldSimple w:instr=" SEQ Figure \* ARABIC ">
-        <w:r>
-          <w:rPr>
-            <w:noProof/>
-          </w:rPr>
-          <w:t>3</w:t>
-        </w:r>
-      </w:fldSimple>
+      <w:r>
+        <w:fldChar w:fldCharType="begin"/>
+      </w:r>
+      <w:r>
+        <w:instrText xml:space="preserve"> SEQ Figure \* ARABIC </w:instrText>
+      </w:r>
+      <w:r>
+        <w:fldChar w:fldCharType="separate"/>
+      </w:r>
+      <w:r>
+        <w:rPr>
+          <w:noProof/>
+        </w:rPr>
+        <w:t>3</w:t>
+      </w:r>
+      <w:r>
+        <w:rPr>
+          <w:noProof/>
+        </w:rPr>
+        <w:fldChar w:fldCharType="end"/>
+      </w:r>
       <w:bookmarkEnd w:id="4"/>
       <w:r>
-        <w:t xml:space="preserve"> - Transect summary screen after running Ecospace. Note that transect 2 crosses the one and only MPA and a few land cells. Biomass and Catch are unavailable for land cells. Catch is 0 within the MPA. Also note that the animation controls and the Save to CSV options are available once Ecospace has executed.</w:t>
+        <w:t xml:space="preserve"> - Transect summary screen after running Ecospace. </w:t>
+      </w:r>
+      <w:r>
+        <w:t xml:space="preserve">Transect 2 crosses </w:t>
+      </w:r>
+      <w:r>
+        <w:t>a land cells</w:t>
+      </w:r>
+      <w:r>
+        <w:t xml:space="preserve"> and a MPA</w:t>
+      </w:r>
+      <w:r>
+        <w:t xml:space="preserve">. </w:t>
+      </w:r>
+      <w:r>
+        <w:t xml:space="preserve">The plots show that </w:t>
+      </w:r>
+      <w:r>
+        <w:t>Biomass and Catch are unavailable for land cells</w:t>
+      </w:r>
+      <w:r>
+        <w:t>, and that c</w:t>
+      </w:r>
+      <w:r>
+        <w:t>atch</w:t>
+      </w:r>
+      <w:r>
+        <w:t xml:space="preserve">es are absent </w:t>
+      </w:r>
+      <w:r>
+        <w:t xml:space="preserve">within the MPA. </w:t>
+      </w:r>
+      <w:r>
+        <w:t>Animation of results has progressed to time step 66 of 600. The Save to CSV option</w:t>
+      </w:r>
+      <w:r>
+        <w:t xml:space="preserve"> </w:t>
+      </w:r>
+      <w:r>
+        <w:t>is enabled because</w:t>
+      </w:r>
+      <w:r>
+        <w:t xml:space="preserve"> Ecospace has executed.</w:t>
       </w:r>
     </w:p>
     <w:p>
@@ -1603,10 +2240,10 @@
         </w:rPr>
         <w:lastRenderedPageBreak/>
         <w:drawing>
-          <wp:inline distT="0" distB="0" distL="0" distR="0" wp14:anchorId="6A4E4296" wp14:editId="575D5D8A">
-            <wp:extent cx="5731510" cy="4262120"/>
-            <wp:effectExtent l="0" t="0" r="2540" b="5080"/>
-            <wp:docPr id="7" name="Picture 7"/>
+          <wp:inline distT="0" distB="0" distL="0" distR="0" wp14:anchorId="07A64DC0" wp14:editId="50AE9052">
+            <wp:extent cx="5425200" cy="3686400"/>
+            <wp:effectExtent l="0" t="0" r="4445" b="0"/>
+            <wp:docPr id="6" name="Picture 6"/>
             <wp:cNvGraphicFramePr>
               <a:graphicFrameLocks xmlns:a="http://schemas.openxmlformats.org/drawingml/2006/main" noChangeAspect="1"/>
             </wp:cNvGraphicFramePr>
@@ -1614,7 +2251,7 @@
               <a:graphicData uri="http://schemas.openxmlformats.org/drawingml/2006/picture">
                 <pic:pic xmlns:pic="http://schemas.openxmlformats.org/drawingml/2006/picture">
                   <pic:nvPicPr>
-                    <pic:cNvPr id="7" name="07022BD.tmp"/>
+                    <pic:cNvPr id="6" name="00421B4.tmp"/>
                     <pic:cNvPicPr/>
                   </pic:nvPicPr>
                   <pic:blipFill>
@@ -1632,7 +2269,7 @@
                   <pic:spPr>
                     <a:xfrm>
                       <a:off x="0" y="0"/>
-                      <a:ext cx="5731510" cy="4262120"/>
+                      <a:ext cx="5425200" cy="3686400"/>
                     </a:xfrm>
                     <a:prstGeom prst="rect">
                       <a:avLst/>
@@ -1653,14 +2290,27 @@
       <w:r>
         <w:t xml:space="preserve">Figure </w:t>
       </w:r>
-      <w:fldSimple w:instr=" SEQ Figure \* ARABIC ">
-        <w:r>
-          <w:rPr>
-            <w:noProof/>
-          </w:rPr>
-          <w:t>4</w:t>
-        </w:r>
-      </w:fldSimple>
+      <w:r>
+        <w:fldChar w:fldCharType="begin"/>
+      </w:r>
+      <w:r>
+        <w:instrText xml:space="preserve"> SEQ Figure \* ARABIC </w:instrText>
+      </w:r>
+      <w:r>
+        <w:fldChar w:fldCharType="separate"/>
+      </w:r>
+      <w:r>
+        <w:rPr>
+          <w:noProof/>
+        </w:rPr>
+        <w:t>4</w:t>
+      </w:r>
+      <w:r>
+        <w:rPr>
+          <w:noProof/>
+        </w:rPr>
+        <w:fldChar w:fldCharType="end"/>
+      </w:r>
       <w:bookmarkEnd w:id="5"/>
       <w:r>
         <w:t xml:space="preserve"> </w:t>
@@ -1678,7 +2328,6 @@
         <w:t>summary CSV files.</w:t>
       </w:r>
     </w:p>
-    <w:p/>
     <w:sectPr>
       <w:pgSz w:w="11906" w:h="16838"/>
       <w:pgMar w:top="1440" w:right="1440" w:bottom="1440" w:left="1440" w:header="708" w:footer="708" w:gutter="0"/>
@@ -1703,7 +2352,19 @@
         <w:annotationRef/>
       </w:r>
       <w:r>
-        <w:t>This can be written out much more neatly. Chris, suggestions?</w:t>
+        <w:t xml:space="preserve"> Chris, </w:t>
+      </w:r>
+      <w:r>
+        <w:t xml:space="preserve">how </w:t>
+      </w:r>
+      <w:r>
+        <w:t xml:space="preserve">should I </w:t>
+      </w:r>
+      <w:r>
+        <w:t>cite the project</w:t>
+      </w:r>
+      <w:r>
+        <w:t>?</w:t>
       </w:r>
     </w:p>
   </w:comment>
@@ -2058,6 +2719,119 @@
     </w:lvl>
   </w:abstractNum>
   <w:abstractNum w:abstractNumId="3" w15:restartNumberingAfterBreak="0">
+    <w:nsid w:val="3C37406A"/>
+    <w:multiLevelType w:val="hybridMultilevel"/>
+    <w:tmpl w:val="D93A3A42"/>
+    <w:lvl w:ilvl="0" w:tplc="08090001">
+      <w:start w:val="1"/>
+      <w:numFmt w:val="bullet"/>
+      <w:lvlText w:val=""/>
+      <w:lvlJc w:val="left"/>
+      <w:pPr>
+        <w:ind w:left="720" w:hanging="360"/>
+      </w:pPr>
+      <w:rPr>
+        <w:rFonts w:ascii="Symbol" w:hAnsi="Symbol" w:hint="default"/>
+      </w:rPr>
+    </w:lvl>
+    <w:lvl w:ilvl="1" w:tplc="08090003" w:tentative="1">
+      <w:start w:val="1"/>
+      <w:numFmt w:val="bullet"/>
+      <w:lvlText w:val="o"/>
+      <w:lvlJc w:val="left"/>
+      <w:pPr>
+        <w:ind w:left="1440" w:hanging="360"/>
+      </w:pPr>
+      <w:rPr>
+        <w:rFonts w:ascii="Courier New" w:hAnsi="Courier New" w:cs="Courier New" w:hint="default"/>
+      </w:rPr>
+    </w:lvl>
+    <w:lvl w:ilvl="2" w:tplc="08090005" w:tentative="1">
+      <w:start w:val="1"/>
+      <w:numFmt w:val="bullet"/>
+      <w:lvlText w:val=""/>
+      <w:lvlJc w:val="left"/>
+      <w:pPr>
+        <w:ind w:left="2160" w:hanging="360"/>
+      </w:pPr>
+      <w:rPr>
+        <w:rFonts w:ascii="Wingdings" w:hAnsi="Wingdings" w:hint="default"/>
+      </w:rPr>
+    </w:lvl>
+    <w:lvl w:ilvl="3" w:tplc="08090001" w:tentative="1">
+      <w:start w:val="1"/>
+      <w:numFmt w:val="bullet"/>
+      <w:lvlText w:val=""/>
+      <w:lvlJc w:val="left"/>
+      <w:pPr>
+        <w:ind w:left="2880" w:hanging="360"/>
+      </w:pPr>
+      <w:rPr>
+        <w:rFonts w:ascii="Symbol" w:hAnsi="Symbol" w:hint="default"/>
+      </w:rPr>
+    </w:lvl>
+    <w:lvl w:ilvl="4" w:tplc="08090003" w:tentative="1">
+      <w:start w:val="1"/>
+      <w:numFmt w:val="bullet"/>
+      <w:lvlText w:val="o"/>
+      <w:lvlJc w:val="left"/>
+      <w:pPr>
+        <w:ind w:left="3600" w:hanging="360"/>
+      </w:pPr>
+      <w:rPr>
+        <w:rFonts w:ascii="Courier New" w:hAnsi="Courier New" w:cs="Courier New" w:hint="default"/>
+      </w:rPr>
+    </w:lvl>
+    <w:lvl w:ilvl="5" w:tplc="08090005" w:tentative="1">
+      <w:start w:val="1"/>
+      <w:numFmt w:val="bullet"/>
+      <w:lvlText w:val=""/>
+      <w:lvlJc w:val="left"/>
+      <w:pPr>
+        <w:ind w:left="4320" w:hanging="360"/>
+      </w:pPr>
+      <w:rPr>
+        <w:rFonts w:ascii="Wingdings" w:hAnsi="Wingdings" w:hint="default"/>
+      </w:rPr>
+    </w:lvl>
+    <w:lvl w:ilvl="6" w:tplc="08090001" w:tentative="1">
+      <w:start w:val="1"/>
+      <w:numFmt w:val="bullet"/>
+      <w:lvlText w:val=""/>
+      <w:lvlJc w:val="left"/>
+      <w:pPr>
+        <w:ind w:left="5040" w:hanging="360"/>
+      </w:pPr>
+      <w:rPr>
+        <w:rFonts w:ascii="Symbol" w:hAnsi="Symbol" w:hint="default"/>
+      </w:rPr>
+    </w:lvl>
+    <w:lvl w:ilvl="7" w:tplc="08090003" w:tentative="1">
+      <w:start w:val="1"/>
+      <w:numFmt w:val="bullet"/>
+      <w:lvlText w:val="o"/>
+      <w:lvlJc w:val="left"/>
+      <w:pPr>
+        <w:ind w:left="5760" w:hanging="360"/>
+      </w:pPr>
+      <w:rPr>
+        <w:rFonts w:ascii="Courier New" w:hAnsi="Courier New" w:cs="Courier New" w:hint="default"/>
+      </w:rPr>
+    </w:lvl>
+    <w:lvl w:ilvl="8" w:tplc="08090005" w:tentative="1">
+      <w:start w:val="1"/>
+      <w:numFmt w:val="bullet"/>
+      <w:lvlText w:val=""/>
+      <w:lvlJc w:val="left"/>
+      <w:pPr>
+        <w:ind w:left="6480" w:hanging="360"/>
+      </w:pPr>
+      <w:rPr>
+        <w:rFonts w:ascii="Wingdings" w:hAnsi="Wingdings" w:hint="default"/>
+      </w:rPr>
+    </w:lvl>
+  </w:abstractNum>
+  <w:abstractNum w:abstractNumId="4" w15:restartNumberingAfterBreak="0">
     <w:nsid w:val="40D02130"/>
     <w:multiLevelType w:val="hybridMultilevel"/>
     <w:tmpl w:val="185CC99E"/>
@@ -2170,8 +2944,121 @@
       </w:rPr>
     </w:lvl>
   </w:abstractNum>
+  <w:abstractNum w:abstractNumId="5" w15:restartNumberingAfterBreak="0">
+    <w:nsid w:val="572D17D2"/>
+    <w:multiLevelType w:val="hybridMultilevel"/>
+    <w:tmpl w:val="16A28CE0"/>
+    <w:lvl w:ilvl="0" w:tplc="08090001">
+      <w:start w:val="1"/>
+      <w:numFmt w:val="bullet"/>
+      <w:lvlText w:val=""/>
+      <w:lvlJc w:val="left"/>
+      <w:pPr>
+        <w:ind w:left="720" w:hanging="360"/>
+      </w:pPr>
+      <w:rPr>
+        <w:rFonts w:ascii="Symbol" w:hAnsi="Symbol" w:hint="default"/>
+      </w:rPr>
+    </w:lvl>
+    <w:lvl w:ilvl="1" w:tplc="08090003" w:tentative="1">
+      <w:start w:val="1"/>
+      <w:numFmt w:val="bullet"/>
+      <w:lvlText w:val="o"/>
+      <w:lvlJc w:val="left"/>
+      <w:pPr>
+        <w:ind w:left="1440" w:hanging="360"/>
+      </w:pPr>
+      <w:rPr>
+        <w:rFonts w:ascii="Courier New" w:hAnsi="Courier New" w:cs="Courier New" w:hint="default"/>
+      </w:rPr>
+    </w:lvl>
+    <w:lvl w:ilvl="2" w:tplc="08090005" w:tentative="1">
+      <w:start w:val="1"/>
+      <w:numFmt w:val="bullet"/>
+      <w:lvlText w:val=""/>
+      <w:lvlJc w:val="left"/>
+      <w:pPr>
+        <w:ind w:left="2160" w:hanging="360"/>
+      </w:pPr>
+      <w:rPr>
+        <w:rFonts w:ascii="Wingdings" w:hAnsi="Wingdings" w:hint="default"/>
+      </w:rPr>
+    </w:lvl>
+    <w:lvl w:ilvl="3" w:tplc="08090001" w:tentative="1">
+      <w:start w:val="1"/>
+      <w:numFmt w:val="bullet"/>
+      <w:lvlText w:val=""/>
+      <w:lvlJc w:val="left"/>
+      <w:pPr>
+        <w:ind w:left="2880" w:hanging="360"/>
+      </w:pPr>
+      <w:rPr>
+        <w:rFonts w:ascii="Symbol" w:hAnsi="Symbol" w:hint="default"/>
+      </w:rPr>
+    </w:lvl>
+    <w:lvl w:ilvl="4" w:tplc="08090003" w:tentative="1">
+      <w:start w:val="1"/>
+      <w:numFmt w:val="bullet"/>
+      <w:lvlText w:val="o"/>
+      <w:lvlJc w:val="left"/>
+      <w:pPr>
+        <w:ind w:left="3600" w:hanging="360"/>
+      </w:pPr>
+      <w:rPr>
+        <w:rFonts w:ascii="Courier New" w:hAnsi="Courier New" w:cs="Courier New" w:hint="default"/>
+      </w:rPr>
+    </w:lvl>
+    <w:lvl w:ilvl="5" w:tplc="08090005" w:tentative="1">
+      <w:start w:val="1"/>
+      <w:numFmt w:val="bullet"/>
+      <w:lvlText w:val=""/>
+      <w:lvlJc w:val="left"/>
+      <w:pPr>
+        <w:ind w:left="4320" w:hanging="360"/>
+      </w:pPr>
+      <w:rPr>
+        <w:rFonts w:ascii="Wingdings" w:hAnsi="Wingdings" w:hint="default"/>
+      </w:rPr>
+    </w:lvl>
+    <w:lvl w:ilvl="6" w:tplc="08090001" w:tentative="1">
+      <w:start w:val="1"/>
+      <w:numFmt w:val="bullet"/>
+      <w:lvlText w:val=""/>
+      <w:lvlJc w:val="left"/>
+      <w:pPr>
+        <w:ind w:left="5040" w:hanging="360"/>
+      </w:pPr>
+      <w:rPr>
+        <w:rFonts w:ascii="Symbol" w:hAnsi="Symbol" w:hint="default"/>
+      </w:rPr>
+    </w:lvl>
+    <w:lvl w:ilvl="7" w:tplc="08090003" w:tentative="1">
+      <w:start w:val="1"/>
+      <w:numFmt w:val="bullet"/>
+      <w:lvlText w:val="o"/>
+      <w:lvlJc w:val="left"/>
+      <w:pPr>
+        <w:ind w:left="5760" w:hanging="360"/>
+      </w:pPr>
+      <w:rPr>
+        <w:rFonts w:ascii="Courier New" w:hAnsi="Courier New" w:cs="Courier New" w:hint="default"/>
+      </w:rPr>
+    </w:lvl>
+    <w:lvl w:ilvl="8" w:tplc="08090005" w:tentative="1">
+      <w:start w:val="1"/>
+      <w:numFmt w:val="bullet"/>
+      <w:lvlText w:val=""/>
+      <w:lvlJc w:val="left"/>
+      <w:pPr>
+        <w:ind w:left="6480" w:hanging="360"/>
+      </w:pPr>
+      <w:rPr>
+        <w:rFonts w:ascii="Wingdings" w:hAnsi="Wingdings" w:hint="default"/>
+      </w:rPr>
+    </w:lvl>
+  </w:abstractNum>
   <w:num w:numId="1">
-    <w:abstractNumId w:val="3"/>
+    <w:abstractNumId w:val="4"/>
   </w:num>
   <w:num w:numId="2">
     <w:abstractNumId w:val="2"/>
@@ -2181,6 +3068,12 @@
   </w:num>
   <w:num w:numId="4">
     <w:abstractNumId w:val="1"/>
+  </w:num>
+  <w:num w:numId="5">
+    <w:abstractNumId w:val="3"/>
+  </w:num>
+  <w:num w:numId="6">
+    <w:abstractNumId w:val="5"/>
   </w:num>
 </w:numbering>
 </file>
@@ -3150,7 +4043,7 @@
 </file>
 
 <file path=customXml/itemProps1.xml><?xml version="1.0" encoding="utf-8"?>
-<ds:datastoreItem xmlns:ds="http://schemas.openxmlformats.org/officeDocument/2006/customXml" ds:itemID="{58085699-733E-4245-8362-EA8294DFDDA2}">
+<ds:datastoreItem xmlns:ds="http://schemas.openxmlformats.org/officeDocument/2006/customXml" ds:itemID="{644956B4-F63F-4879-910A-D3123706CA5A}">
   <ds:schemaRefs>
     <ds:schemaRef ds:uri="http://schemas.openxmlformats.org/officeDocument/2006/bibliography"/>
   </ds:schemaRefs>

</xml_diff>

<commit_message>
Transects persistent in XML file (ugh) Can edit transect name and points Updated documentation to reflect these changes
git-svn-id: https://sources.ecopath.org/svn/Ecopath/trunk/Ecopath6@14647 a725721c-0ed6-864e-a6a8-02c2a1988c9d
</commit_message>
<xml_diff>
--- a/Sources Internal/Plugins/EwETransectExtractionPlugin/Documentation/Transects.docx
+++ b/Sources Internal/Plugins/EwETransectExtractionPlugin/Documentation/Transects.docx
@@ -47,399 +47,13 @@
         <w:rPr>
           <w:lang w:eastAsia="en-GB"/>
         </w:rPr>
-        <w:t xml:space="preserve"> 26 April 2017</w:t>
-      </w:r>
-    </w:p>
-    <w:p>
-      <w:pPr>
-        <w:pStyle w:val="Heading1"/>
-        <w:rPr>
-          <w:lang w:eastAsia="en-GB"/>
-        </w:rPr>
-      </w:pPr>
-      <w:r>
-        <w:rPr>
-          <w:lang w:eastAsia="en-GB"/>
-        </w:rPr>
-        <w:t>Scope</w:t>
-      </w:r>
-    </w:p>
-    <w:p>
-      <w:pPr>
-        <w:rPr>
-          <w:lang w:eastAsia="en-GB"/>
-        </w:rPr>
-      </w:pPr>
-      <w:r>
-        <w:rPr>
-          <w:lang w:eastAsia="en-GB"/>
-        </w:rPr>
-        <w:t xml:space="preserve">Transects, like regions, are a mechanism to extract results for selected map cells from Ecospace. Where regions provide area averages for a cluster of cells, transects retain the actual cell values which can be </w:t>
-      </w:r>
-      <w:r>
-        <w:rPr>
-          <w:lang w:eastAsia="en-GB"/>
-        </w:rPr>
-        <w:t xml:space="preserve">plotted </w:t>
-      </w:r>
-      <w:r>
-        <w:rPr>
-          <w:lang w:eastAsia="en-GB"/>
-        </w:rPr>
-        <w:t>on screen, and can be written to file.</w:t>
-      </w:r>
-    </w:p>
-    <w:p>
-      <w:pPr>
-        <w:pStyle w:val="Heading1"/>
-        <w:rPr>
-          <w:lang w:eastAsia="en-GB"/>
-        </w:rPr>
-      </w:pPr>
-      <w:r>
-        <w:rPr>
-          <w:lang w:eastAsia="en-GB"/>
-        </w:rPr>
-        <w:t>Requirements</w:t>
-      </w:r>
-    </w:p>
-    <w:p>
-      <w:pPr>
-        <w:rPr>
-          <w:lang w:eastAsia="en-GB"/>
-        </w:rPr>
-      </w:pPr>
-      <w:r>
-        <w:rPr>
-          <w:lang w:eastAsia="en-GB"/>
-        </w:rPr>
-        <w:t xml:space="preserve">The </w:t>
-      </w:r>
-      <w:r>
-        <w:rPr>
-          <w:lang w:eastAsia="en-GB"/>
-        </w:rPr>
-        <w:t>EwETransectExtractionPlugin</w:t>
-      </w:r>
-      <w:r>
-        <w:rPr>
-          <w:lang w:eastAsia="en-GB"/>
-        </w:rPr>
-        <w:t xml:space="preserve"> is needed to use the transect logic.</w:t>
-      </w:r>
-    </w:p>
-    <w:p>
-      <w:pPr>
-        <w:pStyle w:val="Heading1"/>
-        <w:rPr>
-          <w:lang w:eastAsia="en-GB"/>
-        </w:rPr>
-      </w:pPr>
-      <w:r>
-        <w:rPr>
-          <w:lang w:eastAsia="en-GB"/>
-        </w:rPr>
-        <w:t>Usage</w:t>
-      </w:r>
-    </w:p>
-    <w:p>
-      <w:pPr>
-        <w:pStyle w:val="Heading2"/>
-        <w:rPr>
-          <w:lang w:eastAsia="en-GB"/>
-        </w:rPr>
-      </w:pPr>
-      <w:r>
-        <w:rPr>
-          <w:lang w:eastAsia="en-GB"/>
-        </w:rPr>
-        <w:t>Define transects</w:t>
-      </w:r>
-    </w:p>
-    <w:p>
-      <w:pPr>
-        <w:rPr>
-          <w:lang w:eastAsia="en-GB"/>
-        </w:rPr>
-      </w:pPr>
-      <w:r>
-        <w:rPr>
-          <w:lang w:eastAsia="en-GB"/>
-        </w:rPr>
-        <w:t xml:space="preserve">Transects are defined in the </w:t>
-      </w:r>
-      <w:r>
-        <w:rPr>
-          <w:lang w:eastAsia="en-GB"/>
-        </w:rPr>
-        <w:t>Ecospace input form (Navigator &gt; Ecospace &gt; Input &gt; Transects</w:t>
-      </w:r>
-      <w:r>
-        <w:rPr>
-          <w:lang w:eastAsia="en-GB"/>
-        </w:rPr>
-        <w:t>;</w:t>
-      </w:r>
-      <w:r>
-        <w:rPr>
-          <w:lang w:eastAsia="en-GB"/>
-        </w:rPr>
-        <w:t xml:space="preserve"> </w:t>
-      </w:r>
-      <w:r>
-        <w:rPr>
-          <w:lang w:eastAsia="en-GB"/>
-        </w:rPr>
-        <w:fldChar w:fldCharType="begin"/>
-      </w:r>
-      <w:r>
-        <w:rPr>
-          <w:lang w:eastAsia="en-GB"/>
-        </w:rPr>
-        <w:instrText xml:space="preserve"> REF _Ref480965781 \h </w:instrText>
-      </w:r>
-      <w:r>
-        <w:rPr>
-          <w:lang w:eastAsia="en-GB"/>
-        </w:rPr>
-      </w:r>
-      <w:r>
-        <w:rPr>
-          <w:lang w:eastAsia="en-GB"/>
-        </w:rPr>
-        <w:fldChar w:fldCharType="separate"/>
-      </w:r>
-      <w:r>
-        <w:t xml:space="preserve">Figure </w:t>
-      </w:r>
-      <w:r>
-        <w:rPr>
-          <w:noProof/>
-        </w:rPr>
-        <w:t>1</w:t>
-      </w:r>
-      <w:r>
-        <w:rPr>
-          <w:lang w:eastAsia="en-GB"/>
-        </w:rPr>
-        <w:fldChar w:fldCharType="end"/>
-      </w:r>
-      <w:r>
-        <w:rPr>
-          <w:lang w:eastAsia="en-GB"/>
-        </w:rPr>
-        <w:t>)</w:t>
-      </w:r>
-      <w:r>
-        <w:rPr>
-          <w:lang w:eastAsia="en-GB"/>
-        </w:rPr>
-        <w:t>. A transect is created by clicking on the map</w:t>
-      </w:r>
-      <w:r>
-        <w:rPr>
-          <w:lang w:eastAsia="en-GB"/>
-        </w:rPr>
-        <w:t xml:space="preserve"> which sets the start location of a new transect</w:t>
-      </w:r>
-      <w:r>
-        <w:rPr>
-          <w:lang w:eastAsia="en-GB"/>
-        </w:rPr>
-        <w:t xml:space="preserve">, and </w:t>
-      </w:r>
-      <w:r>
-        <w:rPr>
-          <w:lang w:eastAsia="en-GB"/>
-        </w:rPr>
-        <w:t xml:space="preserve">moving the mouse while keeping the left mouse button down to </w:t>
-      </w:r>
-      <w:r>
-        <w:rPr>
-          <w:lang w:eastAsia="en-GB"/>
-        </w:rPr>
-        <w:t xml:space="preserve">draw </w:t>
-      </w:r>
-      <w:r>
-        <w:rPr>
-          <w:lang w:eastAsia="en-GB"/>
-        </w:rPr>
-        <w:t xml:space="preserve">the end location of the transect. </w:t>
-      </w:r>
-      <w:r>
-        <w:rPr>
-          <w:lang w:eastAsia="en-GB"/>
-        </w:rPr>
-        <w:t>Release the left mouse button to finish the transect.</w:t>
-      </w:r>
-    </w:p>
-    <w:p>
-      <w:pPr>
-        <w:rPr>
-          <w:lang w:eastAsia="en-GB"/>
-        </w:rPr>
-      </w:pPr>
-      <w:r>
-        <w:rPr>
-          <w:lang w:eastAsia="en-GB"/>
-        </w:rPr>
-        <w:t xml:space="preserve">Transect </w:t>
-      </w:r>
-      <w:r>
-        <w:rPr>
-          <w:lang w:eastAsia="en-GB"/>
-        </w:rPr>
-        <w:t xml:space="preserve">end points </w:t>
-      </w:r>
-      <w:r>
-        <w:rPr>
-          <w:lang w:eastAsia="en-GB"/>
-        </w:rPr>
-        <w:t>can be clicked and dragged, and the entire transect line can be clicked and dragged as well.</w:t>
-      </w:r>
-    </w:p>
-    <w:p>
-      <w:pPr>
-        <w:rPr>
-          <w:lang w:eastAsia="en-GB"/>
-        </w:rPr>
-      </w:pPr>
-      <w:r>
-        <w:rPr>
-          <w:lang w:eastAsia="en-GB"/>
-        </w:rPr>
-        <w:t>The selected transect is drawn using the EwE system colour ‘highlight’ (orange by default), and the cells that the transect crosses are drawn as well. Non-selected transects are drawn using the EwE system colour ‘</w:t>
-      </w:r>
-      <w:r>
-        <w:rPr>
-          <w:lang w:eastAsia="en-GB"/>
-        </w:rPr>
-        <w:t>r</w:t>
-      </w:r>
-      <w:r>
-        <w:rPr>
-          <w:lang w:eastAsia="en-GB"/>
-        </w:rPr>
-        <w:t>ead</w:t>
-      </w:r>
-      <w:r>
-        <w:rPr>
-          <w:lang w:eastAsia="en-GB"/>
-        </w:rPr>
-        <w:t>o</w:t>
-      </w:r>
-      <w:r>
-        <w:rPr>
-          <w:lang w:eastAsia="en-GB"/>
-        </w:rPr>
-        <w:t xml:space="preserve">nly’ (bluish-grey by default). EwE system colours be changed via Menu &gt; Tools &gt; Options &gt; </w:t>
-      </w:r>
-      <w:r>
-        <w:rPr>
-          <w:lang w:eastAsia="en-GB"/>
-        </w:rPr>
-        <w:t xml:space="preserve">Display &gt; </w:t>
-      </w:r>
-      <w:r>
-        <w:rPr>
-          <w:lang w:eastAsia="en-GB"/>
-        </w:rPr>
-        <w:t>Colours.</w:t>
-      </w:r>
-    </w:p>
-    <w:p>
-      <w:pPr>
-        <w:rPr>
-          <w:lang w:eastAsia="en-GB"/>
-        </w:rPr>
-      </w:pPr>
-      <w:r>
-        <w:rPr>
-          <w:lang w:eastAsia="en-GB"/>
-        </w:rPr>
-        <w:t xml:space="preserve">A selected </w:t>
-      </w:r>
-      <w:r>
-        <w:rPr>
-          <w:lang w:eastAsia="en-GB"/>
-        </w:rPr>
-        <w:t>transect can be deleted by pressing the [Delete transect] button</w:t>
-      </w:r>
-      <w:r>
-        <w:rPr>
-          <w:lang w:eastAsia="en-GB"/>
-        </w:rPr>
-        <w:t>.</w:t>
-      </w:r>
-    </w:p>
-    <w:p>
-      <w:pPr>
-        <w:rPr>
-          <w:lang w:eastAsia="en-GB"/>
-        </w:rPr>
-      </w:pPr>
-      <w:r>
-        <w:rPr>
-          <w:lang w:eastAsia="en-GB"/>
-        </w:rPr>
-        <w:t>Only one transect can be selected at the time.</w:t>
-      </w:r>
-    </w:p>
-    <w:p>
-      <w:pPr>
-        <w:pStyle w:val="Heading2"/>
-        <w:rPr>
-          <w:lang w:eastAsia="en-GB"/>
-        </w:rPr>
-      </w:pPr>
-      <w:r>
-        <w:rPr>
-          <w:lang w:eastAsia="en-GB"/>
-        </w:rPr>
-        <w:t>Gathering transect summaries</w:t>
-      </w:r>
-    </w:p>
-    <w:p>
-      <w:pPr>
-        <w:rPr>
-          <w:lang w:eastAsia="en-GB"/>
-        </w:rPr>
-      </w:pPr>
-      <w:r>
-        <w:rPr>
-          <w:lang w:eastAsia="en-GB"/>
-        </w:rPr>
-        <w:t>Transect summary data is collected w</w:t>
-      </w:r>
-      <w:r>
-        <w:rPr>
-          <w:lang w:eastAsia="en-GB"/>
-        </w:rPr>
-        <w:t xml:space="preserve">hen Ecospace </w:t>
-      </w:r>
-      <w:r>
-        <w:rPr>
-          <w:lang w:eastAsia="en-GB"/>
-        </w:rPr>
-        <w:t>runs.</w:t>
-      </w:r>
-      <w:r>
-        <w:rPr>
-          <w:lang w:eastAsia="en-GB"/>
-        </w:rPr>
-        <w:t xml:space="preserve"> </w:t>
-      </w:r>
-      <w:r>
-        <w:rPr>
-          <w:lang w:eastAsia="en-GB"/>
-        </w:rPr>
-        <w:t xml:space="preserve">Summary data for a transect is discarded </w:t>
-      </w:r>
-      <w:r>
-        <w:rPr>
-          <w:lang w:eastAsia="en-GB"/>
-        </w:rPr>
-        <w:t xml:space="preserve">once </w:t>
+        <w:t xml:space="preserve"> 2</w:t>
+      </w:r>
+      <w:r>
+        <w:rPr>
+          <w:lang w:eastAsia="en-GB"/>
+        </w:rPr>
+        <w:t>7</w:t>
       </w:r>
       <w:bookmarkStart w:id="0" w:name="_GoBack"/>
       <w:bookmarkEnd w:id="0"/>
@@ -447,13 +61,486 @@
         <w:rPr>
           <w:lang w:eastAsia="en-GB"/>
         </w:rPr>
-        <w:t xml:space="preserve">a </w:t>
-      </w:r>
-      <w:r>
-        <w:rPr>
-          <w:lang w:eastAsia="en-GB"/>
-        </w:rPr>
-        <w:t xml:space="preserve">transect is </w:t>
+        <w:t xml:space="preserve"> April 2017</w:t>
+      </w:r>
+    </w:p>
+    <w:p>
+      <w:pPr>
+        <w:pStyle w:val="Heading1"/>
+        <w:rPr>
+          <w:lang w:eastAsia="en-GB"/>
+        </w:rPr>
+      </w:pPr>
+      <w:r>
+        <w:rPr>
+          <w:lang w:eastAsia="en-GB"/>
+        </w:rPr>
+        <w:t>Scope</w:t>
+      </w:r>
+    </w:p>
+    <w:p>
+      <w:pPr>
+        <w:rPr>
+          <w:lang w:eastAsia="en-GB"/>
+        </w:rPr>
+      </w:pPr>
+      <w:r>
+        <w:rPr>
+          <w:lang w:eastAsia="en-GB"/>
+        </w:rPr>
+        <w:t xml:space="preserve">Transects, like regions, are a mechanism to extract results for selected map cells from Ecospace. Where regions provide area averages for a cluster of cells, transects retain the actual cell values which can be </w:t>
+      </w:r>
+      <w:r>
+        <w:rPr>
+          <w:lang w:eastAsia="en-GB"/>
+        </w:rPr>
+        <w:t xml:space="preserve">plotted </w:t>
+      </w:r>
+      <w:r>
+        <w:rPr>
+          <w:lang w:eastAsia="en-GB"/>
+        </w:rPr>
+        <w:t>on screen, and can be written to file.</w:t>
+      </w:r>
+    </w:p>
+    <w:p>
+      <w:pPr>
+        <w:pStyle w:val="Heading1"/>
+        <w:rPr>
+          <w:lang w:eastAsia="en-GB"/>
+        </w:rPr>
+      </w:pPr>
+      <w:r>
+        <w:rPr>
+          <w:lang w:eastAsia="en-GB"/>
+        </w:rPr>
+        <w:t>Requirements</w:t>
+      </w:r>
+    </w:p>
+    <w:p>
+      <w:pPr>
+        <w:rPr>
+          <w:lang w:eastAsia="en-GB"/>
+        </w:rPr>
+      </w:pPr>
+      <w:r>
+        <w:rPr>
+          <w:lang w:eastAsia="en-GB"/>
+        </w:rPr>
+        <w:t xml:space="preserve">The </w:t>
+      </w:r>
+      <w:r>
+        <w:rPr>
+          <w:lang w:eastAsia="en-GB"/>
+        </w:rPr>
+        <w:t>EwETransectExtractionPlugin</w:t>
+      </w:r>
+      <w:r>
+        <w:rPr>
+          <w:lang w:eastAsia="en-GB"/>
+        </w:rPr>
+        <w:t xml:space="preserve"> is needed to use the transect logic.</w:t>
+      </w:r>
+    </w:p>
+    <w:p>
+      <w:pPr>
+        <w:pStyle w:val="Heading1"/>
+        <w:rPr>
+          <w:lang w:eastAsia="en-GB"/>
+        </w:rPr>
+      </w:pPr>
+      <w:r>
+        <w:rPr>
+          <w:lang w:eastAsia="en-GB"/>
+        </w:rPr>
+        <w:t>Usage</w:t>
+      </w:r>
+    </w:p>
+    <w:p>
+      <w:pPr>
+        <w:pStyle w:val="Heading2"/>
+        <w:rPr>
+          <w:lang w:eastAsia="en-GB"/>
+        </w:rPr>
+      </w:pPr>
+      <w:r>
+        <w:rPr>
+          <w:lang w:eastAsia="en-GB"/>
+        </w:rPr>
+        <w:t>Creating</w:t>
+      </w:r>
+      <w:r>
+        <w:rPr>
+          <w:lang w:eastAsia="en-GB"/>
+        </w:rPr>
+        <w:t>, edit</w:t>
+      </w:r>
+      <w:r>
+        <w:rPr>
+          <w:lang w:eastAsia="en-GB"/>
+        </w:rPr>
+        <w:t>ing and deleting</w:t>
+      </w:r>
+      <w:r>
+        <w:rPr>
+          <w:lang w:eastAsia="en-GB"/>
+        </w:rPr>
+        <w:t xml:space="preserve"> transects</w:t>
+      </w:r>
+    </w:p>
+    <w:p>
+      <w:pPr>
+        <w:rPr>
+          <w:lang w:eastAsia="en-GB"/>
+        </w:rPr>
+      </w:pPr>
+      <w:r>
+        <w:rPr>
+          <w:lang w:eastAsia="en-GB"/>
+        </w:rPr>
+        <w:t xml:space="preserve">Transects are defined in the </w:t>
+      </w:r>
+      <w:r>
+        <w:rPr>
+          <w:lang w:eastAsia="en-GB"/>
+        </w:rPr>
+        <w:t>Ecospace input form (Navigator &gt; Ecospace &gt; Input &gt; Transects</w:t>
+      </w:r>
+      <w:r>
+        <w:rPr>
+          <w:lang w:eastAsia="en-GB"/>
+        </w:rPr>
+        <w:t>;</w:t>
+      </w:r>
+      <w:r>
+        <w:rPr>
+          <w:lang w:eastAsia="en-GB"/>
+        </w:rPr>
+        <w:t xml:space="preserve"> </w:t>
+      </w:r>
+      <w:r>
+        <w:rPr>
+          <w:lang w:eastAsia="en-GB"/>
+        </w:rPr>
+        <w:fldChar w:fldCharType="begin"/>
+      </w:r>
+      <w:r>
+        <w:rPr>
+          <w:lang w:eastAsia="en-GB"/>
+        </w:rPr>
+        <w:instrText xml:space="preserve"> REF _Ref480965781 \h </w:instrText>
+      </w:r>
+      <w:r>
+        <w:rPr>
+          <w:lang w:eastAsia="en-GB"/>
+        </w:rPr>
+      </w:r>
+      <w:r>
+        <w:rPr>
+          <w:lang w:eastAsia="en-GB"/>
+        </w:rPr>
+        <w:fldChar w:fldCharType="separate"/>
+      </w:r>
+      <w:r>
+        <w:t xml:space="preserve">Figure </w:t>
+      </w:r>
+      <w:r>
+        <w:rPr>
+          <w:noProof/>
+        </w:rPr>
+        <w:t>1</w:t>
+      </w:r>
+      <w:r>
+        <w:rPr>
+          <w:lang w:eastAsia="en-GB"/>
+        </w:rPr>
+        <w:fldChar w:fldCharType="end"/>
+      </w:r>
+      <w:r>
+        <w:rPr>
+          <w:lang w:eastAsia="en-GB"/>
+        </w:rPr>
+        <w:t>)</w:t>
+      </w:r>
+      <w:r>
+        <w:rPr>
+          <w:lang w:eastAsia="en-GB"/>
+        </w:rPr>
+        <w:t>. A transect is created by clicking on the map</w:t>
+      </w:r>
+      <w:r>
+        <w:rPr>
+          <w:lang w:eastAsia="en-GB"/>
+        </w:rPr>
+        <w:t xml:space="preserve"> which sets the start location of a new transect</w:t>
+      </w:r>
+      <w:r>
+        <w:rPr>
+          <w:lang w:eastAsia="en-GB"/>
+        </w:rPr>
+        <w:t xml:space="preserve">, and </w:t>
+      </w:r>
+      <w:r>
+        <w:rPr>
+          <w:lang w:eastAsia="en-GB"/>
+        </w:rPr>
+        <w:t xml:space="preserve">moving the mouse while keeping the left mouse button down to </w:t>
+      </w:r>
+      <w:r>
+        <w:rPr>
+          <w:lang w:eastAsia="en-GB"/>
+        </w:rPr>
+        <w:t xml:space="preserve">draw </w:t>
+      </w:r>
+      <w:r>
+        <w:rPr>
+          <w:lang w:eastAsia="en-GB"/>
+        </w:rPr>
+        <w:t xml:space="preserve">the end location of the transect. </w:t>
+      </w:r>
+      <w:r>
+        <w:rPr>
+          <w:lang w:eastAsia="en-GB"/>
+        </w:rPr>
+        <w:t>Release the left mouse button to finish the transect.</w:t>
+      </w:r>
+    </w:p>
+    <w:p>
+      <w:pPr>
+        <w:rPr>
+          <w:lang w:eastAsia="en-GB"/>
+        </w:rPr>
+      </w:pPr>
+      <w:r>
+        <w:rPr>
+          <w:lang w:eastAsia="en-GB"/>
+        </w:rPr>
+        <w:t xml:space="preserve">Transect </w:t>
+      </w:r>
+      <w:r>
+        <w:rPr>
+          <w:lang w:eastAsia="en-GB"/>
+        </w:rPr>
+        <w:t xml:space="preserve">end points </w:t>
+      </w:r>
+      <w:r>
+        <w:rPr>
+          <w:lang w:eastAsia="en-GB"/>
+        </w:rPr>
+        <w:t>can be clicked and dragged, and the entire transect line can be clicked and dragged as well.</w:t>
+      </w:r>
+    </w:p>
+    <w:p>
+      <w:pPr>
+        <w:rPr>
+          <w:lang w:eastAsia="en-GB"/>
+        </w:rPr>
+      </w:pPr>
+      <w:r>
+        <w:rPr>
+          <w:lang w:eastAsia="en-GB"/>
+        </w:rPr>
+        <w:t>The selected transect is drawn using the EwE system colour ‘highlight’ (orange by default), and the cells that the transect crosses are drawn as well. Non-selected transects are drawn using the EwE system colour ‘</w:t>
+      </w:r>
+      <w:r>
+        <w:rPr>
+          <w:lang w:eastAsia="en-GB"/>
+        </w:rPr>
+        <w:t>r</w:t>
+      </w:r>
+      <w:r>
+        <w:rPr>
+          <w:lang w:eastAsia="en-GB"/>
+        </w:rPr>
+        <w:t>ead</w:t>
+      </w:r>
+      <w:r>
+        <w:rPr>
+          <w:lang w:eastAsia="en-GB"/>
+        </w:rPr>
+        <w:t>o</w:t>
+      </w:r>
+      <w:r>
+        <w:rPr>
+          <w:lang w:eastAsia="en-GB"/>
+        </w:rPr>
+        <w:t xml:space="preserve">nly’ (bluish-grey by default). EwE system colours be changed via Menu &gt; Tools &gt; Options &gt; </w:t>
+      </w:r>
+      <w:r>
+        <w:rPr>
+          <w:lang w:eastAsia="en-GB"/>
+        </w:rPr>
+        <w:t xml:space="preserve">Display &gt; </w:t>
+      </w:r>
+      <w:r>
+        <w:rPr>
+          <w:lang w:eastAsia="en-GB"/>
+        </w:rPr>
+        <w:t>Colours.</w:t>
+      </w:r>
+    </w:p>
+    <w:p>
+      <w:pPr>
+        <w:rPr>
+          <w:lang w:eastAsia="en-GB"/>
+        </w:rPr>
+      </w:pPr>
+      <w:r>
+        <w:rPr>
+          <w:lang w:eastAsia="en-GB"/>
+        </w:rPr>
+        <w:t xml:space="preserve">A selected </w:t>
+      </w:r>
+      <w:r>
+        <w:rPr>
+          <w:lang w:eastAsia="en-GB"/>
+        </w:rPr>
+        <w:t>transect can be deleted by pressing the [Delete transect] button</w:t>
+      </w:r>
+      <w:r>
+        <w:rPr>
+          <w:lang w:eastAsia="en-GB"/>
+        </w:rPr>
+        <w:t>.</w:t>
+      </w:r>
+    </w:p>
+    <w:p>
+      <w:pPr>
+        <w:rPr>
+          <w:lang w:eastAsia="en-GB"/>
+        </w:rPr>
+      </w:pPr>
+      <w:r>
+        <w:rPr>
+          <w:lang w:eastAsia="en-GB"/>
+        </w:rPr>
+        <w:t>Only one transect can be selected at the time.</w:t>
+      </w:r>
+    </w:p>
+    <w:p>
+      <w:pPr>
+        <w:rPr>
+          <w:lang w:eastAsia="en-GB"/>
+        </w:rPr>
+      </w:pPr>
+      <w:r>
+        <w:rPr>
+          <w:lang w:eastAsia="en-GB"/>
+        </w:rPr>
+        <w:t>When double-clicking a transect in the transects list, the edit transect form opens up where the transect can be renamed, and its start and end point can be edited numerically</w:t>
+      </w:r>
+      <w:r>
+        <w:rPr>
+          <w:lang w:eastAsia="en-GB"/>
+        </w:rPr>
+        <w:t xml:space="preserve"> (</w:t>
+      </w:r>
+      <w:r>
+        <w:rPr>
+          <w:lang w:eastAsia="en-GB"/>
+        </w:rPr>
+        <w:fldChar w:fldCharType="begin"/>
+      </w:r>
+      <w:r>
+        <w:rPr>
+          <w:lang w:eastAsia="en-GB"/>
+        </w:rPr>
+        <w:instrText xml:space="preserve"> REF _Ref481095433 \h </w:instrText>
+      </w:r>
+      <w:r>
+        <w:rPr>
+          <w:lang w:eastAsia="en-GB"/>
+        </w:rPr>
+      </w:r>
+      <w:r>
+        <w:rPr>
+          <w:lang w:eastAsia="en-GB"/>
+        </w:rPr>
+        <w:fldChar w:fldCharType="separate"/>
+      </w:r>
+      <w:r>
+        <w:t xml:space="preserve">Figure </w:t>
+      </w:r>
+      <w:r>
+        <w:rPr>
+          <w:noProof/>
+        </w:rPr>
+        <w:t>2</w:t>
+      </w:r>
+      <w:r>
+        <w:rPr>
+          <w:lang w:eastAsia="en-GB"/>
+        </w:rPr>
+        <w:fldChar w:fldCharType="end"/>
+      </w:r>
+      <w:r>
+        <w:rPr>
+          <w:lang w:eastAsia="en-GB"/>
+        </w:rPr>
+        <w:t>)</w:t>
+      </w:r>
+      <w:r>
+        <w:rPr>
+          <w:lang w:eastAsia="en-GB"/>
+        </w:rPr>
+        <w:t>.</w:t>
+      </w:r>
+    </w:p>
+    <w:p>
+      <w:pPr>
+        <w:pStyle w:val="Heading2"/>
+        <w:rPr>
+          <w:lang w:eastAsia="en-GB"/>
+        </w:rPr>
+      </w:pPr>
+      <w:r>
+        <w:rPr>
+          <w:lang w:eastAsia="en-GB"/>
+        </w:rPr>
+        <w:t>Gathering transect summaries</w:t>
+      </w:r>
+    </w:p>
+    <w:p>
+      <w:pPr>
+        <w:rPr>
+          <w:lang w:eastAsia="en-GB"/>
+        </w:rPr>
+      </w:pPr>
+      <w:r>
+        <w:rPr>
+          <w:lang w:eastAsia="en-GB"/>
+        </w:rPr>
+        <w:t>Transect summary data is collected w</w:t>
+      </w:r>
+      <w:r>
+        <w:rPr>
+          <w:lang w:eastAsia="en-GB"/>
+        </w:rPr>
+        <w:t xml:space="preserve">hen Ecospace </w:t>
+      </w:r>
+      <w:r>
+        <w:rPr>
+          <w:lang w:eastAsia="en-GB"/>
+        </w:rPr>
+        <w:t>runs.</w:t>
+      </w:r>
+      <w:r>
+        <w:rPr>
+          <w:lang w:eastAsia="en-GB"/>
+        </w:rPr>
+        <w:t xml:space="preserve"> Summary data for a transect is discarded </w:t>
+      </w:r>
+      <w:r>
+        <w:rPr>
+          <w:lang w:eastAsia="en-GB"/>
+        </w:rPr>
+        <w:t xml:space="preserve">once </w:t>
+      </w:r>
+      <w:r>
+        <w:rPr>
+          <w:lang w:eastAsia="en-GB"/>
+        </w:rPr>
+        <w:t xml:space="preserve">a transect is </w:t>
       </w:r>
       <w:r>
         <w:rPr>
@@ -530,7 +617,7 @@
         <w:rPr>
           <w:noProof/>
         </w:rPr>
-        <w:t>2</w:t>
+        <w:t>3</w:t>
       </w:r>
       <w:r>
         <w:rPr>
@@ -780,6 +867,7 @@
         <w:rPr>
           <w:lang w:eastAsia="en-GB"/>
         </w:rPr>
+        <w:lastRenderedPageBreak/>
         <w:t xml:space="preserve">Once Ecospace has ran </w:t>
       </w:r>
       <w:r>
@@ -824,7 +912,7 @@
         <w:rPr>
           <w:noProof/>
         </w:rPr>
-        <w:t>3</w:t>
+        <w:t>4</w:t>
       </w:r>
       <w:r>
         <w:rPr>
@@ -860,7 +948,6 @@
         <w:rPr>
           <w:lang w:eastAsia="en-GB"/>
         </w:rPr>
-        <w:lastRenderedPageBreak/>
         <w:t>Play and Stop controls can be used to view changing transect summaries over time;</w:t>
       </w:r>
     </w:p>
@@ -992,7 +1079,7 @@
         <w:rPr>
           <w:noProof/>
         </w:rPr>
-        <w:t>4</w:t>
+        <w:t>5</w:t>
       </w:r>
       <w:r>
         <w:rPr>
@@ -1005,6 +1092,33 @@
           <w:lang w:eastAsia="en-GB"/>
         </w:rPr>
         <w:t>). A message in the EwE status panel will tell you that transect information has been saved to file, and clicking that message will open the folder of the file location.</w:t>
+      </w:r>
+    </w:p>
+    <w:p>
+      <w:pPr>
+        <w:pStyle w:val="Heading1"/>
+        <w:rPr>
+          <w:lang w:eastAsia="en-GB"/>
+        </w:rPr>
+      </w:pPr>
+      <w:r>
+        <w:rPr>
+          <w:lang w:eastAsia="en-GB"/>
+        </w:rPr>
+        <w:t>Applicability to COSM / INSITE</w:t>
+      </w:r>
+    </w:p>
+    <w:p>
+      <w:pPr>
+        <w:rPr>
+          <w:lang w:eastAsia="en-GB"/>
+        </w:rPr>
+      </w:pPr>
+      <w:r>
+        <w:rPr>
+          <w:lang w:eastAsia="en-GB"/>
+        </w:rPr>
+        <w:t>&lt;JS to write&gt;</w:t>
       </w:r>
     </w:p>
     <w:p>
@@ -1048,74 +1162,20 @@
         <w:rPr>
           <w:lang w:eastAsia="en-GB"/>
         </w:rPr>
-        <w:t xml:space="preserve">is </w:t>
-      </w:r>
-      <w:r>
-        <w:rPr>
-          <w:lang w:eastAsia="en-GB"/>
-        </w:rPr>
-        <w:t xml:space="preserve">implemented as an </w:t>
-      </w:r>
-      <w:r>
-        <w:rPr>
-          <w:lang w:eastAsia="en-GB"/>
-        </w:rPr>
-        <w:t xml:space="preserve">EwE plug-in. </w:t>
-      </w:r>
-      <w:r>
-        <w:rPr>
-          <w:lang w:eastAsia="en-GB"/>
-        </w:rPr>
-        <w:t xml:space="preserve">Plug-ins cannot add new types of records to the EwE model database, and as such, </w:t>
-      </w:r>
-      <w:r>
-        <w:rPr>
-          <w:lang w:eastAsia="en-GB"/>
-        </w:rPr>
-        <w:t>transects are not saved with the Ecospace scenario. When a</w:t>
-      </w:r>
-      <w:r>
-        <w:rPr>
-          <w:lang w:eastAsia="en-GB"/>
-        </w:rPr>
-        <w:t>n Ecospace</w:t>
-      </w:r>
-      <w:r>
-        <w:rPr>
-          <w:lang w:eastAsia="en-GB"/>
-        </w:rPr>
-        <w:t xml:space="preserve"> scenario is closed, </w:t>
-      </w:r>
-      <w:r>
-        <w:rPr>
-          <w:lang w:eastAsia="en-GB"/>
-        </w:rPr>
-        <w:t>defined transects are lost</w:t>
-      </w:r>
-      <w:r>
-        <w:rPr>
-          <w:lang w:eastAsia="en-GB"/>
-        </w:rPr>
-        <w:t>.</w:t>
-      </w:r>
-      <w:r>
-        <w:rPr>
-          <w:lang w:eastAsia="en-GB"/>
-        </w:rPr>
-        <w:t xml:space="preserve"> This can be fixed by using the database system extension introduced by the ValueChain plug-in;</w:t>
-      </w:r>
-    </w:p>
-    <w:p>
-      <w:pPr>
-        <w:pStyle w:val="ListParagraph"/>
-        <w:numPr>
-          <w:ilvl w:val="0"/>
-          <w:numId w:val="1"/>
-        </w:numPr>
-        <w:rPr>
-          <w:lang w:eastAsia="en-GB"/>
-        </w:rPr>
-      </w:pPr>
+        <w:t>is implemented as a plug-in</w:t>
+      </w:r>
+      <w:r>
+        <w:rPr>
+          <w:lang w:eastAsia="en-GB"/>
+        </w:rPr>
+        <w:t>, and p</w:t>
+      </w:r>
+      <w:r>
+        <w:rPr>
+          <w:lang w:eastAsia="en-GB"/>
+        </w:rPr>
+        <w:t xml:space="preserve">lug-ins do not have integrated access to the EwE model database. </w:t>
+      </w:r>
       <w:r>
         <w:rPr>
           <w:lang w:eastAsia="en-GB"/>
@@ -1126,19 +1186,115 @@
         <w:rPr>
           <w:lang w:eastAsia="en-GB"/>
         </w:rPr>
-        <w:t>ransect summ</w:t>
-      </w:r>
-      <w:r>
-        <w:rPr>
-          <w:lang w:eastAsia="en-GB"/>
-        </w:rPr>
-        <w:t>ary graphs do not show units</w:t>
-      </w:r>
-      <w:r>
-        <w:rPr>
-          <w:lang w:eastAsia="en-GB"/>
-        </w:rPr>
-        <w:t>.</w:t>
+        <w:t xml:space="preserve">ransect data is </w:t>
+      </w:r>
+      <w:r>
+        <w:rPr>
+          <w:lang w:eastAsia="en-GB"/>
+        </w:rPr>
+        <w:t xml:space="preserve">currently </w:t>
+      </w:r>
+      <w:r>
+        <w:rPr>
+          <w:lang w:eastAsia="en-GB"/>
+        </w:rPr>
+        <w:t>stored in XML file</w:t>
+      </w:r>
+      <w:r>
+        <w:rPr>
+          <w:lang w:eastAsia="en-GB"/>
+        </w:rPr>
+        <w:t>s</w:t>
+      </w:r>
+      <w:r>
+        <w:rPr>
+          <w:lang w:eastAsia="en-GB"/>
+        </w:rPr>
+        <w:t xml:space="preserve"> specific to the EwE model file </w:t>
+      </w:r>
+      <w:r>
+        <w:rPr>
+          <w:lang w:eastAsia="en-GB"/>
+        </w:rPr>
+        <w:t xml:space="preserve">name and the Ecospace scenario, </w:t>
+      </w:r>
+      <w:r>
+        <w:rPr>
+          <w:lang w:eastAsia="en-GB"/>
+        </w:rPr>
+        <w:t>placed in the same dire</w:t>
+      </w:r>
+      <w:r>
+        <w:rPr>
+          <w:lang w:eastAsia="en-GB"/>
+        </w:rPr>
+        <w:t xml:space="preserve">ctory as the EwE model database. </w:t>
+      </w:r>
+      <w:r>
+        <w:rPr>
+          <w:lang w:eastAsia="en-GB"/>
+        </w:rPr>
+        <w:br/>
+      </w:r>
+      <w:r>
+        <w:rPr>
+          <w:lang w:eastAsia="en-GB"/>
+        </w:rPr>
+        <w:br/>
+      </w:r>
+      <w:r>
+        <w:rPr>
+          <w:lang w:eastAsia="en-GB"/>
+        </w:rPr>
+        <w:t xml:space="preserve">Using </w:t>
+      </w:r>
+      <w:r>
+        <w:rPr>
+          <w:lang w:eastAsia="en-GB"/>
+        </w:rPr>
+        <w:t xml:space="preserve">separate files </w:t>
+      </w:r>
+      <w:r>
+        <w:rPr>
+          <w:lang w:eastAsia="en-GB"/>
+        </w:rPr>
+        <w:t xml:space="preserve">for storing model configuration data is a potential source for error when </w:t>
+      </w:r>
+      <w:r>
+        <w:rPr>
+          <w:lang w:eastAsia="en-GB"/>
+        </w:rPr>
+        <w:t>transferring models to other computers</w:t>
+      </w:r>
+      <w:r>
+        <w:rPr>
+          <w:lang w:eastAsia="en-GB"/>
+        </w:rPr>
+        <w:t>. In a future version</w:t>
+      </w:r>
+      <w:r>
+        <w:rPr>
+          <w:lang w:eastAsia="en-GB"/>
+        </w:rPr>
+        <w:t>,</w:t>
+      </w:r>
+      <w:r>
+        <w:rPr>
+          <w:lang w:eastAsia="en-GB"/>
+        </w:rPr>
+        <w:t xml:space="preserve"> </w:t>
+      </w:r>
+      <w:r>
+        <w:rPr>
+          <w:lang w:eastAsia="en-GB"/>
+        </w:rPr>
+        <w:t>transect data must be stored within the EwE model database</w:t>
+      </w:r>
+      <w:r>
+        <w:rPr>
+          <w:lang w:eastAsia="en-GB"/>
+        </w:rPr>
+        <w:t>;</w:t>
       </w:r>
     </w:p>
     <w:p>
@@ -1431,7 +1587,7 @@
         <w:rPr>
           <w:lang w:eastAsia="en-GB"/>
         </w:rPr>
-        <w:t>.</w:t>
+        <w:t xml:space="preserve">. </w:t>
       </w:r>
     </w:p>
     <w:p>
@@ -1445,19 +1601,13 @@
         <w:rPr>
           <w:lang w:eastAsia="en-GB"/>
         </w:rPr>
-        <w:t>T</w:t>
-      </w:r>
-      <w:r>
-        <w:rPr>
-          <w:lang w:eastAsia="en-GB"/>
-        </w:rPr>
-        <w:t>ransect inp</w:t>
-      </w:r>
-      <w:r>
-        <w:rPr>
-          <w:lang w:eastAsia="en-GB"/>
-        </w:rPr>
-        <w:t>ut</w:t>
+        <w:t>Transect summar</w:t>
+      </w:r>
+      <w:r>
+        <w:rPr>
+          <w:lang w:eastAsia="en-GB"/>
+        </w:rPr>
+        <w:t>ies</w:t>
       </w:r>
     </w:p>
     <w:p>
@@ -1475,19 +1625,7 @@
         <w:rPr>
           <w:lang w:eastAsia="en-GB"/>
         </w:rPr>
-        <w:t xml:space="preserve">Transects cannot be </w:t>
-      </w:r>
-      <w:r>
-        <w:rPr>
-          <w:lang w:eastAsia="en-GB"/>
-        </w:rPr>
-        <w:t>rename</w:t>
-      </w:r>
-      <w:r>
-        <w:rPr>
-          <w:lang w:eastAsia="en-GB"/>
-        </w:rPr>
-        <w:t>d, which may be desired</w:t>
+        <w:t>Transect animation play at a fixed speed of 100ms per tick. This speed could become user configurable</w:t>
       </w:r>
       <w:r>
         <w:rPr>
@@ -1511,45 +1649,13 @@
         <w:rPr>
           <w:lang w:eastAsia="en-GB"/>
         </w:rPr>
-        <w:t xml:space="preserve">Transects can only be placed via the mouse. It may be desired to allow users to enter numerical </w:t>
-      </w:r>
-      <w:r>
-        <w:rPr>
-          <w:lang w:eastAsia="en-GB"/>
-        </w:rPr>
-        <w:t xml:space="preserve">start and end locations of </w:t>
-      </w:r>
-      <w:r>
-        <w:rPr>
-          <w:lang w:eastAsia="en-GB"/>
-        </w:rPr>
-        <w:t>a transect to place transects with more precision</w:t>
-      </w:r>
-      <w:r>
-        <w:rPr>
-          <w:lang w:eastAsia="en-GB"/>
-        </w:rPr>
-        <w:t xml:space="preserve">. </w:t>
-      </w:r>
-    </w:p>
-    <w:p>
-      <w:pPr>
-        <w:pStyle w:val="Heading2"/>
-        <w:rPr>
-          <w:lang w:eastAsia="en-GB"/>
-        </w:rPr>
-      </w:pPr>
-      <w:r>
-        <w:rPr>
-          <w:lang w:eastAsia="en-GB"/>
-        </w:rPr>
-        <w:t>Transect summar</w:t>
-      </w:r>
-      <w:r>
-        <w:rPr>
-          <w:lang w:eastAsia="en-GB"/>
-        </w:rPr>
-        <w:t>ies</w:t>
+        <w:t>It is not possible to view the transect summary for a specific time step other than waiting for the animation to show that time step. The ability to select which time step to display can be added</w:t>
+      </w:r>
+      <w:r>
+        <w:rPr>
+          <w:lang w:eastAsia="en-GB"/>
+        </w:rPr>
+        <w:t>;</w:t>
       </w:r>
     </w:p>
     <w:p>
@@ -1567,7 +1673,7 @@
         <w:rPr>
           <w:lang w:eastAsia="en-GB"/>
         </w:rPr>
-        <w:t>Transect animation play at a fixed speed of 100ms per tick. This speed could become user configurable</w:t>
+        <w:t>The content of the summary view is fixed to the four variables listed earlier. More variables could be shown, and the option to show/hide specific variables can be added</w:t>
       </w:r>
       <w:r>
         <w:rPr>
@@ -1591,7 +1697,49 @@
         <w:rPr>
           <w:lang w:eastAsia="en-GB"/>
         </w:rPr>
-        <w:t>It is not possible to view the transect summary for a specific time step other than waiting for the animation to show that time step. The ability to select which time step to display can be added</w:t>
+        <w:t xml:space="preserve">The </w:t>
+      </w:r>
+      <w:r>
+        <w:rPr>
+          <w:lang w:eastAsia="en-GB"/>
+        </w:rPr>
+        <w:t>summaries plot form</w:t>
+      </w:r>
+      <w:r>
+        <w:rPr>
+          <w:lang w:eastAsia="en-GB"/>
+        </w:rPr>
+        <w:t xml:space="preserve"> </w:t>
+      </w:r>
+      <w:r>
+        <w:rPr>
+          <w:lang w:eastAsia="en-GB"/>
+        </w:rPr>
+        <w:t xml:space="preserve">is transect-oriented, showing </w:t>
+      </w:r>
+      <w:r>
+        <w:rPr>
+          <w:lang w:eastAsia="en-GB"/>
+        </w:rPr>
+        <w:t xml:space="preserve">all available variables, in separate plots, for </w:t>
+      </w:r>
+      <w:r>
+        <w:rPr>
+          <w:lang w:eastAsia="en-GB"/>
+        </w:rPr>
+        <w:t xml:space="preserve">a selected </w:t>
+      </w:r>
+      <w:r>
+        <w:rPr>
+          <w:lang w:eastAsia="en-GB"/>
+        </w:rPr>
+        <w:t xml:space="preserve">transect. </w:t>
+      </w:r>
+      <w:r>
+        <w:rPr>
+          <w:lang w:eastAsia="en-GB"/>
+        </w:rPr>
+        <w:t>The summaries form could become variable-oriented, showing how a selected variable compares across different transects in separate plots</w:t>
       </w:r>
       <w:r>
         <w:rPr>
@@ -1615,13 +1763,30 @@
         <w:rPr>
           <w:lang w:eastAsia="en-GB"/>
         </w:rPr>
-        <w:t>The content of the summary view is fixed to the four variables listed earlier. More variables could be shown, and the option to show/hide specific variables can be added</w:t>
-      </w:r>
-      <w:r>
-        <w:rPr>
-          <w:lang w:eastAsia="en-GB"/>
-        </w:rPr>
-        <w:t>;</w:t>
+        <w:lastRenderedPageBreak/>
+        <w:t>It may be useful to be able to show/hide data for functional groups in the Ecospace estimates plots.</w:t>
+      </w:r>
+    </w:p>
+    <w:p>
+      <w:pPr>
+        <w:pStyle w:val="Heading3"/>
+        <w:rPr>
+          <w:lang w:eastAsia="en-GB"/>
+        </w:rPr>
+      </w:pPr>
+      <w:r>
+        <w:rPr>
+          <w:lang w:eastAsia="en-GB"/>
+        </w:rPr>
+        <w:t>CSV file format</w:t>
+      </w:r>
+    </w:p>
+    <w:p>
+      <w:r>
+        <w:rPr>
+          <w:lang w:eastAsia="en-GB"/>
+        </w:rPr>
+        <w:t>Transect summary files contain biomass and catch Ecospace estimates for all time steps, and all groups, for all cells in the transect. Such CVS files can get large.</w:t>
       </w:r>
     </w:p>
     <w:p>
@@ -1639,13 +1804,13 @@
         <w:rPr>
           <w:lang w:eastAsia="en-GB"/>
         </w:rPr>
-        <w:t xml:space="preserve">The </w:t>
-      </w:r>
-      <w:r>
-        <w:rPr>
-          <w:lang w:eastAsia="en-GB"/>
-        </w:rPr>
-        <w:t>summaries plot form</w:t>
+        <w:t xml:space="preserve">It might be useful to add a CSV file format with </w:t>
+      </w:r>
+      <w:r>
+        <w:rPr>
+          <w:lang w:eastAsia="en-GB"/>
+        </w:rPr>
+        <w:t>annual averages</w:t>
       </w:r>
       <w:r>
         <w:rPr>
@@ -1657,31 +1822,7 @@
         <w:rPr>
           <w:lang w:eastAsia="en-GB"/>
         </w:rPr>
-        <w:t xml:space="preserve">is transect-oriented, showing </w:t>
-      </w:r>
-      <w:r>
-        <w:rPr>
-          <w:lang w:eastAsia="en-GB"/>
-        </w:rPr>
-        <w:t xml:space="preserve">all available variables, in separate plots, for </w:t>
-      </w:r>
-      <w:r>
-        <w:rPr>
-          <w:lang w:eastAsia="en-GB"/>
-        </w:rPr>
-        <w:t xml:space="preserve">a selected </w:t>
-      </w:r>
-      <w:r>
-        <w:rPr>
-          <w:lang w:eastAsia="en-GB"/>
-        </w:rPr>
-        <w:t xml:space="preserve">transect. </w:t>
-      </w:r>
-      <w:r>
-        <w:rPr>
-          <w:lang w:eastAsia="en-GB"/>
-        </w:rPr>
-        <w:t>The summaries form could become variable-oriented, showing how a selected variable compares across different transects in separate plots</w:t>
+        <w:t>per transect</w:t>
       </w:r>
       <w:r>
         <w:rPr>
@@ -1705,12 +1846,106 @@
         <w:rPr>
           <w:lang w:eastAsia="en-GB"/>
         </w:rPr>
-        <w:t>It may be useful to be able to show/hide data for functional groups in the Ecospace estimates plots.</w:t>
-      </w:r>
-    </w:p>
-    <w:p>
-      <w:pPr>
-        <w:pStyle w:val="Heading3"/>
+        <w:t xml:space="preserve">It might be useful to add a CSV file format with </w:t>
+      </w:r>
+      <w:r>
+        <w:rPr>
+          <w:lang w:eastAsia="en-GB"/>
+        </w:rPr>
+        <w:t>average</w:t>
+      </w:r>
+      <w:r>
+        <w:rPr>
+          <w:lang w:eastAsia="en-GB"/>
+        </w:rPr>
+        <w:t xml:space="preserve"> values for the entire transect </w:t>
+      </w:r>
+      <w:r>
+        <w:rPr>
+          <w:lang w:eastAsia="en-GB"/>
+        </w:rPr>
+        <w:t xml:space="preserve">per </w:t>
+      </w:r>
+      <w:r>
+        <w:rPr>
+          <w:lang w:eastAsia="en-GB"/>
+        </w:rPr>
+        <w:t>time step.</w:t>
+      </w:r>
+    </w:p>
+    <w:p>
+      <w:pPr>
+        <w:pStyle w:val="Heading2"/>
+        <w:rPr>
+          <w:lang w:eastAsia="en-GB"/>
+        </w:rPr>
+      </w:pPr>
+      <w:r>
+        <w:rPr>
+          <w:lang w:eastAsia="en-GB"/>
+        </w:rPr>
+        <w:t>Acknow</w:t>
+      </w:r>
+      <w:r>
+        <w:rPr>
+          <w:lang w:eastAsia="en-GB"/>
+        </w:rPr>
+        <w:t>l</w:t>
+      </w:r>
+      <w:r>
+        <w:rPr>
+          <w:lang w:eastAsia="en-GB"/>
+        </w:rPr>
+        <w:t>e</w:t>
+      </w:r>
+      <w:r>
+        <w:rPr>
+          <w:lang w:eastAsia="en-GB"/>
+        </w:rPr>
+        <w:t>dgements</w:t>
+      </w:r>
+    </w:p>
+    <w:p>
+      <w:pPr>
+        <w:rPr>
+          <w:lang w:eastAsia="en-GB"/>
+        </w:rPr>
+      </w:pPr>
+      <w:commentRangeStart w:id="1"/>
+      <w:r>
+        <w:rPr>
+          <w:lang w:eastAsia="en-GB"/>
+        </w:rPr>
+        <w:t>Transects logic for EwE is funded through COSM / INSITE funding from CEFAS.</w:t>
+      </w:r>
+      <w:commentRangeEnd w:id="1"/>
+      <w:r>
+        <w:rPr>
+          <w:rStyle w:val="CommentReference"/>
+        </w:rPr>
+        <w:commentReference w:id="1"/>
+      </w:r>
+    </w:p>
+    <w:p>
+      <w:pPr>
+        <w:rPr>
+          <w:rFonts w:asciiTheme="majorHAnsi" w:eastAsiaTheme="majorEastAsia" w:hAnsiTheme="majorHAnsi" w:cstheme="majorBidi"/>
+          <w:color w:val="2E74B5" w:themeColor="accent1" w:themeShade="BF"/>
+          <w:sz w:val="32"/>
+          <w:szCs w:val="32"/>
+          <w:lang w:eastAsia="en-GB"/>
+        </w:rPr>
+      </w:pPr>
+      <w:r>
+        <w:rPr>
+          <w:lang w:eastAsia="en-GB"/>
+        </w:rPr>
+        <w:br w:type="page"/>
+      </w:r>
+    </w:p>
+    <w:p>
+      <w:pPr>
+        <w:pStyle w:val="Heading1"/>
         <w:rPr>
           <w:lang w:eastAsia="en-GB"/>
         </w:rPr>
@@ -1720,171 +1955,6 @@
           <w:lang w:eastAsia="en-GB"/>
         </w:rPr>
         <w:lastRenderedPageBreak/>
-        <w:t>CSV file format</w:t>
-      </w:r>
-    </w:p>
-    <w:p>
-      <w:r>
-        <w:rPr>
-          <w:lang w:eastAsia="en-GB"/>
-        </w:rPr>
-        <w:t>Transect summary files contain biomass and catch Ecospace estimates for all time steps, and all groups, for all cells in the transect.</w:t>
-      </w:r>
-      <w:r>
-        <w:rPr>
-          <w:lang w:eastAsia="en-GB"/>
-        </w:rPr>
-        <w:t xml:space="preserve"> Such CVS files can get large.</w:t>
-      </w:r>
-    </w:p>
-    <w:p>
-      <w:pPr>
-        <w:pStyle w:val="ListParagraph"/>
-        <w:numPr>
-          <w:ilvl w:val="0"/>
-          <w:numId w:val="2"/>
-        </w:numPr>
-        <w:rPr>
-          <w:lang w:eastAsia="en-GB"/>
-        </w:rPr>
-      </w:pPr>
-      <w:r>
-        <w:rPr>
-          <w:lang w:eastAsia="en-GB"/>
-        </w:rPr>
-        <w:t xml:space="preserve">It might be useful to add a CSV file format with </w:t>
-      </w:r>
-      <w:r>
-        <w:rPr>
-          <w:lang w:eastAsia="en-GB"/>
-        </w:rPr>
-        <w:t>annual averages</w:t>
-      </w:r>
-      <w:r>
-        <w:rPr>
-          <w:lang w:eastAsia="en-GB"/>
-        </w:rPr>
-        <w:t xml:space="preserve"> </w:t>
-      </w:r>
-      <w:r>
-        <w:rPr>
-          <w:lang w:eastAsia="en-GB"/>
-        </w:rPr>
-        <w:t>per transect</w:t>
-      </w:r>
-      <w:r>
-        <w:rPr>
-          <w:lang w:eastAsia="en-GB"/>
-        </w:rPr>
-        <w:t>;</w:t>
-      </w:r>
-    </w:p>
-    <w:p>
-      <w:pPr>
-        <w:pStyle w:val="ListParagraph"/>
-        <w:numPr>
-          <w:ilvl w:val="0"/>
-          <w:numId w:val="2"/>
-        </w:numPr>
-        <w:rPr>
-          <w:lang w:eastAsia="en-GB"/>
-        </w:rPr>
-      </w:pPr>
-      <w:r>
-        <w:rPr>
-          <w:lang w:eastAsia="en-GB"/>
-        </w:rPr>
-        <w:t xml:space="preserve">It might be useful to add a CSV file format with </w:t>
-      </w:r>
-      <w:r>
-        <w:rPr>
-          <w:lang w:eastAsia="en-GB"/>
-        </w:rPr>
-        <w:t>average</w:t>
-      </w:r>
-      <w:r>
-        <w:rPr>
-          <w:lang w:eastAsia="en-GB"/>
-        </w:rPr>
-        <w:t xml:space="preserve"> values for the entire transect </w:t>
-      </w:r>
-      <w:r>
-        <w:rPr>
-          <w:lang w:eastAsia="en-GB"/>
-        </w:rPr>
-        <w:t xml:space="preserve">per </w:t>
-      </w:r>
-      <w:r>
-        <w:rPr>
-          <w:lang w:eastAsia="en-GB"/>
-        </w:rPr>
-        <w:t>time step.</w:t>
-      </w:r>
-    </w:p>
-    <w:p>
-      <w:pPr>
-        <w:pStyle w:val="Heading2"/>
-        <w:rPr>
-          <w:lang w:eastAsia="en-GB"/>
-        </w:rPr>
-      </w:pPr>
-      <w:r>
-        <w:rPr>
-          <w:lang w:eastAsia="en-GB"/>
-        </w:rPr>
-        <w:t>Acknow</w:t>
-      </w:r>
-      <w:r>
-        <w:rPr>
-          <w:lang w:eastAsia="en-GB"/>
-        </w:rPr>
-        <w:t>l</w:t>
-      </w:r>
-      <w:r>
-        <w:rPr>
-          <w:lang w:eastAsia="en-GB"/>
-        </w:rPr>
-        <w:t>e</w:t>
-      </w:r>
-      <w:r>
-        <w:rPr>
-          <w:lang w:eastAsia="en-GB"/>
-        </w:rPr>
-        <w:t>dgements</w:t>
-      </w:r>
-    </w:p>
-    <w:p>
-      <w:pPr>
-        <w:rPr>
-          <w:lang w:eastAsia="en-GB"/>
-        </w:rPr>
-      </w:pPr>
-      <w:commentRangeStart w:id="1"/>
-      <w:r>
-        <w:rPr>
-          <w:lang w:eastAsia="en-GB"/>
-        </w:rPr>
-        <w:t>Transects logic for EwE is funded through COSM / INSITE funding from CEFAS.</w:t>
-      </w:r>
-      <w:commentRangeEnd w:id="1"/>
-      <w:r>
-        <w:rPr>
-          <w:rStyle w:val="CommentReference"/>
-        </w:rPr>
-        <w:commentReference w:id="1"/>
-      </w:r>
-    </w:p>
-    <w:p>
-      <w:pPr>
-        <w:pStyle w:val="Heading1"/>
-        <w:rPr>
-          <w:lang w:eastAsia="en-GB"/>
-        </w:rPr>
-      </w:pPr>
-      <w:r>
-        <w:rPr>
-          <w:lang w:eastAsia="en-GB"/>
-        </w:rPr>
         <w:t>Figures</w:t>
       </w:r>
     </w:p>
@@ -1943,6 +2013,9 @@
     <w:p>
       <w:pPr>
         <w:pStyle w:val="Caption"/>
+        <w:rPr>
+          <w:noProof/>
+        </w:rPr>
       </w:pPr>
       <w:bookmarkStart w:id="2" w:name="_Ref480965781"/>
       <w:r>
@@ -2007,12 +2080,11 @@
           <w:noProof/>
           <w:lang w:eastAsia="en-GB"/>
         </w:rPr>
-        <w:lastRenderedPageBreak/>
         <w:drawing>
-          <wp:inline distT="0" distB="0" distL="0" distR="0" wp14:anchorId="1B5C14D2" wp14:editId="4DF70176">
-            <wp:extent cx="5425200" cy="3686400"/>
-            <wp:effectExtent l="0" t="0" r="4445" b="0"/>
-            <wp:docPr id="4" name="Picture 4"/>
+          <wp:inline distT="0" distB="0" distL="0" distR="0" wp14:anchorId="5ABA8530" wp14:editId="6004E49F">
+            <wp:extent cx="2228400" cy="1666800"/>
+            <wp:effectExtent l="0" t="0" r="635" b="0"/>
+            <wp:docPr id="1" name="Picture 1"/>
             <wp:cNvGraphicFramePr>
               <a:graphicFrameLocks xmlns:a="http://schemas.openxmlformats.org/drawingml/2006/main" noChangeAspect="1"/>
             </wp:cNvGraphicFramePr>
@@ -2020,7 +2092,7 @@
               <a:graphicData uri="http://schemas.openxmlformats.org/drawingml/2006/picture">
                 <pic:pic xmlns:pic="http://schemas.openxmlformats.org/drawingml/2006/picture">
                   <pic:nvPicPr>
-                    <pic:cNvPr id="4" name="0045F0C.tmp"/>
+                    <pic:cNvPr id="1" name="D749EAD.tmp"/>
                     <pic:cNvPicPr/>
                   </pic:nvPicPr>
                   <pic:blipFill>
@@ -2038,7 +2110,7 @@
                   <pic:spPr>
                     <a:xfrm>
                       <a:off x="0" y="0"/>
-                      <a:ext cx="5425200" cy="3686400"/>
+                      <a:ext cx="2228400" cy="1666800"/>
                     </a:xfrm>
                     <a:prstGeom prst="rect">
                       <a:avLst/>
@@ -2055,7 +2127,7 @@
       <w:pPr>
         <w:pStyle w:val="Caption"/>
       </w:pPr>
-      <w:bookmarkStart w:id="3" w:name="_Ref480966426"/>
+      <w:bookmarkStart w:id="3" w:name="_Ref481095433"/>
       <w:r>
         <w:t xml:space="preserve">Figure </w:t>
       </w:r>
@@ -2082,25 +2154,15 @@
       </w:r>
       <w:bookmarkEnd w:id="3"/>
       <w:r>
-        <w:t xml:space="preserve"> - The transect </w:t>
-      </w:r>
-      <w:r>
-        <w:t xml:space="preserve">output </w:t>
-      </w:r>
-      <w:r>
-        <w:t>screen that displays transect</w:t>
-      </w:r>
-      <w:r>
-        <w:t xml:space="preserve"> summaries</w:t>
-      </w:r>
-      <w:r>
-        <w:t>: depth profile, overlap with MPAs, and computed biomass and catch per group. In this particular screenshot Ecospace has not ran yet</w:t>
-      </w:r>
-      <w:r>
-        <w:t>. The animation controls and save to CSV options are therefore disabled.</w:t>
-      </w:r>
-    </w:p>
-    <w:p/>
+        <w:t xml:space="preserve"> - The Edit transect</w:t>
+      </w:r>
+      <w:r>
+        <w:rPr>
+          <w:noProof/>
+        </w:rPr>
+        <w:t xml:space="preserve"> form, where a transect can be renamed and its coordinates can be set by entering the cell index (row, col) or coordinates (in map units)</w:t>
+      </w:r>
+    </w:p>
     <w:p>
       <w:pPr>
         <w:keepNext/>
@@ -2110,11 +2172,12 @@
           <w:noProof/>
           <w:lang w:eastAsia="en-GB"/>
         </w:rPr>
+        <w:lastRenderedPageBreak/>
         <w:drawing>
-          <wp:inline distT="0" distB="0" distL="0" distR="0" wp14:anchorId="38126E52" wp14:editId="17FFF033">
+          <wp:inline distT="0" distB="0" distL="0" distR="0" wp14:anchorId="1B5C14D2" wp14:editId="4DF70176">
             <wp:extent cx="5425200" cy="3686400"/>
             <wp:effectExtent l="0" t="0" r="4445" b="0"/>
-            <wp:docPr id="5" name="Picture 5"/>
+            <wp:docPr id="4" name="Picture 4"/>
             <wp:cNvGraphicFramePr>
               <a:graphicFrameLocks xmlns:a="http://schemas.openxmlformats.org/drawingml/2006/main" noChangeAspect="1"/>
             </wp:cNvGraphicFramePr>
@@ -2122,7 +2185,7 @@
               <a:graphicData uri="http://schemas.openxmlformats.org/drawingml/2006/picture">
                 <pic:pic xmlns:pic="http://schemas.openxmlformats.org/drawingml/2006/picture">
                   <pic:nvPicPr>
-                    <pic:cNvPr id="5" name="00435D6.tmp"/>
+                    <pic:cNvPr id="4" name="0045F0C.tmp"/>
                     <pic:cNvPicPr/>
                   </pic:nvPicPr>
                   <pic:blipFill>
@@ -2157,7 +2220,7 @@
       <w:pPr>
         <w:pStyle w:val="Caption"/>
       </w:pPr>
-      <w:bookmarkStart w:id="4" w:name="_Ref480968577"/>
+      <w:bookmarkStart w:id="4" w:name="_Ref480966426"/>
       <w:r>
         <w:t xml:space="preserve">Figure </w:t>
       </w:r>
@@ -2184,51 +2247,25 @@
       </w:r>
       <w:bookmarkEnd w:id="4"/>
       <w:r>
-        <w:t xml:space="preserve"> - Transect summary screen after running Ecospace. </w:t>
-      </w:r>
-      <w:r>
-        <w:t xml:space="preserve">Transect 2 crosses </w:t>
-      </w:r>
-      <w:r>
-        <w:t>a land cells</w:t>
-      </w:r>
-      <w:r>
-        <w:t xml:space="preserve"> and a MPA</w:t>
-      </w:r>
-      <w:r>
-        <w:t xml:space="preserve">. </w:t>
-      </w:r>
-      <w:r>
-        <w:t xml:space="preserve">The plots show that </w:t>
-      </w:r>
-      <w:r>
-        <w:t>Biomass and Catch are unavailable for land cells</w:t>
-      </w:r>
-      <w:r>
-        <w:t>, and that c</w:t>
-      </w:r>
-      <w:r>
-        <w:t>atch</w:t>
-      </w:r>
-      <w:r>
-        <w:t xml:space="preserve">es are absent </w:t>
-      </w:r>
-      <w:r>
-        <w:t xml:space="preserve">within the MPA. </w:t>
-      </w:r>
-      <w:r>
-        <w:t>Animation of results has progressed to time step 66 of 600. The Save to CSV option</w:t>
-      </w:r>
-      <w:r>
-        <w:t xml:space="preserve"> </w:t>
-      </w:r>
-      <w:r>
-        <w:t>is enabled because</w:t>
-      </w:r>
-      <w:r>
-        <w:t xml:space="preserve"> Ecospace has executed.</w:t>
-      </w:r>
-    </w:p>
+        <w:t xml:space="preserve"> - The transect </w:t>
+      </w:r>
+      <w:r>
+        <w:t xml:space="preserve">output </w:t>
+      </w:r>
+      <w:r>
+        <w:t>screen that displays transect</w:t>
+      </w:r>
+      <w:r>
+        <w:t xml:space="preserve"> summaries</w:t>
+      </w:r>
+      <w:r>
+        <w:t>: depth profile, overlap with MPAs, and computed biomass and catch per group. In this particular screenshot Ecospace has not ran yet</w:t>
+      </w:r>
+      <w:r>
+        <w:t>. The animation controls and save to CSV options are therefore disabled.</w:t>
+      </w:r>
+    </w:p>
+    <w:p/>
     <w:p>
       <w:pPr>
         <w:keepNext/>
@@ -2238,12 +2275,11 @@
           <w:noProof/>
           <w:lang w:eastAsia="en-GB"/>
         </w:rPr>
-        <w:lastRenderedPageBreak/>
         <w:drawing>
-          <wp:inline distT="0" distB="0" distL="0" distR="0" wp14:anchorId="07A64DC0" wp14:editId="50AE9052">
+          <wp:inline distT="0" distB="0" distL="0" distR="0" wp14:anchorId="38126E52" wp14:editId="17FFF033">
             <wp:extent cx="5425200" cy="3686400"/>
             <wp:effectExtent l="0" t="0" r="4445" b="0"/>
-            <wp:docPr id="6" name="Picture 6"/>
+            <wp:docPr id="5" name="Picture 5"/>
             <wp:cNvGraphicFramePr>
               <a:graphicFrameLocks xmlns:a="http://schemas.openxmlformats.org/drawingml/2006/main" noChangeAspect="1"/>
             </wp:cNvGraphicFramePr>
@@ -2251,7 +2287,7 @@
               <a:graphicData uri="http://schemas.openxmlformats.org/drawingml/2006/picture">
                 <pic:pic xmlns:pic="http://schemas.openxmlformats.org/drawingml/2006/picture">
                   <pic:nvPicPr>
-                    <pic:cNvPr id="6" name="00421B4.tmp"/>
+                    <pic:cNvPr id="5" name="00435D6.tmp"/>
                     <pic:cNvPicPr/>
                   </pic:nvPicPr>
                   <pic:blipFill>
@@ -2286,7 +2322,7 @@
       <w:pPr>
         <w:pStyle w:val="Caption"/>
       </w:pPr>
-      <w:bookmarkStart w:id="5" w:name="_Ref480968557"/>
+      <w:bookmarkStart w:id="5" w:name="_Ref480968577"/>
       <w:r>
         <w:t xml:space="preserve">Figure </w:t>
       </w:r>
@@ -2312,6 +2348,138 @@
         <w:fldChar w:fldCharType="end"/>
       </w:r>
       <w:bookmarkEnd w:id="5"/>
+      <w:r>
+        <w:t xml:space="preserve"> - Transect summary screen after running Ecospace. </w:t>
+      </w:r>
+      <w:r>
+        <w:t xml:space="preserve">Transect 2 crosses </w:t>
+      </w:r>
+      <w:r>
+        <w:t>a land cells</w:t>
+      </w:r>
+      <w:r>
+        <w:t xml:space="preserve"> and a MPA</w:t>
+      </w:r>
+      <w:r>
+        <w:t xml:space="preserve">. </w:t>
+      </w:r>
+      <w:r>
+        <w:t xml:space="preserve">The plots show that </w:t>
+      </w:r>
+      <w:r>
+        <w:t>Biomass and Catch are unavailable for land cells</w:t>
+      </w:r>
+      <w:r>
+        <w:t>, and that c</w:t>
+      </w:r>
+      <w:r>
+        <w:t>atch</w:t>
+      </w:r>
+      <w:r>
+        <w:t xml:space="preserve">es are absent </w:t>
+      </w:r>
+      <w:r>
+        <w:t xml:space="preserve">within the MPA. </w:t>
+      </w:r>
+      <w:r>
+        <w:t>Animation of results has progressed to time step 66 of 600. The Save to CSV option</w:t>
+      </w:r>
+      <w:r>
+        <w:t xml:space="preserve"> </w:t>
+      </w:r>
+      <w:r>
+        <w:t>is enabled because</w:t>
+      </w:r>
+      <w:r>
+        <w:t xml:space="preserve"> Ecospace has executed.</w:t>
+      </w:r>
+    </w:p>
+    <w:p>
+      <w:pPr>
+        <w:keepNext/>
+      </w:pPr>
+      <w:r>
+        <w:rPr>
+          <w:noProof/>
+          <w:lang w:eastAsia="en-GB"/>
+        </w:rPr>
+        <w:lastRenderedPageBreak/>
+        <w:drawing>
+          <wp:inline distT="0" distB="0" distL="0" distR="0" wp14:anchorId="07A64DC0" wp14:editId="50AE9052">
+            <wp:extent cx="5425200" cy="3686400"/>
+            <wp:effectExtent l="0" t="0" r="4445" b="0"/>
+            <wp:docPr id="6" name="Picture 6"/>
+            <wp:cNvGraphicFramePr>
+              <a:graphicFrameLocks xmlns:a="http://schemas.openxmlformats.org/drawingml/2006/main" noChangeAspect="1"/>
+            </wp:cNvGraphicFramePr>
+            <a:graphic xmlns:a="http://schemas.openxmlformats.org/drawingml/2006/main">
+              <a:graphicData uri="http://schemas.openxmlformats.org/drawingml/2006/picture">
+                <pic:pic xmlns:pic="http://schemas.openxmlformats.org/drawingml/2006/picture">
+                  <pic:nvPicPr>
+                    <pic:cNvPr id="6" name="00421B4.tmp"/>
+                    <pic:cNvPicPr/>
+                  </pic:nvPicPr>
+                  <pic:blipFill>
+                    <a:blip r:embed="rId12">
+                      <a:extLst>
+                        <a:ext uri="{28A0092B-C50C-407E-A947-70E740481C1C}">
+                          <a14:useLocalDpi xmlns:a14="http://schemas.microsoft.com/office/drawing/2010/main" val="0"/>
+                        </a:ext>
+                      </a:extLst>
+                    </a:blip>
+                    <a:stretch>
+                      <a:fillRect/>
+                    </a:stretch>
+                  </pic:blipFill>
+                  <pic:spPr>
+                    <a:xfrm>
+                      <a:off x="0" y="0"/>
+                      <a:ext cx="5425200" cy="3686400"/>
+                    </a:xfrm>
+                    <a:prstGeom prst="rect">
+                      <a:avLst/>
+                    </a:prstGeom>
+                  </pic:spPr>
+                </pic:pic>
+              </a:graphicData>
+            </a:graphic>
+          </wp:inline>
+        </w:drawing>
+      </w:r>
+    </w:p>
+    <w:p>
+      <w:pPr>
+        <w:pStyle w:val="Caption"/>
+      </w:pPr>
+      <w:bookmarkStart w:id="6" w:name="_Ref480968557"/>
+      <w:r>
+        <w:t xml:space="preserve">Figure </w:t>
+      </w:r>
+      <w:r>
+        <w:fldChar w:fldCharType="begin"/>
+      </w:r>
+      <w:r>
+        <w:instrText xml:space="preserve"> SE</w:instrText>
+      </w:r>
+      <w:r>
+        <w:instrText xml:space="preserve">Q Figure \* ARABIC </w:instrText>
+      </w:r>
+      <w:r>
+        <w:fldChar w:fldCharType="separate"/>
+      </w:r>
+      <w:r>
+        <w:rPr>
+          <w:noProof/>
+        </w:rPr>
+        <w:t>5</w:t>
+      </w:r>
+      <w:r>
+        <w:rPr>
+          <w:noProof/>
+        </w:rPr>
+        <w:fldChar w:fldCharType="end"/>
+      </w:r>
+      <w:bookmarkEnd w:id="6"/>
       <w:r>
         <w:t xml:space="preserve"> </w:t>
       </w:r>
@@ -4043,7 +4211,7 @@
 </file>
 
 <file path=customXml/itemProps1.xml><?xml version="1.0" encoding="utf-8"?>
-<ds:datastoreItem xmlns:ds="http://schemas.openxmlformats.org/officeDocument/2006/customXml" ds:itemID="{644956B4-F63F-4879-910A-D3123706CA5A}">
+<ds:datastoreItem xmlns:ds="http://schemas.openxmlformats.org/officeDocument/2006/customXml" ds:itemID="{20891A2A-A03A-4260-8666-87F3CAC36145}">
   <ds:schemaRefs>
     <ds:schemaRef ds:uri="http://schemas.openxmlformats.org/officeDocument/2006/bibliography"/>
   </ds:schemaRefs>

</xml_diff>